<commit_message>
Se hacen actualizaciones para la entrega de la versión 2.3.0_000
</commit_message>
<xml_diff>
--- a/Integra-parent/documentacion/@Firma-Integr@-CambiosYNovedades-MAN.docx
+++ b/Integra-parent/documentacion/@Firma-Integr@-CambiosYNovedades-MAN.docx
@@ -72,7 +72,7 @@
           <w:sz w:val="36"/>
           <w:szCs w:val="36"/>
         </w:rPr>
-        <w:t>1.2.2_002 - 2.2.4_000</w:t>
+        <w:t>1.2.2_002 - 2.3.0_000</w:t>
       </w:r>
       <w:r>
         <w:rPr>
@@ -116,12 +116,6 @@
         <w:gridCol w:w="6804"/>
       </w:tblGrid>
       <w:tr>
-        <w:tblPrEx>
-          <w:tblCellMar>
-            <w:top w:w="0" w:type="dxa"/>
-            <w:bottom w:w="0" w:type="dxa"/>
-          </w:tblCellMar>
-        </w:tblPrEx>
         <w:tc>
           <w:tcPr>
             <w:tcW w:w="2552" w:type="dxa"/>
@@ -169,12 +163,6 @@
         </w:tc>
       </w:tr>
       <w:tr>
-        <w:tblPrEx>
-          <w:tblCellMar>
-            <w:top w:w="0" w:type="dxa"/>
-            <w:bottom w:w="0" w:type="dxa"/>
-          </w:tblCellMar>
-        </w:tblPrEx>
         <w:tc>
           <w:tcPr>
             <w:tcW w:w="2552" w:type="dxa"/>
@@ -206,19 +194,13 @@
               <w:t>2</w:t>
             </w:r>
             <w:r>
-              <w:t>1</w:t>
+              <w:t>3</w:t>
             </w:r>
             <w:bookmarkEnd w:id="1"/>
           </w:p>
         </w:tc>
       </w:tr>
       <w:tr>
-        <w:tblPrEx>
-          <w:tblCellMar>
-            <w:top w:w="0" w:type="dxa"/>
-            <w:bottom w:w="0" w:type="dxa"/>
-          </w:tblCellMar>
-        </w:tblPrEx>
         <w:tc>
           <w:tcPr>
             <w:tcW w:w="2552" w:type="dxa"/>
@@ -244,7 +226,10 @@
             </w:pPr>
             <w:bookmarkStart w:id="2" w:name="FECHA_MODIFICACION"/>
             <w:r>
-              <w:t>29</w:t>
+              <w:t>0</w:t>
+            </w:r>
+            <w:r>
+              <w:t>3</w:t>
             </w:r>
             <w:r>
               <w:t>-</w:t>
@@ -253,25 +238,19 @@
               <w:t>0</w:t>
             </w:r>
             <w:r>
-              <w:t>1</w:t>
+              <w:t>2</w:t>
             </w:r>
             <w:r>
               <w:t>-202</w:t>
             </w:r>
             <w:r>
-              <w:t>4</w:t>
+              <w:t>5</w:t>
             </w:r>
             <w:bookmarkEnd w:id="2"/>
           </w:p>
         </w:tc>
       </w:tr>
       <w:tr>
-        <w:tblPrEx>
-          <w:tblCellMar>
-            <w:top w:w="0" w:type="dxa"/>
-            <w:bottom w:w="0" w:type="dxa"/>
-          </w:tblCellMar>
-        </w:tblPrEx>
         <w:tc>
           <w:tcPr>
             <w:tcW w:w="2552" w:type="dxa"/>
@@ -360,12 +339,6 @@
         <w:gridCol w:w="6152"/>
       </w:tblGrid>
       <w:tr>
-        <w:tblPrEx>
-          <w:tblCellMar>
-            <w:top w:w="0" w:type="dxa"/>
-            <w:bottom w:w="0" w:type="dxa"/>
-          </w:tblCellMar>
-        </w:tblPrEx>
         <w:trPr>
           <w:trHeight w:val="279"/>
         </w:trPr>
@@ -392,27 +365,17 @@
               <w:pStyle w:val="Tabla"/>
               <w:jc w:val="both"/>
             </w:pPr>
-            <w:r>
-              <w:fldChar w:fldCharType="begin"/>
-            </w:r>
-            <w:r>
-              <w:instrText xml:space="preserve"> REF TITULO_DOCUMENTO  \* MERGEFORMAT </w:instrText>
-            </w:r>
-            <w:r>
-              <w:fldChar w:fldCharType="separate"/>
-            </w:r>
-            <w:r>
-              <w:t>@Firma</w:t>
-            </w:r>
-            <w:r>
-              <w:t>-</w:t>
-            </w:r>
-            <w:r>
-              <w:t>Integr@-CambiosYNovedades-MAN</w:t>
-            </w:r>
-            <w:r>
-              <w:fldChar w:fldCharType="end"/>
-            </w:r>
+            <w:fldSimple w:instr="REF TITULO_DOCUMENTO  \* MERGEFORMAT">
+              <w:r>
+                <w:t>@Firma</w:t>
+              </w:r>
+              <w:r>
+                <w:t>-</w:t>
+              </w:r>
+              <w:r>
+                <w:t>Integr@-CambiosYNovedades-MAN</w:t>
+              </w:r>
+            </w:fldSimple>
             <w:r>
               <w:t xml:space="preserve"> </w:t>
             </w:r>
@@ -420,12 +383,6 @@
         </w:tc>
       </w:tr>
       <w:tr>
-        <w:tblPrEx>
-          <w:tblCellMar>
-            <w:top w:w="0" w:type="dxa"/>
-            <w:bottom w:w="0" w:type="dxa"/>
-          </w:tblCellMar>
-        </w:tblPrEx>
         <w:trPr>
           <w:trHeight w:val="153"/>
         </w:trPr>
@@ -465,7 +422,7 @@
               <w:fldChar w:fldCharType="separate"/>
             </w:r>
             <w:r>
-              <w:t>021</w:t>
+              <w:t>023</w:t>
             </w:r>
             <w:r>
               <w:fldChar w:fldCharType="end"/>
@@ -474,12 +431,6 @@
         </w:tc>
       </w:tr>
       <w:tr>
-        <w:tblPrEx>
-          <w:tblCellMar>
-            <w:top w:w="0" w:type="dxa"/>
-            <w:bottom w:w="0" w:type="dxa"/>
-          </w:tblCellMar>
-        </w:tblPrEx>
         <w:trPr>
           <w:trHeight w:val="153"/>
         </w:trPr>
@@ -519,7 +470,7 @@
               <w:fldChar w:fldCharType="separate"/>
             </w:r>
             <w:r>
-              <w:t>29-01-2024</w:t>
+              <w:t>03-02-2025</w:t>
             </w:r>
             <w:r>
               <w:fldChar w:fldCharType="end"/>
@@ -545,12 +496,6 @@
         <w:gridCol w:w="8080"/>
       </w:tblGrid>
       <w:tr>
-        <w:tblPrEx>
-          <w:tblCellMar>
-            <w:top w:w="0" w:type="dxa"/>
-            <w:bottom w:w="0" w:type="dxa"/>
-          </w:tblCellMar>
-        </w:tblPrEx>
         <w:tc>
           <w:tcPr>
             <w:tcW w:w="1488" w:type="dxa"/>
@@ -584,12 +529,6 @@
         </w:tc>
       </w:tr>
       <w:tr>
-        <w:tblPrEx>
-          <w:tblCellMar>
-            <w:top w:w="0" w:type="dxa"/>
-            <w:bottom w:w="0" w:type="dxa"/>
-          </w:tblCellMar>
-        </w:tblPrEx>
         <w:tc>
           <w:tcPr>
             <w:tcW w:w="1488" w:type="dxa"/>
@@ -635,12 +574,6 @@
         </w:tc>
       </w:tr>
       <w:tr>
-        <w:tblPrEx>
-          <w:tblCellMar>
-            <w:top w:w="0" w:type="dxa"/>
-            <w:bottom w:w="0" w:type="dxa"/>
-          </w:tblCellMar>
-        </w:tblPrEx>
         <w:tc>
           <w:tcPr>
             <w:tcW w:w="1488" w:type="dxa"/>
@@ -697,12 +630,6 @@
         <w:gridCol w:w="8080"/>
       </w:tblGrid>
       <w:tr>
-        <w:tblPrEx>
-          <w:tblCellMar>
-            <w:top w:w="0" w:type="dxa"/>
-            <w:bottom w:w="0" w:type="dxa"/>
-          </w:tblCellMar>
-        </w:tblPrEx>
         <w:tc>
           <w:tcPr>
             <w:tcW w:w="1488" w:type="dxa"/>
@@ -736,12 +663,6 @@
         </w:tc>
       </w:tr>
       <w:tr>
-        <w:tblPrEx>
-          <w:tblCellMar>
-            <w:top w:w="0" w:type="dxa"/>
-            <w:bottom w:w="0" w:type="dxa"/>
-          </w:tblCellMar>
-        </w:tblPrEx>
         <w:tc>
           <w:tcPr>
             <w:tcW w:w="1488" w:type="dxa"/>
@@ -772,12 +693,6 @@
         </w:tc>
       </w:tr>
       <w:tr>
-        <w:tblPrEx>
-          <w:tblCellMar>
-            <w:top w:w="0" w:type="dxa"/>
-            <w:bottom w:w="0" w:type="dxa"/>
-          </w:tblCellMar>
-        </w:tblPrEx>
         <w:tc>
           <w:tcPr>
             <w:tcW w:w="1488" w:type="dxa"/>
@@ -828,12 +743,6 @@
         <w:gridCol w:w="8080"/>
       </w:tblGrid>
       <w:tr>
-        <w:tblPrEx>
-          <w:tblCellMar>
-            <w:top w:w="0" w:type="dxa"/>
-            <w:bottom w:w="0" w:type="dxa"/>
-          </w:tblCellMar>
-        </w:tblPrEx>
         <w:tc>
           <w:tcPr>
             <w:tcW w:w="1488" w:type="dxa"/>
@@ -867,12 +776,6 @@
         </w:tc>
       </w:tr>
       <w:tr>
-        <w:tblPrEx>
-          <w:tblCellMar>
-            <w:top w:w="0" w:type="dxa"/>
-            <w:bottom w:w="0" w:type="dxa"/>
-          </w:tblCellMar>
-        </w:tblPrEx>
         <w:tc>
           <w:tcPr>
             <w:tcW w:w="1488" w:type="dxa"/>
@@ -903,12 +806,6 @@
         </w:tc>
       </w:tr>
       <w:tr>
-        <w:tblPrEx>
-          <w:tblCellMar>
-            <w:top w:w="0" w:type="dxa"/>
-            <w:bottom w:w="0" w:type="dxa"/>
-          </w:tblCellMar>
-        </w:tblPrEx>
         <w:tc>
           <w:tcPr>
             <w:tcW w:w="1488" w:type="dxa"/>
@@ -959,12 +856,6 @@
         <w:gridCol w:w="8080"/>
       </w:tblGrid>
       <w:tr>
-        <w:tblPrEx>
-          <w:tblCellMar>
-            <w:top w:w="0" w:type="dxa"/>
-            <w:bottom w:w="0" w:type="dxa"/>
-          </w:tblCellMar>
-        </w:tblPrEx>
         <w:tc>
           <w:tcPr>
             <w:tcW w:w="1488" w:type="dxa"/>
@@ -998,12 +889,6 @@
         </w:tc>
       </w:tr>
       <w:tr>
-        <w:tblPrEx>
-          <w:tblCellMar>
-            <w:top w:w="0" w:type="dxa"/>
-            <w:bottom w:w="0" w:type="dxa"/>
-          </w:tblCellMar>
-        </w:tblPrEx>
         <w:tc>
           <w:tcPr>
             <w:tcW w:w="1488" w:type="dxa"/>
@@ -1034,12 +919,6 @@
         </w:tc>
       </w:tr>
       <w:tr>
-        <w:tblPrEx>
-          <w:tblCellMar>
-            <w:top w:w="0" w:type="dxa"/>
-            <w:bottom w:w="0" w:type="dxa"/>
-          </w:tblCellMar>
-        </w:tblPrEx>
         <w:tc>
           <w:tcPr>
             <w:tcW w:w="1488" w:type="dxa"/>
@@ -1102,12 +981,6 @@
         <w:gridCol w:w="8080"/>
       </w:tblGrid>
       <w:tr>
-        <w:tblPrEx>
-          <w:tblCellMar>
-            <w:top w:w="0" w:type="dxa"/>
-            <w:bottom w:w="0" w:type="dxa"/>
-          </w:tblCellMar>
-        </w:tblPrEx>
         <w:tc>
           <w:tcPr>
             <w:tcW w:w="1488" w:type="dxa"/>
@@ -1141,12 +1014,6 @@
         </w:tc>
       </w:tr>
       <w:tr>
-        <w:tblPrEx>
-          <w:tblCellMar>
-            <w:top w:w="0" w:type="dxa"/>
-            <w:bottom w:w="0" w:type="dxa"/>
-          </w:tblCellMar>
-        </w:tblPrEx>
         <w:tc>
           <w:tcPr>
             <w:tcW w:w="1488" w:type="dxa"/>
@@ -1177,12 +1044,6 @@
         </w:tc>
       </w:tr>
       <w:tr>
-        <w:tblPrEx>
-          <w:tblCellMar>
-            <w:top w:w="0" w:type="dxa"/>
-            <w:bottom w:w="0" w:type="dxa"/>
-          </w:tblCellMar>
-        </w:tblPrEx>
         <w:tc>
           <w:tcPr>
             <w:tcW w:w="1488" w:type="dxa"/>
@@ -1236,12 +1097,6 @@
         <w:gridCol w:w="8080"/>
       </w:tblGrid>
       <w:tr>
-        <w:tblPrEx>
-          <w:tblCellMar>
-            <w:top w:w="0" w:type="dxa"/>
-            <w:bottom w:w="0" w:type="dxa"/>
-          </w:tblCellMar>
-        </w:tblPrEx>
         <w:tc>
           <w:tcPr>
             <w:tcW w:w="1488" w:type="dxa"/>
@@ -1275,12 +1130,6 @@
         </w:tc>
       </w:tr>
       <w:tr>
-        <w:tblPrEx>
-          <w:tblCellMar>
-            <w:top w:w="0" w:type="dxa"/>
-            <w:bottom w:w="0" w:type="dxa"/>
-          </w:tblCellMar>
-        </w:tblPrEx>
         <w:tc>
           <w:tcPr>
             <w:tcW w:w="1488" w:type="dxa"/>
@@ -1311,12 +1160,6 @@
         </w:tc>
       </w:tr>
       <w:tr>
-        <w:tblPrEx>
-          <w:tblCellMar>
-            <w:top w:w="0" w:type="dxa"/>
-            <w:bottom w:w="0" w:type="dxa"/>
-          </w:tblCellMar>
-        </w:tblPrEx>
         <w:tc>
           <w:tcPr>
             <w:tcW w:w="1488" w:type="dxa"/>
@@ -1370,12 +1213,6 @@
         <w:gridCol w:w="8080"/>
       </w:tblGrid>
       <w:tr>
-        <w:tblPrEx>
-          <w:tblCellMar>
-            <w:top w:w="0" w:type="dxa"/>
-            <w:bottom w:w="0" w:type="dxa"/>
-          </w:tblCellMar>
-        </w:tblPrEx>
         <w:tc>
           <w:tcPr>
             <w:tcW w:w="1488" w:type="dxa"/>
@@ -1409,12 +1246,6 @@
         </w:tc>
       </w:tr>
       <w:tr>
-        <w:tblPrEx>
-          <w:tblCellMar>
-            <w:top w:w="0" w:type="dxa"/>
-            <w:bottom w:w="0" w:type="dxa"/>
-          </w:tblCellMar>
-        </w:tblPrEx>
         <w:tc>
           <w:tcPr>
             <w:tcW w:w="1488" w:type="dxa"/>
@@ -1445,12 +1276,6 @@
         </w:tc>
       </w:tr>
       <w:tr>
-        <w:tblPrEx>
-          <w:tblCellMar>
-            <w:top w:w="0" w:type="dxa"/>
-            <w:bottom w:w="0" w:type="dxa"/>
-          </w:tblCellMar>
-        </w:tblPrEx>
         <w:tc>
           <w:tcPr>
             <w:tcW w:w="1488" w:type="dxa"/>
@@ -1515,12 +1340,6 @@
         <w:gridCol w:w="8080"/>
       </w:tblGrid>
       <w:tr>
-        <w:tblPrEx>
-          <w:tblCellMar>
-            <w:top w:w="0" w:type="dxa"/>
-            <w:bottom w:w="0" w:type="dxa"/>
-          </w:tblCellMar>
-        </w:tblPrEx>
         <w:tc>
           <w:tcPr>
             <w:tcW w:w="1488" w:type="dxa"/>
@@ -1555,12 +1374,6 @@
         </w:tc>
       </w:tr>
       <w:tr>
-        <w:tblPrEx>
-          <w:tblCellMar>
-            <w:top w:w="0" w:type="dxa"/>
-            <w:bottom w:w="0" w:type="dxa"/>
-          </w:tblCellMar>
-        </w:tblPrEx>
         <w:tc>
           <w:tcPr>
             <w:tcW w:w="1488" w:type="dxa"/>
@@ -1591,12 +1404,6 @@
         </w:tc>
       </w:tr>
       <w:tr>
-        <w:tblPrEx>
-          <w:tblCellMar>
-            <w:top w:w="0" w:type="dxa"/>
-            <w:bottom w:w="0" w:type="dxa"/>
-          </w:tblCellMar>
-        </w:tblPrEx>
         <w:tc>
           <w:tcPr>
             <w:tcW w:w="1488" w:type="dxa"/>
@@ -1651,12 +1458,6 @@
         <w:gridCol w:w="8080"/>
       </w:tblGrid>
       <w:tr>
-        <w:tblPrEx>
-          <w:tblCellMar>
-            <w:top w:w="0" w:type="dxa"/>
-            <w:bottom w:w="0" w:type="dxa"/>
-          </w:tblCellMar>
-        </w:tblPrEx>
         <w:tc>
           <w:tcPr>
             <w:tcW w:w="1488" w:type="dxa"/>
@@ -1690,12 +1491,6 @@
         </w:tc>
       </w:tr>
       <w:tr>
-        <w:tblPrEx>
-          <w:tblCellMar>
-            <w:top w:w="0" w:type="dxa"/>
-            <w:bottom w:w="0" w:type="dxa"/>
-          </w:tblCellMar>
-        </w:tblPrEx>
         <w:tc>
           <w:tcPr>
             <w:tcW w:w="1488" w:type="dxa"/>
@@ -1726,12 +1521,6 @@
         </w:tc>
       </w:tr>
       <w:tr>
-        <w:tblPrEx>
-          <w:tblCellMar>
-            <w:top w:w="0" w:type="dxa"/>
-            <w:bottom w:w="0" w:type="dxa"/>
-          </w:tblCellMar>
-        </w:tblPrEx>
         <w:tc>
           <w:tcPr>
             <w:tcW w:w="1488" w:type="dxa"/>
@@ -1786,12 +1575,6 @@
         <w:gridCol w:w="8080"/>
       </w:tblGrid>
       <w:tr>
-        <w:tblPrEx>
-          <w:tblCellMar>
-            <w:top w:w="0" w:type="dxa"/>
-            <w:bottom w:w="0" w:type="dxa"/>
-          </w:tblCellMar>
-        </w:tblPrEx>
         <w:tc>
           <w:tcPr>
             <w:tcW w:w="1488" w:type="dxa"/>
@@ -1825,12 +1608,6 @@
         </w:tc>
       </w:tr>
       <w:tr>
-        <w:tblPrEx>
-          <w:tblCellMar>
-            <w:top w:w="0" w:type="dxa"/>
-            <w:bottom w:w="0" w:type="dxa"/>
-          </w:tblCellMar>
-        </w:tblPrEx>
         <w:tc>
           <w:tcPr>
             <w:tcW w:w="1488" w:type="dxa"/>
@@ -1861,12 +1638,6 @@
         </w:tc>
       </w:tr>
       <w:tr>
-        <w:tblPrEx>
-          <w:tblCellMar>
-            <w:top w:w="0" w:type="dxa"/>
-            <w:bottom w:w="0" w:type="dxa"/>
-          </w:tblCellMar>
-        </w:tblPrEx>
         <w:tc>
           <w:tcPr>
             <w:tcW w:w="1488" w:type="dxa"/>
@@ -1921,12 +1692,6 @@
         <w:gridCol w:w="8080"/>
       </w:tblGrid>
       <w:tr>
-        <w:tblPrEx>
-          <w:tblCellMar>
-            <w:top w:w="0" w:type="dxa"/>
-            <w:bottom w:w="0" w:type="dxa"/>
-          </w:tblCellMar>
-        </w:tblPrEx>
         <w:tc>
           <w:tcPr>
             <w:tcW w:w="1488" w:type="dxa"/>
@@ -1960,12 +1725,6 @@
         </w:tc>
       </w:tr>
       <w:tr>
-        <w:tblPrEx>
-          <w:tblCellMar>
-            <w:top w:w="0" w:type="dxa"/>
-            <w:bottom w:w="0" w:type="dxa"/>
-          </w:tblCellMar>
-        </w:tblPrEx>
         <w:tc>
           <w:tcPr>
             <w:tcW w:w="1488" w:type="dxa"/>
@@ -1996,12 +1755,6 @@
         </w:tc>
       </w:tr>
       <w:tr>
-        <w:tblPrEx>
-          <w:tblCellMar>
-            <w:top w:w="0" w:type="dxa"/>
-            <w:bottom w:w="0" w:type="dxa"/>
-          </w:tblCellMar>
-        </w:tblPrEx>
         <w:tc>
           <w:tcPr>
             <w:tcW w:w="1488" w:type="dxa"/>
@@ -2056,12 +1809,6 @@
         <w:gridCol w:w="8080"/>
       </w:tblGrid>
       <w:tr>
-        <w:tblPrEx>
-          <w:tblCellMar>
-            <w:top w:w="0" w:type="dxa"/>
-            <w:bottom w:w="0" w:type="dxa"/>
-          </w:tblCellMar>
-        </w:tblPrEx>
         <w:tc>
           <w:tcPr>
             <w:tcW w:w="1488" w:type="dxa"/>
@@ -2095,12 +1842,6 @@
         </w:tc>
       </w:tr>
       <w:tr>
-        <w:tblPrEx>
-          <w:tblCellMar>
-            <w:top w:w="0" w:type="dxa"/>
-            <w:bottom w:w="0" w:type="dxa"/>
-          </w:tblCellMar>
-        </w:tblPrEx>
         <w:tc>
           <w:tcPr>
             <w:tcW w:w="1488" w:type="dxa"/>
@@ -2131,12 +1872,6 @@
         </w:tc>
       </w:tr>
       <w:tr>
-        <w:tblPrEx>
-          <w:tblCellMar>
-            <w:top w:w="0" w:type="dxa"/>
-            <w:bottom w:w="0" w:type="dxa"/>
-          </w:tblCellMar>
-        </w:tblPrEx>
         <w:tc>
           <w:tcPr>
             <w:tcW w:w="1488" w:type="dxa"/>
@@ -2187,12 +1922,6 @@
         <w:gridCol w:w="8080"/>
       </w:tblGrid>
       <w:tr>
-        <w:tblPrEx>
-          <w:tblCellMar>
-            <w:top w:w="0" w:type="dxa"/>
-            <w:bottom w:w="0" w:type="dxa"/>
-          </w:tblCellMar>
-        </w:tblPrEx>
         <w:tc>
           <w:tcPr>
             <w:tcW w:w="1488" w:type="dxa"/>
@@ -2226,12 +1955,6 @@
         </w:tc>
       </w:tr>
       <w:tr>
-        <w:tblPrEx>
-          <w:tblCellMar>
-            <w:top w:w="0" w:type="dxa"/>
-            <w:bottom w:w="0" w:type="dxa"/>
-          </w:tblCellMar>
-        </w:tblPrEx>
         <w:tc>
           <w:tcPr>
             <w:tcW w:w="1488" w:type="dxa"/>
@@ -2262,12 +1985,6 @@
         </w:tc>
       </w:tr>
       <w:tr>
-        <w:tblPrEx>
-          <w:tblCellMar>
-            <w:top w:w="0" w:type="dxa"/>
-            <w:bottom w:w="0" w:type="dxa"/>
-          </w:tblCellMar>
-        </w:tblPrEx>
         <w:tc>
           <w:tcPr>
             <w:tcW w:w="1488" w:type="dxa"/>
@@ -2324,12 +2041,6 @@
         <w:gridCol w:w="8080"/>
       </w:tblGrid>
       <w:tr>
-        <w:tblPrEx>
-          <w:tblCellMar>
-            <w:top w:w="0" w:type="dxa"/>
-            <w:bottom w:w="0" w:type="dxa"/>
-          </w:tblCellMar>
-        </w:tblPrEx>
         <w:tc>
           <w:tcPr>
             <w:tcW w:w="1488" w:type="dxa"/>
@@ -2363,12 +2074,6 @@
         </w:tc>
       </w:tr>
       <w:tr>
-        <w:tblPrEx>
-          <w:tblCellMar>
-            <w:top w:w="0" w:type="dxa"/>
-            <w:bottom w:w="0" w:type="dxa"/>
-          </w:tblCellMar>
-        </w:tblPrEx>
         <w:tc>
           <w:tcPr>
             <w:tcW w:w="1488" w:type="dxa"/>
@@ -2399,12 +2104,6 @@
         </w:tc>
       </w:tr>
       <w:tr>
-        <w:tblPrEx>
-          <w:tblCellMar>
-            <w:top w:w="0" w:type="dxa"/>
-            <w:bottom w:w="0" w:type="dxa"/>
-          </w:tblCellMar>
-        </w:tblPrEx>
         <w:tc>
           <w:tcPr>
             <w:tcW w:w="1488" w:type="dxa"/>
@@ -2455,12 +2154,6 @@
         <w:gridCol w:w="8080"/>
       </w:tblGrid>
       <w:tr>
-        <w:tblPrEx>
-          <w:tblCellMar>
-            <w:top w:w="0" w:type="dxa"/>
-            <w:bottom w:w="0" w:type="dxa"/>
-          </w:tblCellMar>
-        </w:tblPrEx>
         <w:tc>
           <w:tcPr>
             <w:tcW w:w="1488" w:type="dxa"/>
@@ -2494,12 +2187,6 @@
         </w:tc>
       </w:tr>
       <w:tr>
-        <w:tblPrEx>
-          <w:tblCellMar>
-            <w:top w:w="0" w:type="dxa"/>
-            <w:bottom w:w="0" w:type="dxa"/>
-          </w:tblCellMar>
-        </w:tblPrEx>
         <w:tc>
           <w:tcPr>
             <w:tcW w:w="1488" w:type="dxa"/>
@@ -2530,12 +2217,6 @@
         </w:tc>
       </w:tr>
       <w:tr>
-        <w:tblPrEx>
-          <w:tblCellMar>
-            <w:top w:w="0" w:type="dxa"/>
-            <w:bottom w:w="0" w:type="dxa"/>
-          </w:tblCellMar>
-        </w:tblPrEx>
         <w:tc>
           <w:tcPr>
             <w:tcW w:w="1488" w:type="dxa"/>
@@ -2596,12 +2277,6 @@
         <w:gridCol w:w="8080"/>
       </w:tblGrid>
       <w:tr>
-        <w:tblPrEx>
-          <w:tblCellMar>
-            <w:top w:w="0" w:type="dxa"/>
-            <w:bottom w:w="0" w:type="dxa"/>
-          </w:tblCellMar>
-        </w:tblPrEx>
         <w:tc>
           <w:tcPr>
             <w:tcW w:w="1488" w:type="dxa"/>
@@ -2632,12 +2307,6 @@
         </w:tc>
       </w:tr>
       <w:tr>
-        <w:tblPrEx>
-          <w:tblCellMar>
-            <w:top w:w="0" w:type="dxa"/>
-            <w:bottom w:w="0" w:type="dxa"/>
-          </w:tblCellMar>
-        </w:tblPrEx>
         <w:tc>
           <w:tcPr>
             <w:tcW w:w="1488" w:type="dxa"/>
@@ -2668,12 +2337,6 @@
         </w:tc>
       </w:tr>
       <w:tr>
-        <w:tblPrEx>
-          <w:tblCellMar>
-            <w:top w:w="0" w:type="dxa"/>
-            <w:bottom w:w="0" w:type="dxa"/>
-          </w:tblCellMar>
-        </w:tblPrEx>
         <w:tc>
           <w:tcPr>
             <w:tcW w:w="1488" w:type="dxa"/>
@@ -2734,12 +2397,6 @@
         <w:gridCol w:w="8080"/>
       </w:tblGrid>
       <w:tr>
-        <w:tblPrEx>
-          <w:tblCellMar>
-            <w:top w:w="0" w:type="dxa"/>
-            <w:bottom w:w="0" w:type="dxa"/>
-          </w:tblCellMar>
-        </w:tblPrEx>
         <w:tc>
           <w:tcPr>
             <w:tcW w:w="1488" w:type="dxa"/>
@@ -2772,12 +2429,6 @@
         </w:tc>
       </w:tr>
       <w:tr>
-        <w:tblPrEx>
-          <w:tblCellMar>
-            <w:top w:w="0" w:type="dxa"/>
-            <w:bottom w:w="0" w:type="dxa"/>
-          </w:tblCellMar>
-        </w:tblPrEx>
         <w:tc>
           <w:tcPr>
             <w:tcW w:w="1488" w:type="dxa"/>
@@ -2808,12 +2459,6 @@
         </w:tc>
       </w:tr>
       <w:tr>
-        <w:tblPrEx>
-          <w:tblCellMar>
-            <w:top w:w="0" w:type="dxa"/>
-            <w:bottom w:w="0" w:type="dxa"/>
-          </w:tblCellMar>
-        </w:tblPrEx>
         <w:tc>
           <w:tcPr>
             <w:tcW w:w="1488" w:type="dxa"/>
@@ -2868,12 +2513,6 @@
         <w:gridCol w:w="8080"/>
       </w:tblGrid>
       <w:tr>
-        <w:tblPrEx>
-          <w:tblCellMar>
-            <w:top w:w="0" w:type="dxa"/>
-            <w:bottom w:w="0" w:type="dxa"/>
-          </w:tblCellMar>
-        </w:tblPrEx>
         <w:tc>
           <w:tcPr>
             <w:tcW w:w="1488" w:type="dxa"/>
@@ -2904,12 +2543,6 @@
         </w:tc>
       </w:tr>
       <w:tr>
-        <w:tblPrEx>
-          <w:tblCellMar>
-            <w:top w:w="0" w:type="dxa"/>
-            <w:bottom w:w="0" w:type="dxa"/>
-          </w:tblCellMar>
-        </w:tblPrEx>
         <w:tc>
           <w:tcPr>
             <w:tcW w:w="1488" w:type="dxa"/>
@@ -2943,12 +2576,6 @@
         </w:tc>
       </w:tr>
       <w:tr>
-        <w:tblPrEx>
-          <w:tblCellMar>
-            <w:top w:w="0" w:type="dxa"/>
-            <w:bottom w:w="0" w:type="dxa"/>
-          </w:tblCellMar>
-        </w:tblPrEx>
         <w:tc>
           <w:tcPr>
             <w:tcW w:w="1488" w:type="dxa"/>
@@ -3005,12 +2632,6 @@
         <w:gridCol w:w="8080"/>
       </w:tblGrid>
       <w:tr>
-        <w:tblPrEx>
-          <w:tblCellMar>
-            <w:top w:w="0" w:type="dxa"/>
-            <w:bottom w:w="0" w:type="dxa"/>
-          </w:tblCellMar>
-        </w:tblPrEx>
         <w:tc>
           <w:tcPr>
             <w:tcW w:w="1488" w:type="dxa"/>
@@ -3041,12 +2662,6 @@
         </w:tc>
       </w:tr>
       <w:tr>
-        <w:tblPrEx>
-          <w:tblCellMar>
-            <w:top w:w="0" w:type="dxa"/>
-            <w:bottom w:w="0" w:type="dxa"/>
-          </w:tblCellMar>
-        </w:tblPrEx>
         <w:tc>
           <w:tcPr>
             <w:tcW w:w="1488" w:type="dxa"/>
@@ -3080,12 +2695,6 @@
         </w:tc>
       </w:tr>
       <w:tr>
-        <w:tblPrEx>
-          <w:tblCellMar>
-            <w:top w:w="0" w:type="dxa"/>
-            <w:bottom w:w="0" w:type="dxa"/>
-          </w:tblCellMar>
-        </w:tblPrEx>
         <w:tc>
           <w:tcPr>
             <w:tcW w:w="1488" w:type="dxa"/>
@@ -3136,12 +2745,6 @@
         <w:gridCol w:w="8080"/>
       </w:tblGrid>
       <w:tr>
-        <w:tblPrEx>
-          <w:tblCellMar>
-            <w:top w:w="0" w:type="dxa"/>
-            <w:bottom w:w="0" w:type="dxa"/>
-          </w:tblCellMar>
-        </w:tblPrEx>
         <w:tc>
           <w:tcPr>
             <w:tcW w:w="1488" w:type="dxa"/>
@@ -3172,12 +2775,6 @@
         </w:tc>
       </w:tr>
       <w:tr>
-        <w:tblPrEx>
-          <w:tblCellMar>
-            <w:top w:w="0" w:type="dxa"/>
-            <w:bottom w:w="0" w:type="dxa"/>
-          </w:tblCellMar>
-        </w:tblPrEx>
         <w:tc>
           <w:tcPr>
             <w:tcW w:w="1488" w:type="dxa"/>
@@ -3208,12 +2805,6 @@
         </w:tc>
       </w:tr>
       <w:tr>
-        <w:tblPrEx>
-          <w:tblCellMar>
-            <w:top w:w="0" w:type="dxa"/>
-            <w:bottom w:w="0" w:type="dxa"/>
-          </w:tblCellMar>
-        </w:tblPrEx>
         <w:tc>
           <w:tcPr>
             <w:tcW w:w="1488" w:type="dxa"/>
@@ -3267,12 +2858,6 @@
         <w:gridCol w:w="8080"/>
       </w:tblGrid>
       <w:tr>
-        <w:tblPrEx>
-          <w:tblCellMar>
-            <w:top w:w="0" w:type="dxa"/>
-            <w:bottom w:w="0" w:type="dxa"/>
-          </w:tblCellMar>
-        </w:tblPrEx>
         <w:tc>
           <w:tcPr>
             <w:tcW w:w="1488" w:type="dxa"/>
@@ -3297,21 +2882,12 @@
               <w:jc w:val="both"/>
             </w:pPr>
             <w:r>
-              <w:t>02</w:t>
-            </w:r>
-            <w:r>
-              <w:t>1</w:t>
+              <w:t>021</w:t>
             </w:r>
           </w:p>
         </w:tc>
       </w:tr>
       <w:tr>
-        <w:tblPrEx>
-          <w:tblCellMar>
-            <w:top w:w="0" w:type="dxa"/>
-            <w:bottom w:w="0" w:type="dxa"/>
-          </w:tblCellMar>
-        </w:tblPrEx>
         <w:tc>
           <w:tcPr>
             <w:tcW w:w="1488" w:type="dxa"/>
@@ -3336,30 +2912,12 @@
               <w:jc w:val="both"/>
             </w:pPr>
             <w:r>
-              <w:t>29</w:t>
-            </w:r>
-            <w:r>
-              <w:t>-</w:t>
-            </w:r>
-            <w:r>
-              <w:t>01</w:t>
-            </w:r>
-            <w:r>
-              <w:t>-202</w:t>
-            </w:r>
-            <w:r>
-              <w:t>4</w:t>
+              <w:t>29-01-2024</w:t>
             </w:r>
           </w:p>
         </w:tc>
       </w:tr>
       <w:tr>
-        <w:tblPrEx>
-          <w:tblCellMar>
-            <w:top w:w="0" w:type="dxa"/>
-            <w:bottom w:w="0" w:type="dxa"/>
-          </w:tblCellMar>
-        </w:tblPrEx>
         <w:tc>
           <w:tcPr>
             <w:tcW w:w="1488" w:type="dxa"/>
@@ -3388,19 +2946,263 @@
               </w:rPr>
             </w:pPr>
             <w:r>
-              <w:t>Actualizado cambios incluidos en la versión 2.2.</w:t>
-            </w:r>
-            <w:r>
-              <w:t>4</w:t>
+              <w:t>Actualizado cambios incluidos en la versión 2.2.4_000</w:t>
+            </w:r>
+            <w:r>
+              <w:t xml:space="preserve"> y ordenación de las siglas y acrónimos</w:t>
+            </w:r>
+            <w:r>
+              <w:t>.</w:t>
+            </w:r>
+          </w:p>
+        </w:tc>
+      </w:tr>
+    </w:tbl>
+    <w:p/>
+    <w:tbl>
+      <w:tblPr>
+        <w:tblW w:w="0" w:type="auto"/>
+        <w:tblLayout w:type="fixed"/>
+        <w:tblCellMar>
+          <w:left w:w="70" w:type="dxa"/>
+          <w:right w:w="70" w:type="dxa"/>
+        </w:tblCellMar>
+        <w:tblLook w:val="0000" w:firstRow="0" w:lastRow="0" w:firstColumn="0" w:lastColumn="0" w:noHBand="0" w:noVBand="0"/>
+      </w:tblPr>
+      <w:tblGrid>
+        <w:gridCol w:w="1488"/>
+        <w:gridCol w:w="8080"/>
+      </w:tblGrid>
+      <w:tr>
+        <w:tc>
+          <w:tcPr>
+            <w:tcW w:w="1488" w:type="dxa"/>
+          </w:tcPr>
+          <w:p>
+            <w:pPr>
+              <w:pStyle w:val="Tabla"/>
+              <w:jc w:val="both"/>
+            </w:pPr>
+            <w:r>
+              <w:t>Rev.</w:t>
+            </w:r>
+          </w:p>
+        </w:tc>
+        <w:tc>
+          <w:tcPr>
+            <w:tcW w:w="8080" w:type="dxa"/>
+          </w:tcPr>
+          <w:p>
+            <w:pPr>
+              <w:pStyle w:val="Tabla"/>
+              <w:jc w:val="both"/>
+            </w:pPr>
+            <w:r>
+              <w:t>022</w:t>
+            </w:r>
+          </w:p>
+        </w:tc>
+      </w:tr>
+      <w:tr>
+        <w:tc>
+          <w:tcPr>
+            <w:tcW w:w="1488" w:type="dxa"/>
+          </w:tcPr>
+          <w:p>
+            <w:pPr>
+              <w:pStyle w:val="Tabla"/>
+              <w:jc w:val="both"/>
+            </w:pPr>
+            <w:r>
+              <w:t>Fecha</w:t>
+            </w:r>
+          </w:p>
+        </w:tc>
+        <w:tc>
+          <w:tcPr>
+            <w:tcW w:w="8080" w:type="dxa"/>
+          </w:tcPr>
+          <w:p>
+            <w:pPr>
+              <w:pStyle w:val="Tabla"/>
+              <w:jc w:val="both"/>
+            </w:pPr>
+            <w:r>
+              <w:t>16-05-2024</w:t>
+            </w:r>
+          </w:p>
+        </w:tc>
+      </w:tr>
+      <w:tr>
+        <w:tc>
+          <w:tcPr>
+            <w:tcW w:w="1488" w:type="dxa"/>
+          </w:tcPr>
+          <w:p>
+            <w:pPr>
+              <w:pStyle w:val="Tabla"/>
+              <w:jc w:val="both"/>
+            </w:pPr>
+            <w:r>
+              <w:t>Descripción</w:t>
+            </w:r>
+          </w:p>
+        </w:tc>
+        <w:tc>
+          <w:tcPr>
+            <w:tcW w:w="8080" w:type="dxa"/>
+          </w:tcPr>
+          <w:p>
+            <w:pPr>
+              <w:pStyle w:val="Tabla"/>
+              <w:jc w:val="both"/>
+              <w:rPr>
+                <w:rStyle w:val="Textoennegrita"/>
+                <w:u w:val="single"/>
+              </w:rPr>
+            </w:pPr>
+            <w:r>
+              <w:t>Actualizado cambios incluidos en la versión 2.2.4_001.</w:t>
+            </w:r>
+          </w:p>
+        </w:tc>
+      </w:tr>
+    </w:tbl>
+    <w:p/>
+    <w:tbl>
+      <w:tblPr>
+        <w:tblW w:w="0" w:type="auto"/>
+        <w:tblLayout w:type="fixed"/>
+        <w:tblCellMar>
+          <w:left w:w="70" w:type="dxa"/>
+          <w:right w:w="70" w:type="dxa"/>
+        </w:tblCellMar>
+        <w:tblLook w:val="0000" w:firstRow="0" w:lastRow="0" w:firstColumn="0" w:lastColumn="0" w:noHBand="0" w:noVBand="0"/>
+      </w:tblPr>
+      <w:tblGrid>
+        <w:gridCol w:w="1488"/>
+        <w:gridCol w:w="8080"/>
+      </w:tblGrid>
+      <w:tr>
+        <w:tc>
+          <w:tcPr>
+            <w:tcW w:w="1488" w:type="dxa"/>
+          </w:tcPr>
+          <w:p>
+            <w:pPr>
+              <w:pStyle w:val="Tabla"/>
+              <w:jc w:val="both"/>
+            </w:pPr>
+            <w:r>
+              <w:t>Rev.</w:t>
+            </w:r>
+          </w:p>
+        </w:tc>
+        <w:tc>
+          <w:tcPr>
+            <w:tcW w:w="8080" w:type="dxa"/>
+          </w:tcPr>
+          <w:p>
+            <w:pPr>
+              <w:pStyle w:val="Tabla"/>
+              <w:jc w:val="both"/>
+            </w:pPr>
+            <w:r>
+              <w:t>02</w:t>
+            </w:r>
+            <w:r>
+              <w:t>3</w:t>
+            </w:r>
+          </w:p>
+        </w:tc>
+      </w:tr>
+      <w:tr>
+        <w:tc>
+          <w:tcPr>
+            <w:tcW w:w="1488" w:type="dxa"/>
+          </w:tcPr>
+          <w:p>
+            <w:pPr>
+              <w:pStyle w:val="Tabla"/>
+              <w:jc w:val="both"/>
+            </w:pPr>
+            <w:r>
+              <w:t>Fecha</w:t>
+            </w:r>
+          </w:p>
+        </w:tc>
+        <w:tc>
+          <w:tcPr>
+            <w:tcW w:w="8080" w:type="dxa"/>
+          </w:tcPr>
+          <w:p>
+            <w:pPr>
+              <w:pStyle w:val="Tabla"/>
+              <w:jc w:val="both"/>
+            </w:pPr>
+            <w:r>
+              <w:t>03</w:t>
+            </w:r>
+            <w:r>
+              <w:t>-0</w:t>
+            </w:r>
+            <w:r>
+              <w:t>2</w:t>
+            </w:r>
+            <w:r>
+              <w:t>-202</w:t>
+            </w:r>
+            <w:r>
+              <w:t>5</w:t>
+            </w:r>
+          </w:p>
+        </w:tc>
+      </w:tr>
+      <w:tr>
+        <w:tc>
+          <w:tcPr>
+            <w:tcW w:w="1488" w:type="dxa"/>
+          </w:tcPr>
+          <w:p>
+            <w:pPr>
+              <w:pStyle w:val="Tabla"/>
+              <w:jc w:val="both"/>
+            </w:pPr>
+            <w:r>
+              <w:t>Descripción</w:t>
+            </w:r>
+          </w:p>
+        </w:tc>
+        <w:tc>
+          <w:tcPr>
+            <w:tcW w:w="8080" w:type="dxa"/>
+          </w:tcPr>
+          <w:p>
+            <w:pPr>
+              <w:pStyle w:val="Tabla"/>
+              <w:jc w:val="both"/>
+              <w:rPr>
+                <w:rStyle w:val="Textoennegrita"/>
+                <w:u w:val="single"/>
+              </w:rPr>
+            </w:pPr>
+            <w:r>
+              <w:t>Actualizado cambios incluidos en la versión 2.</w:t>
+            </w:r>
+            <w:r>
+              <w:t>3</w:t>
+            </w:r>
+            <w:r>
+              <w:t>.</w:t>
+            </w:r>
+            <w:r>
+              <w:t>0</w:t>
             </w:r>
             <w:r>
               <w:t>_00</w:t>
             </w:r>
             <w:r>
               <w:t>0</w:t>
-            </w:r>
-            <w:r>
-              <w:t xml:space="preserve"> y ordenación de las siglas y acrónimos</w:t>
             </w:r>
             <w:r>
               <w:t>.</w:t>
@@ -3441,12 +3243,6 @@
         <w:gridCol w:w="6121"/>
       </w:tblGrid>
       <w:tr>
-        <w:tblPrEx>
-          <w:tblCellMar>
-            <w:top w:w="0" w:type="dxa"/>
-            <w:bottom w:w="0" w:type="dxa"/>
-          </w:tblCellMar>
-        </w:tblPrEx>
         <w:trPr>
           <w:trHeight w:val="329"/>
         </w:trPr>
@@ -3518,12 +3314,6 @@
         </w:tc>
       </w:tr>
       <w:tr>
-        <w:tblPrEx>
-          <w:tblCellMar>
-            <w:top w:w="0" w:type="dxa"/>
-            <w:bottom w:w="0" w:type="dxa"/>
-          </w:tblCellMar>
-        </w:tblPrEx>
         <w:trPr>
           <w:trHeight w:val="182"/>
         </w:trPr>
@@ -3563,7 +3353,7 @@
               <w:fldChar w:fldCharType="separate"/>
             </w:r>
             <w:r>
-              <w:t>021</w:t>
+              <w:t>023</w:t>
             </w:r>
             <w:r>
               <w:fldChar w:fldCharType="end"/>
@@ -3572,12 +3362,6 @@
         </w:tc>
       </w:tr>
       <w:tr>
-        <w:tblPrEx>
-          <w:tblCellMar>
-            <w:top w:w="0" w:type="dxa"/>
-            <w:bottom w:w="0" w:type="dxa"/>
-          </w:tblCellMar>
-        </w:tblPrEx>
         <w:trPr>
           <w:trHeight w:val="182"/>
         </w:trPr>
@@ -3617,7 +3401,7 @@
               <w:fldChar w:fldCharType="separate"/>
             </w:r>
             <w:r>
-              <w:t>29-01-2024</w:t>
+              <w:t>03-02-2025</w:t>
             </w:r>
             <w:r>
               <w:fldChar w:fldCharType="end"/>
@@ -3744,12 +3528,6 @@
         <w:gridCol w:w="3055"/>
       </w:tblGrid>
       <w:tr>
-        <w:tblPrEx>
-          <w:tblCellMar>
-            <w:top w:w="0" w:type="dxa"/>
-            <w:bottom w:w="0" w:type="dxa"/>
-          </w:tblCellMar>
-        </w:tblPrEx>
         <w:tc>
           <w:tcPr>
             <w:tcW w:w="3055" w:type="dxa"/>
@@ -3827,12 +3605,6 @@
         </w:tc>
       </w:tr>
       <w:tr>
-        <w:tblPrEx>
-          <w:tblCellMar>
-            <w:top w:w="0" w:type="dxa"/>
-            <w:bottom w:w="0" w:type="dxa"/>
-          </w:tblCellMar>
-        </w:tblPrEx>
         <w:tc>
           <w:tcPr>
             <w:tcW w:w="3055" w:type="dxa"/>
@@ -3880,12 +3652,6 @@
         </w:tc>
       </w:tr>
       <w:tr>
-        <w:tblPrEx>
-          <w:tblCellMar>
-            <w:top w:w="0" w:type="dxa"/>
-            <w:bottom w:w="0" w:type="dxa"/>
-          </w:tblCellMar>
-        </w:tblPrEx>
         <w:tc>
           <w:tcPr>
             <w:tcW w:w="3055" w:type="dxa"/>
@@ -3933,12 +3699,6 @@
         </w:tc>
       </w:tr>
       <w:tr>
-        <w:tblPrEx>
-          <w:tblCellMar>
-            <w:top w:w="0" w:type="dxa"/>
-            <w:bottom w:w="0" w:type="dxa"/>
-          </w:tblCellMar>
-        </w:tblPrEx>
         <w:tc>
           <w:tcPr>
             <w:tcW w:w="3055" w:type="dxa"/>
@@ -3986,12 +3746,6 @@
         </w:tc>
       </w:tr>
       <w:tr>
-        <w:tblPrEx>
-          <w:tblCellMar>
-            <w:top w:w="0" w:type="dxa"/>
-            <w:bottom w:w="0" w:type="dxa"/>
-          </w:tblCellMar>
-        </w:tblPrEx>
         <w:tc>
           <w:tcPr>
             <w:tcW w:w="3055" w:type="dxa"/>
@@ -4106,8 +3860,8 @@
           <w:b w:val="0"/>
           <w:spacing w:val="0"/>
           <w:kern w:val="2"/>
-          <w:sz w:val="22"/>
-          <w:szCs w:val="22"/>
+          <w:sz w:val="24"/>
+          <w:szCs w:val="24"/>
         </w:rPr>
       </w:pPr>
       <w:r>
@@ -4139,8 +3893,8 @@
           <w:b w:val="0"/>
           <w:spacing w:val="0"/>
           <w:kern w:val="2"/>
-          <w:sz w:val="22"/>
-          <w:szCs w:val="22"/>
+          <w:sz w:val="24"/>
+          <w:szCs w:val="24"/>
         </w:rPr>
         <w:tab/>
       </w:r>
@@ -4154,13 +3908,13 @@
         <w:fldChar w:fldCharType="begin"/>
       </w:r>
       <w:r>
-        <w:instrText xml:space="preserve"> PAGEREF _Toc157413374 \h </w:instrText>
+        <w:instrText xml:space="preserve"> PAGEREF _Toc189498211 \h </w:instrText>
       </w:r>
       <w:r>
         <w:fldChar w:fldCharType="separate"/>
       </w:r>
       <w:r>
-        <w:t>7</w:t>
+        <w:t>8</w:t>
       </w:r>
       <w:r>
         <w:fldChar w:fldCharType="end"/>
@@ -4176,8 +3930,8 @@
           <w:b w:val="0"/>
           <w:spacing w:val="0"/>
           <w:kern w:val="2"/>
-          <w:sz w:val="22"/>
-          <w:szCs w:val="22"/>
+          <w:sz w:val="24"/>
+          <w:szCs w:val="24"/>
         </w:rPr>
       </w:pPr>
       <w:r>
@@ -4188,8 +3942,8 @@
           <w:b w:val="0"/>
           <w:spacing w:val="0"/>
           <w:kern w:val="2"/>
-          <w:sz w:val="22"/>
-          <w:szCs w:val="22"/>
+          <w:sz w:val="24"/>
+          <w:szCs w:val="24"/>
         </w:rPr>
         <w:tab/>
       </w:r>
@@ -4203,13 +3957,13 @@
         <w:fldChar w:fldCharType="begin"/>
       </w:r>
       <w:r>
-        <w:instrText xml:space="preserve"> PAGEREF _Toc157413375 \h </w:instrText>
+        <w:instrText xml:space="preserve"> PAGEREF _Toc189498212 \h </w:instrText>
       </w:r>
       <w:r>
         <w:fldChar w:fldCharType="separate"/>
       </w:r>
       <w:r>
-        <w:t>8</w:t>
+        <w:t>9</w:t>
       </w:r>
       <w:r>
         <w:fldChar w:fldCharType="end"/>
@@ -4225,8 +3979,8 @@
           <w:b w:val="0"/>
           <w:spacing w:val="0"/>
           <w:kern w:val="2"/>
-          <w:sz w:val="22"/>
-          <w:szCs w:val="22"/>
+          <w:sz w:val="24"/>
+          <w:szCs w:val="24"/>
         </w:rPr>
       </w:pPr>
       <w:r>
@@ -4237,8 +3991,8 @@
           <w:b w:val="0"/>
           <w:spacing w:val="0"/>
           <w:kern w:val="2"/>
-          <w:sz w:val="22"/>
-          <w:szCs w:val="22"/>
+          <w:sz w:val="24"/>
+          <w:szCs w:val="24"/>
         </w:rPr>
         <w:tab/>
       </w:r>
@@ -4252,13 +4006,13 @@
         <w:fldChar w:fldCharType="begin"/>
       </w:r>
       <w:r>
-        <w:instrText xml:space="preserve"> PAGEREF _Toc157413376 \h </w:instrText>
+        <w:instrText xml:space="preserve"> PAGEREF _Toc189498213 \h </w:instrText>
       </w:r>
       <w:r>
         <w:fldChar w:fldCharType="separate"/>
       </w:r>
       <w:r>
-        <w:t>9</w:t>
+        <w:t>10</w:t>
       </w:r>
       <w:r>
         <w:fldChar w:fldCharType="end"/>
@@ -4274,8 +4028,8 @@
           <w:b w:val="0"/>
           <w:spacing w:val="0"/>
           <w:kern w:val="2"/>
-          <w:sz w:val="22"/>
-          <w:szCs w:val="22"/>
+          <w:sz w:val="24"/>
+          <w:szCs w:val="24"/>
         </w:rPr>
       </w:pPr>
       <w:r>
@@ -4286,8 +4040,8 @@
           <w:b w:val="0"/>
           <w:spacing w:val="0"/>
           <w:kern w:val="2"/>
-          <w:sz w:val="22"/>
-          <w:szCs w:val="22"/>
+          <w:sz w:val="24"/>
+          <w:szCs w:val="24"/>
         </w:rPr>
         <w:tab/>
       </w:r>
@@ -4301,13 +4055,13 @@
         <w:fldChar w:fldCharType="begin"/>
       </w:r>
       <w:r>
-        <w:instrText xml:space="preserve"> PAGEREF _Toc157413377 \h </w:instrText>
+        <w:instrText xml:space="preserve"> PAGEREF _Toc189498214 \h </w:instrText>
       </w:r>
       <w:r>
         <w:fldChar w:fldCharType="separate"/>
       </w:r>
       <w:r>
-        <w:t>10</w:t>
+        <w:t>11</w:t>
       </w:r>
       <w:r>
         <w:fldChar w:fldCharType="end"/>
@@ -4323,8 +4077,8 @@
           <w:b w:val="0"/>
           <w:spacing w:val="0"/>
           <w:kern w:val="2"/>
-          <w:sz w:val="22"/>
-          <w:szCs w:val="22"/>
+          <w:sz w:val="24"/>
+          <w:szCs w:val="24"/>
         </w:rPr>
       </w:pPr>
       <w:r>
@@ -4335,8 +4089,8 @@
           <w:b w:val="0"/>
           <w:spacing w:val="0"/>
           <w:kern w:val="2"/>
-          <w:sz w:val="22"/>
-          <w:szCs w:val="22"/>
+          <w:sz w:val="24"/>
+          <w:szCs w:val="24"/>
         </w:rPr>
         <w:tab/>
       </w:r>
@@ -4350,13 +4104,13 @@
         <w:fldChar w:fldCharType="begin"/>
       </w:r>
       <w:r>
-        <w:instrText xml:space="preserve"> PAGEREF _Toc157413378 \h </w:instrText>
+        <w:instrText xml:space="preserve"> PAGEREF _Toc189498215 \h </w:instrText>
       </w:r>
       <w:r>
         <w:fldChar w:fldCharType="separate"/>
       </w:r>
       <w:r>
-        <w:t>11</w:t>
+        <w:t>12</w:t>
       </w:r>
       <w:r>
         <w:fldChar w:fldCharType="end"/>
@@ -4372,8 +4126,8 @@
           <w:b w:val="0"/>
           <w:spacing w:val="0"/>
           <w:kern w:val="2"/>
-          <w:sz w:val="22"/>
-          <w:szCs w:val="22"/>
+          <w:sz w:val="24"/>
+          <w:szCs w:val="24"/>
         </w:rPr>
       </w:pPr>
       <w:r>
@@ -4384,8 +4138,8 @@
           <w:b w:val="0"/>
           <w:spacing w:val="0"/>
           <w:kern w:val="2"/>
-          <w:sz w:val="22"/>
-          <w:szCs w:val="22"/>
+          <w:sz w:val="24"/>
+          <w:szCs w:val="24"/>
         </w:rPr>
         <w:tab/>
       </w:r>
@@ -4399,13 +4153,13 @@
         <w:fldChar w:fldCharType="begin"/>
       </w:r>
       <w:r>
-        <w:instrText xml:space="preserve"> PAGEREF _Toc157413379 \h </w:instrText>
+        <w:instrText xml:space="preserve"> PAGEREF _Toc189498216 \h </w:instrText>
       </w:r>
       <w:r>
         <w:fldChar w:fldCharType="separate"/>
       </w:r>
       <w:r>
-        <w:t>12</w:t>
+        <w:t>13</w:t>
       </w:r>
       <w:r>
         <w:fldChar w:fldCharType="end"/>
@@ -4421,8 +4175,8 @@
           <w:b w:val="0"/>
           <w:spacing w:val="0"/>
           <w:kern w:val="2"/>
-          <w:sz w:val="22"/>
-          <w:szCs w:val="22"/>
+          <w:sz w:val="24"/>
+          <w:szCs w:val="24"/>
         </w:rPr>
       </w:pPr>
       <w:r>
@@ -4433,8 +4187,8 @@
           <w:b w:val="0"/>
           <w:spacing w:val="0"/>
           <w:kern w:val="2"/>
-          <w:sz w:val="22"/>
-          <w:szCs w:val="22"/>
+          <w:sz w:val="24"/>
+          <w:szCs w:val="24"/>
         </w:rPr>
         <w:tab/>
       </w:r>
@@ -4448,13 +4202,13 @@
         <w:fldChar w:fldCharType="begin"/>
       </w:r>
       <w:r>
-        <w:instrText xml:space="preserve"> PAGEREF _Toc157413380 \h </w:instrText>
+        <w:instrText xml:space="preserve"> PAGEREF _Toc189498217 \h </w:instrText>
       </w:r>
       <w:r>
         <w:fldChar w:fldCharType="separate"/>
       </w:r>
       <w:r>
-        <w:t>13</w:t>
+        <w:t>14</w:t>
       </w:r>
       <w:r>
         <w:fldChar w:fldCharType="end"/>
@@ -4469,8 +4223,8 @@
         <w:rPr>
           <w:spacing w:val="0"/>
           <w:kern w:val="2"/>
-          <w:sz w:val="22"/>
-          <w:szCs w:val="22"/>
+          <w:sz w:val="24"/>
+          <w:szCs w:val="24"/>
         </w:rPr>
       </w:pPr>
       <w:r>
@@ -4480,13 +4234,16 @@
         <w:rPr>
           <w:spacing w:val="0"/>
           <w:kern w:val="2"/>
-          <w:sz w:val="22"/>
-          <w:szCs w:val="22"/>
+          <w:sz w:val="24"/>
+          <w:szCs w:val="24"/>
         </w:rPr>
         <w:tab/>
       </w:r>
       <w:r>
-        <w:t>Integr@ 2.2.4_000</w:t>
+        <w:rPr>
+          <w:highlight w:val="yellow"/>
+        </w:rPr>
+        <w:t>Integr@ 2.3.0_000</w:t>
       </w:r>
       <w:r>
         <w:tab/>
@@ -4495,13 +4252,13 @@
         <w:fldChar w:fldCharType="begin"/>
       </w:r>
       <w:r>
-        <w:instrText xml:space="preserve"> PAGEREF _Toc157413381 \h </w:instrText>
+        <w:instrText xml:space="preserve"> PAGEREF _Toc189498218 \h </w:instrText>
       </w:r>
       <w:r>
         <w:fldChar w:fldCharType="separate"/>
       </w:r>
       <w:r>
-        <w:t>13</w:t>
+        <w:t>14</w:t>
       </w:r>
       <w:r>
         <w:fldChar w:fldCharType="end"/>
@@ -4513,8 +4270,8 @@
         <w:rPr>
           <w:spacing w:val="0"/>
           <w:kern w:val="2"/>
-          <w:sz w:val="22"/>
-          <w:szCs w:val="22"/>
+          <w:sz w:val="24"/>
+          <w:szCs w:val="24"/>
         </w:rPr>
       </w:pPr>
       <w:r>
@@ -4524,8 +4281,8 @@
         <w:rPr>
           <w:spacing w:val="0"/>
           <w:kern w:val="2"/>
-          <w:sz w:val="22"/>
-          <w:szCs w:val="22"/>
+          <w:sz w:val="24"/>
+          <w:szCs w:val="24"/>
         </w:rPr>
         <w:tab/>
       </w:r>
@@ -4539,57 +4296,13 @@
         <w:fldChar w:fldCharType="begin"/>
       </w:r>
       <w:r>
-        <w:instrText xml:space="preserve"> PAGEREF _Toc157413382 \h </w:instrText>
+        <w:instrText xml:space="preserve"> PAGEREF _Toc189498219 \h </w:instrText>
       </w:r>
       <w:r>
         <w:fldChar w:fldCharType="separate"/>
       </w:r>
       <w:r>
-        <w:t>13</w:t>
-      </w:r>
-      <w:r>
-        <w:fldChar w:fldCharType="end"/>
-      </w:r>
-    </w:p>
-    <w:p>
-      <w:pPr>
-        <w:pStyle w:val="TDC3"/>
-        <w:rPr>
-          <w:spacing w:val="0"/>
-          <w:kern w:val="2"/>
-          <w:sz w:val="22"/>
-          <w:szCs w:val="22"/>
-        </w:rPr>
-      </w:pPr>
-      <w:r>
-        <w:t>7.1.2</w:t>
-      </w:r>
-      <w:r>
-        <w:rPr>
-          <w:spacing w:val="0"/>
-          <w:kern w:val="2"/>
-          <w:sz w:val="22"/>
-          <w:szCs w:val="22"/>
-        </w:rPr>
-        <w:tab/>
-      </w:r>
-      <w:r>
-        <w:t>Errores Resueltos</w:t>
-      </w:r>
-      <w:r>
-        <w:tab/>
-      </w:r>
-      <w:r>
-        <w:fldChar w:fldCharType="begin"/>
-      </w:r>
-      <w:r>
-        <w:instrText xml:space="preserve"> PAGEREF _Toc157413383 \h </w:instrText>
-      </w:r>
-      <w:r>
-        <w:fldChar w:fldCharType="separate"/>
-      </w:r>
-      <w:r>
-        <w:t>13</w:t>
+        <w:t>14</w:t>
       </w:r>
       <w:r>
         <w:fldChar w:fldCharType="end"/>
@@ -4604,8 +4317,8 @@
         <w:rPr>
           <w:spacing w:val="0"/>
           <w:kern w:val="2"/>
-          <w:sz w:val="22"/>
-          <w:szCs w:val="22"/>
+          <w:sz w:val="24"/>
+          <w:szCs w:val="24"/>
         </w:rPr>
       </w:pPr>
       <w:r>
@@ -4615,13 +4328,13 @@
         <w:rPr>
           <w:spacing w:val="0"/>
           <w:kern w:val="2"/>
-          <w:sz w:val="22"/>
-          <w:szCs w:val="22"/>
+          <w:sz w:val="24"/>
+          <w:szCs w:val="24"/>
         </w:rPr>
         <w:tab/>
       </w:r>
       <w:r>
-        <w:t>Integr@ 2.2.3_001</w:t>
+        <w:t>Integr@ 2.2.4_001</w:t>
       </w:r>
       <w:r>
         <w:tab/>
@@ -4630,13 +4343,13 @@
         <w:fldChar w:fldCharType="begin"/>
       </w:r>
       <w:r>
-        <w:instrText xml:space="preserve"> PAGEREF _Toc157413384 \h </w:instrText>
+        <w:instrText xml:space="preserve"> PAGEREF _Toc189498220 \h </w:instrText>
       </w:r>
       <w:r>
         <w:fldChar w:fldCharType="separate"/>
       </w:r>
       <w:r>
-        <w:t>13</w:t>
+        <w:t>14</w:t>
       </w:r>
       <w:r>
         <w:fldChar w:fldCharType="end"/>
@@ -4648,8 +4361,8 @@
         <w:rPr>
           <w:spacing w:val="0"/>
           <w:kern w:val="2"/>
-          <w:sz w:val="22"/>
-          <w:szCs w:val="22"/>
+          <w:sz w:val="24"/>
+          <w:szCs w:val="24"/>
         </w:rPr>
       </w:pPr>
       <w:r>
@@ -4659,8 +4372,8 @@
         <w:rPr>
           <w:spacing w:val="0"/>
           <w:kern w:val="2"/>
-          <w:sz w:val="22"/>
-          <w:szCs w:val="22"/>
+          <w:sz w:val="24"/>
+          <w:szCs w:val="24"/>
         </w:rPr>
         <w:tab/>
       </w:r>
@@ -4674,13 +4387,13 @@
         <w:fldChar w:fldCharType="begin"/>
       </w:r>
       <w:r>
-        <w:instrText xml:space="preserve"> PAGEREF _Toc157413385 \h </w:instrText>
+        <w:instrText xml:space="preserve"> PAGEREF _Toc189498221 \h </w:instrText>
       </w:r>
       <w:r>
         <w:fldChar w:fldCharType="separate"/>
       </w:r>
       <w:r>
-        <w:t>13</w:t>
+        <w:t>14</w:t>
       </w:r>
       <w:r>
         <w:fldChar w:fldCharType="end"/>
@@ -4692,8 +4405,8 @@
         <w:rPr>
           <w:spacing w:val="0"/>
           <w:kern w:val="2"/>
-          <w:sz w:val="22"/>
-          <w:szCs w:val="22"/>
+          <w:sz w:val="24"/>
+          <w:szCs w:val="24"/>
         </w:rPr>
       </w:pPr>
       <w:r>
@@ -4703,8 +4416,8 @@
         <w:rPr>
           <w:spacing w:val="0"/>
           <w:kern w:val="2"/>
-          <w:sz w:val="22"/>
-          <w:szCs w:val="22"/>
+          <w:sz w:val="24"/>
+          <w:szCs w:val="24"/>
         </w:rPr>
         <w:tab/>
       </w:r>
@@ -4718,13 +4431,13 @@
         <w:fldChar w:fldCharType="begin"/>
       </w:r>
       <w:r>
-        <w:instrText xml:space="preserve"> PAGEREF _Toc157413386 \h </w:instrText>
+        <w:instrText xml:space="preserve"> PAGEREF _Toc189498222 \h </w:instrText>
       </w:r>
       <w:r>
         <w:fldChar w:fldCharType="separate"/>
       </w:r>
       <w:r>
-        <w:t>13</w:t>
+        <w:t>14</w:t>
       </w:r>
       <w:r>
         <w:fldChar w:fldCharType="end"/>
@@ -4739,8 +4452,8 @@
         <w:rPr>
           <w:spacing w:val="0"/>
           <w:kern w:val="2"/>
-          <w:sz w:val="22"/>
-          <w:szCs w:val="22"/>
+          <w:sz w:val="24"/>
+          <w:szCs w:val="24"/>
         </w:rPr>
       </w:pPr>
       <w:r>
@@ -4750,13 +4463,13 @@
         <w:rPr>
           <w:spacing w:val="0"/>
           <w:kern w:val="2"/>
-          <w:sz w:val="22"/>
-          <w:szCs w:val="22"/>
+          <w:sz w:val="24"/>
+          <w:szCs w:val="24"/>
         </w:rPr>
         <w:tab/>
       </w:r>
       <w:r>
-        <w:t>Integr@ 2.2.3_000</w:t>
+        <w:t>Integr@ 2.2.4_000</w:t>
       </w:r>
       <w:r>
         <w:tab/>
@@ -4765,13 +4478,13 @@
         <w:fldChar w:fldCharType="begin"/>
       </w:r>
       <w:r>
-        <w:instrText xml:space="preserve"> PAGEREF _Toc157413387 \h </w:instrText>
+        <w:instrText xml:space="preserve"> PAGEREF _Toc189498223 \h </w:instrText>
       </w:r>
       <w:r>
         <w:fldChar w:fldCharType="separate"/>
       </w:r>
       <w:r>
-        <w:t>13</w:t>
+        <w:t>14</w:t>
       </w:r>
       <w:r>
         <w:fldChar w:fldCharType="end"/>
@@ -4783,8 +4496,8 @@
         <w:rPr>
           <w:spacing w:val="0"/>
           <w:kern w:val="2"/>
-          <w:sz w:val="22"/>
-          <w:szCs w:val="22"/>
+          <w:sz w:val="24"/>
+          <w:szCs w:val="24"/>
         </w:rPr>
       </w:pPr>
       <w:r>
@@ -4794,8 +4507,8 @@
         <w:rPr>
           <w:spacing w:val="0"/>
           <w:kern w:val="2"/>
-          <w:sz w:val="22"/>
-          <w:szCs w:val="22"/>
+          <w:sz w:val="24"/>
+          <w:szCs w:val="24"/>
         </w:rPr>
         <w:tab/>
       </w:r>
@@ -4809,13 +4522,13 @@
         <w:fldChar w:fldCharType="begin"/>
       </w:r>
       <w:r>
-        <w:instrText xml:space="preserve"> PAGEREF _Toc157413388 \h </w:instrText>
+        <w:instrText xml:space="preserve"> PAGEREF _Toc189498224 \h </w:instrText>
       </w:r>
       <w:r>
         <w:fldChar w:fldCharType="separate"/>
       </w:r>
       <w:r>
-        <w:t>13</w:t>
+        <w:t>14</w:t>
       </w:r>
       <w:r>
         <w:fldChar w:fldCharType="end"/>
@@ -4827,8 +4540,8 @@
         <w:rPr>
           <w:spacing w:val="0"/>
           <w:kern w:val="2"/>
-          <w:sz w:val="22"/>
-          <w:szCs w:val="22"/>
+          <w:sz w:val="24"/>
+          <w:szCs w:val="24"/>
         </w:rPr>
       </w:pPr>
       <w:r>
@@ -4838,8 +4551,8 @@
         <w:rPr>
           <w:spacing w:val="0"/>
           <w:kern w:val="2"/>
-          <w:sz w:val="22"/>
-          <w:szCs w:val="22"/>
+          <w:sz w:val="24"/>
+          <w:szCs w:val="24"/>
         </w:rPr>
         <w:tab/>
       </w:r>
@@ -4853,7 +4566,7 @@
         <w:fldChar w:fldCharType="begin"/>
       </w:r>
       <w:r>
-        <w:instrText xml:space="preserve"> PAGEREF _Toc157413389 \h </w:instrText>
+        <w:instrText xml:space="preserve"> PAGEREF _Toc189498225 \h </w:instrText>
       </w:r>
       <w:r>
         <w:fldChar w:fldCharType="separate"/>
@@ -4874,8 +4587,8 @@
         <w:rPr>
           <w:spacing w:val="0"/>
           <w:kern w:val="2"/>
-          <w:sz w:val="22"/>
-          <w:szCs w:val="22"/>
+          <w:sz w:val="24"/>
+          <w:szCs w:val="24"/>
         </w:rPr>
       </w:pPr>
       <w:r>
@@ -4885,13 +4598,13 @@
         <w:rPr>
           <w:spacing w:val="0"/>
           <w:kern w:val="2"/>
-          <w:sz w:val="22"/>
-          <w:szCs w:val="22"/>
+          <w:sz w:val="24"/>
+          <w:szCs w:val="24"/>
         </w:rPr>
         <w:tab/>
       </w:r>
       <w:r>
-        <w:t>Integr@ 2.2.2_002</w:t>
+        <w:t>Integr@ 2.2.3_001</w:t>
       </w:r>
       <w:r>
         <w:tab/>
@@ -4900,7 +4613,7 @@
         <w:fldChar w:fldCharType="begin"/>
       </w:r>
       <w:r>
-        <w:instrText xml:space="preserve"> PAGEREF _Toc157413390 \h </w:instrText>
+        <w:instrText xml:space="preserve"> PAGEREF _Toc189498226 \h </w:instrText>
       </w:r>
       <w:r>
         <w:fldChar w:fldCharType="separate"/>
@@ -4918,8 +4631,8 @@
         <w:rPr>
           <w:spacing w:val="0"/>
           <w:kern w:val="2"/>
-          <w:sz w:val="22"/>
-          <w:szCs w:val="22"/>
+          <w:sz w:val="24"/>
+          <w:szCs w:val="24"/>
         </w:rPr>
       </w:pPr>
       <w:r>
@@ -4929,8 +4642,8 @@
         <w:rPr>
           <w:spacing w:val="0"/>
           <w:kern w:val="2"/>
-          <w:sz w:val="22"/>
-          <w:szCs w:val="22"/>
+          <w:sz w:val="24"/>
+          <w:szCs w:val="24"/>
         </w:rPr>
         <w:tab/>
       </w:r>
@@ -4944,7 +4657,7 @@
         <w:fldChar w:fldCharType="begin"/>
       </w:r>
       <w:r>
-        <w:instrText xml:space="preserve"> PAGEREF _Toc157413391 \h </w:instrText>
+        <w:instrText xml:space="preserve"> PAGEREF _Toc189498227 \h </w:instrText>
       </w:r>
       <w:r>
         <w:fldChar w:fldCharType="separate"/>
@@ -4962,8 +4675,8 @@
         <w:rPr>
           <w:spacing w:val="0"/>
           <w:kern w:val="2"/>
-          <w:sz w:val="22"/>
-          <w:szCs w:val="22"/>
+          <w:sz w:val="24"/>
+          <w:szCs w:val="24"/>
         </w:rPr>
       </w:pPr>
       <w:r>
@@ -4973,8 +4686,8 @@
         <w:rPr>
           <w:spacing w:val="0"/>
           <w:kern w:val="2"/>
-          <w:sz w:val="22"/>
-          <w:szCs w:val="22"/>
+          <w:sz w:val="24"/>
+          <w:szCs w:val="24"/>
         </w:rPr>
         <w:tab/>
       </w:r>
@@ -4988,13 +4701,13 @@
         <w:fldChar w:fldCharType="begin"/>
       </w:r>
       <w:r>
-        <w:instrText xml:space="preserve"> PAGEREF _Toc157413392 \h </w:instrText>
+        <w:instrText xml:space="preserve"> PAGEREF _Toc189498228 \h </w:instrText>
       </w:r>
       <w:r>
         <w:fldChar w:fldCharType="separate"/>
       </w:r>
       <w:r>
-        <w:t>14</w:t>
+        <w:t>15</w:t>
       </w:r>
       <w:r>
         <w:fldChar w:fldCharType="end"/>
@@ -5009,8 +4722,8 @@
         <w:rPr>
           <w:spacing w:val="0"/>
           <w:kern w:val="2"/>
-          <w:sz w:val="22"/>
-          <w:szCs w:val="22"/>
+          <w:sz w:val="24"/>
+          <w:szCs w:val="24"/>
         </w:rPr>
       </w:pPr>
       <w:r>
@@ -5020,13 +4733,13 @@
         <w:rPr>
           <w:spacing w:val="0"/>
           <w:kern w:val="2"/>
-          <w:sz w:val="22"/>
-          <w:szCs w:val="22"/>
+          <w:sz w:val="24"/>
+          <w:szCs w:val="24"/>
         </w:rPr>
         <w:tab/>
       </w:r>
       <w:r>
-        <w:t>Integr@ 2.2.2_001</w:t>
+        <w:t>Integr@ 2.2.3_000</w:t>
       </w:r>
       <w:r>
         <w:tab/>
@@ -5035,13 +4748,13 @@
         <w:fldChar w:fldCharType="begin"/>
       </w:r>
       <w:r>
-        <w:instrText xml:space="preserve"> PAGEREF _Toc157413393 \h </w:instrText>
+        <w:instrText xml:space="preserve"> PAGEREF _Toc189498229 \h </w:instrText>
       </w:r>
       <w:r>
         <w:fldChar w:fldCharType="separate"/>
       </w:r>
       <w:r>
-        <w:t>14</w:t>
+        <w:t>15</w:t>
       </w:r>
       <w:r>
         <w:fldChar w:fldCharType="end"/>
@@ -5053,8 +4766,8 @@
         <w:rPr>
           <w:spacing w:val="0"/>
           <w:kern w:val="2"/>
-          <w:sz w:val="22"/>
-          <w:szCs w:val="22"/>
+          <w:sz w:val="24"/>
+          <w:szCs w:val="24"/>
         </w:rPr>
       </w:pPr>
       <w:r>
@@ -5064,8 +4777,8 @@
         <w:rPr>
           <w:spacing w:val="0"/>
           <w:kern w:val="2"/>
-          <w:sz w:val="22"/>
-          <w:szCs w:val="22"/>
+          <w:sz w:val="24"/>
+          <w:szCs w:val="24"/>
         </w:rPr>
         <w:tab/>
       </w:r>
@@ -5079,13 +4792,13 @@
         <w:fldChar w:fldCharType="begin"/>
       </w:r>
       <w:r>
-        <w:instrText xml:space="preserve"> PAGEREF _Toc157413394 \h </w:instrText>
+        <w:instrText xml:space="preserve"> PAGEREF _Toc189498230 \h </w:instrText>
       </w:r>
       <w:r>
         <w:fldChar w:fldCharType="separate"/>
       </w:r>
       <w:r>
-        <w:t>14</w:t>
+        <w:t>15</w:t>
       </w:r>
       <w:r>
         <w:fldChar w:fldCharType="end"/>
@@ -5097,8 +4810,8 @@
         <w:rPr>
           <w:spacing w:val="0"/>
           <w:kern w:val="2"/>
-          <w:sz w:val="22"/>
-          <w:szCs w:val="22"/>
+          <w:sz w:val="24"/>
+          <w:szCs w:val="24"/>
         </w:rPr>
       </w:pPr>
       <w:r>
@@ -5108,8 +4821,8 @@
         <w:rPr>
           <w:spacing w:val="0"/>
           <w:kern w:val="2"/>
-          <w:sz w:val="22"/>
-          <w:szCs w:val="22"/>
+          <w:sz w:val="24"/>
+          <w:szCs w:val="24"/>
         </w:rPr>
         <w:tab/>
       </w:r>
@@ -5123,13 +4836,13 @@
         <w:fldChar w:fldCharType="begin"/>
       </w:r>
       <w:r>
-        <w:instrText xml:space="preserve"> PAGEREF _Toc157413395 \h </w:instrText>
+        <w:instrText xml:space="preserve"> PAGEREF _Toc189498231 \h </w:instrText>
       </w:r>
       <w:r>
         <w:fldChar w:fldCharType="separate"/>
       </w:r>
       <w:r>
-        <w:t>14</w:t>
+        <w:t>15</w:t>
       </w:r>
       <w:r>
         <w:fldChar w:fldCharType="end"/>
@@ -5144,8 +4857,8 @@
         <w:rPr>
           <w:spacing w:val="0"/>
           <w:kern w:val="2"/>
-          <w:sz w:val="22"/>
-          <w:szCs w:val="22"/>
+          <w:sz w:val="24"/>
+          <w:szCs w:val="24"/>
         </w:rPr>
       </w:pPr>
       <w:r>
@@ -5155,13 +4868,13 @@
         <w:rPr>
           <w:spacing w:val="0"/>
           <w:kern w:val="2"/>
-          <w:sz w:val="22"/>
-          <w:szCs w:val="22"/>
+          <w:sz w:val="24"/>
+          <w:szCs w:val="24"/>
         </w:rPr>
         <w:tab/>
       </w:r>
       <w:r>
-        <w:t>Integr@ 2.2.2_000</w:t>
+        <w:t>Integr@ 2.2.2_002</w:t>
       </w:r>
       <w:r>
         <w:tab/>
@@ -5170,13 +4883,13 @@
         <w:fldChar w:fldCharType="begin"/>
       </w:r>
       <w:r>
-        <w:instrText xml:space="preserve"> PAGEREF _Toc157413396 \h </w:instrText>
+        <w:instrText xml:space="preserve"> PAGEREF _Toc189498232 \h </w:instrText>
       </w:r>
       <w:r>
         <w:fldChar w:fldCharType="separate"/>
       </w:r>
       <w:r>
-        <w:t>14</w:t>
+        <w:t>15</w:t>
       </w:r>
       <w:r>
         <w:fldChar w:fldCharType="end"/>
@@ -5188,8 +4901,8 @@
         <w:rPr>
           <w:spacing w:val="0"/>
           <w:kern w:val="2"/>
-          <w:sz w:val="22"/>
-          <w:szCs w:val="22"/>
+          <w:sz w:val="24"/>
+          <w:szCs w:val="24"/>
         </w:rPr>
       </w:pPr>
       <w:r>
@@ -5199,8 +4912,8 @@
         <w:rPr>
           <w:spacing w:val="0"/>
           <w:kern w:val="2"/>
-          <w:sz w:val="22"/>
-          <w:szCs w:val="22"/>
+          <w:sz w:val="24"/>
+          <w:szCs w:val="24"/>
         </w:rPr>
         <w:tab/>
       </w:r>
@@ -5214,13 +4927,13 @@
         <w:fldChar w:fldCharType="begin"/>
       </w:r>
       <w:r>
-        <w:instrText xml:space="preserve"> PAGEREF _Toc157413397 \h </w:instrText>
+        <w:instrText xml:space="preserve"> PAGEREF _Toc189498233 \h </w:instrText>
       </w:r>
       <w:r>
         <w:fldChar w:fldCharType="separate"/>
       </w:r>
       <w:r>
-        <w:t>14</w:t>
+        <w:t>15</w:t>
       </w:r>
       <w:r>
         <w:fldChar w:fldCharType="end"/>
@@ -5232,8 +4945,8 @@
         <w:rPr>
           <w:spacing w:val="0"/>
           <w:kern w:val="2"/>
-          <w:sz w:val="22"/>
-          <w:szCs w:val="22"/>
+          <w:sz w:val="24"/>
+          <w:szCs w:val="24"/>
         </w:rPr>
       </w:pPr>
       <w:r>
@@ -5243,8 +4956,8 @@
         <w:rPr>
           <w:spacing w:val="0"/>
           <w:kern w:val="2"/>
-          <w:sz w:val="22"/>
-          <w:szCs w:val="22"/>
+          <w:sz w:val="24"/>
+          <w:szCs w:val="24"/>
         </w:rPr>
         <w:tab/>
       </w:r>
@@ -5258,7 +4971,7 @@
         <w:fldChar w:fldCharType="begin"/>
       </w:r>
       <w:r>
-        <w:instrText xml:space="preserve"> PAGEREF _Toc157413398 \h </w:instrText>
+        <w:instrText xml:space="preserve"> PAGEREF _Toc189498234 \h </w:instrText>
       </w:r>
       <w:r>
         <w:fldChar w:fldCharType="separate"/>
@@ -5279,8 +4992,8 @@
         <w:rPr>
           <w:spacing w:val="0"/>
           <w:kern w:val="2"/>
-          <w:sz w:val="22"/>
-          <w:szCs w:val="22"/>
+          <w:sz w:val="24"/>
+          <w:szCs w:val="24"/>
         </w:rPr>
       </w:pPr>
       <w:r>
@@ -5290,13 +5003,13 @@
         <w:rPr>
           <w:spacing w:val="0"/>
           <w:kern w:val="2"/>
-          <w:sz w:val="22"/>
-          <w:szCs w:val="22"/>
+          <w:sz w:val="24"/>
+          <w:szCs w:val="24"/>
         </w:rPr>
         <w:tab/>
       </w:r>
       <w:r>
-        <w:t>Integr@ 2.2.1_000</w:t>
+        <w:t>Integr@ 2.2.2_001</w:t>
       </w:r>
       <w:r>
         <w:tab/>
@@ -5305,7 +5018,7 @@
         <w:fldChar w:fldCharType="begin"/>
       </w:r>
       <w:r>
-        <w:instrText xml:space="preserve"> PAGEREF _Toc157413399 \h </w:instrText>
+        <w:instrText xml:space="preserve"> PAGEREF _Toc189498235 \h </w:instrText>
       </w:r>
       <w:r>
         <w:fldChar w:fldCharType="separate"/>
@@ -5323,8 +5036,8 @@
         <w:rPr>
           <w:spacing w:val="0"/>
           <w:kern w:val="2"/>
-          <w:sz w:val="22"/>
-          <w:szCs w:val="22"/>
+          <w:sz w:val="24"/>
+          <w:szCs w:val="24"/>
         </w:rPr>
       </w:pPr>
       <w:r>
@@ -5334,8 +5047,8 @@
         <w:rPr>
           <w:spacing w:val="0"/>
           <w:kern w:val="2"/>
-          <w:sz w:val="22"/>
-          <w:szCs w:val="22"/>
+          <w:sz w:val="24"/>
+          <w:szCs w:val="24"/>
         </w:rPr>
         <w:tab/>
       </w:r>
@@ -5349,7 +5062,7 @@
         <w:fldChar w:fldCharType="begin"/>
       </w:r>
       <w:r>
-        <w:instrText xml:space="preserve"> PAGEREF _Toc157413400 \h </w:instrText>
+        <w:instrText xml:space="preserve"> PAGEREF _Toc189498236 \h </w:instrText>
       </w:r>
       <w:r>
         <w:fldChar w:fldCharType="separate"/>
@@ -5367,8 +5080,8 @@
         <w:rPr>
           <w:spacing w:val="0"/>
           <w:kern w:val="2"/>
-          <w:sz w:val="22"/>
-          <w:szCs w:val="22"/>
+          <w:sz w:val="24"/>
+          <w:szCs w:val="24"/>
         </w:rPr>
       </w:pPr>
       <w:r>
@@ -5378,8 +5091,8 @@
         <w:rPr>
           <w:spacing w:val="0"/>
           <w:kern w:val="2"/>
-          <w:sz w:val="22"/>
-          <w:szCs w:val="22"/>
+          <w:sz w:val="24"/>
+          <w:szCs w:val="24"/>
         </w:rPr>
         <w:tab/>
       </w:r>
@@ -5393,13 +5106,283 @@
         <w:fldChar w:fldCharType="begin"/>
       </w:r>
       <w:r>
-        <w:instrText xml:space="preserve"> PAGEREF _Toc157413401 \h </w:instrText>
+        <w:instrText xml:space="preserve"> PAGEREF _Toc189498237 \h </w:instrText>
       </w:r>
       <w:r>
         <w:fldChar w:fldCharType="separate"/>
       </w:r>
       <w:r>
-        <w:t>20</w:t>
+        <w:t>16</w:t>
+      </w:r>
+      <w:r>
+        <w:fldChar w:fldCharType="end"/>
+      </w:r>
+    </w:p>
+    <w:p>
+      <w:pPr>
+        <w:pStyle w:val="TDC2"/>
+        <w:tabs>
+          <w:tab w:val="left" w:pos="1644"/>
+        </w:tabs>
+        <w:rPr>
+          <w:spacing w:val="0"/>
+          <w:kern w:val="2"/>
+          <w:sz w:val="24"/>
+          <w:szCs w:val="24"/>
+        </w:rPr>
+      </w:pPr>
+      <w:r>
+        <w:t>7.8</w:t>
+      </w:r>
+      <w:r>
+        <w:rPr>
+          <w:spacing w:val="0"/>
+          <w:kern w:val="2"/>
+          <w:sz w:val="24"/>
+          <w:szCs w:val="24"/>
+        </w:rPr>
+        <w:tab/>
+      </w:r>
+      <w:r>
+        <w:t>Integr@ 2.2.2_000</w:t>
+      </w:r>
+      <w:r>
+        <w:tab/>
+      </w:r>
+      <w:r>
+        <w:fldChar w:fldCharType="begin"/>
+      </w:r>
+      <w:r>
+        <w:instrText xml:space="preserve"> PAGEREF _Toc189498238 \h </w:instrText>
+      </w:r>
+      <w:r>
+        <w:fldChar w:fldCharType="separate"/>
+      </w:r>
+      <w:r>
+        <w:t>16</w:t>
+      </w:r>
+      <w:r>
+        <w:fldChar w:fldCharType="end"/>
+      </w:r>
+    </w:p>
+    <w:p>
+      <w:pPr>
+        <w:pStyle w:val="TDC3"/>
+        <w:rPr>
+          <w:spacing w:val="0"/>
+          <w:kern w:val="2"/>
+          <w:sz w:val="24"/>
+          <w:szCs w:val="24"/>
+        </w:rPr>
+      </w:pPr>
+      <w:r>
+        <w:t>7.8.1</w:t>
+      </w:r>
+      <w:r>
+        <w:rPr>
+          <w:spacing w:val="0"/>
+          <w:kern w:val="2"/>
+          <w:sz w:val="24"/>
+          <w:szCs w:val="24"/>
+        </w:rPr>
+        <w:tab/>
+      </w:r>
+      <w:r>
+        <w:t>Características</w:t>
+      </w:r>
+      <w:r>
+        <w:tab/>
+      </w:r>
+      <w:r>
+        <w:fldChar w:fldCharType="begin"/>
+      </w:r>
+      <w:r>
+        <w:instrText xml:space="preserve"> PAGEREF _Toc189498239 \h </w:instrText>
+      </w:r>
+      <w:r>
+        <w:fldChar w:fldCharType="separate"/>
+      </w:r>
+      <w:r>
+        <w:t>16</w:t>
+      </w:r>
+      <w:r>
+        <w:fldChar w:fldCharType="end"/>
+      </w:r>
+    </w:p>
+    <w:p>
+      <w:pPr>
+        <w:pStyle w:val="TDC3"/>
+        <w:rPr>
+          <w:spacing w:val="0"/>
+          <w:kern w:val="2"/>
+          <w:sz w:val="24"/>
+          <w:szCs w:val="24"/>
+        </w:rPr>
+      </w:pPr>
+      <w:r>
+        <w:t>7.8.2</w:t>
+      </w:r>
+      <w:r>
+        <w:rPr>
+          <w:spacing w:val="0"/>
+          <w:kern w:val="2"/>
+          <w:sz w:val="24"/>
+          <w:szCs w:val="24"/>
+        </w:rPr>
+        <w:tab/>
+      </w:r>
+      <w:r>
+        <w:t>Errores Resueltos</w:t>
+      </w:r>
+      <w:r>
+        <w:tab/>
+      </w:r>
+      <w:r>
+        <w:fldChar w:fldCharType="begin"/>
+      </w:r>
+      <w:r>
+        <w:instrText xml:space="preserve"> PAGEREF _Toc189498240 \h </w:instrText>
+      </w:r>
+      <w:r>
+        <w:fldChar w:fldCharType="separate"/>
+      </w:r>
+      <w:r>
+        <w:t>16</w:t>
+      </w:r>
+      <w:r>
+        <w:fldChar w:fldCharType="end"/>
+      </w:r>
+    </w:p>
+    <w:p>
+      <w:pPr>
+        <w:pStyle w:val="TDC2"/>
+        <w:tabs>
+          <w:tab w:val="left" w:pos="1644"/>
+        </w:tabs>
+        <w:rPr>
+          <w:spacing w:val="0"/>
+          <w:kern w:val="2"/>
+          <w:sz w:val="24"/>
+          <w:szCs w:val="24"/>
+        </w:rPr>
+      </w:pPr>
+      <w:r>
+        <w:t>7.9</w:t>
+      </w:r>
+      <w:r>
+        <w:rPr>
+          <w:spacing w:val="0"/>
+          <w:kern w:val="2"/>
+          <w:sz w:val="24"/>
+          <w:szCs w:val="24"/>
+        </w:rPr>
+        <w:tab/>
+      </w:r>
+      <w:r>
+        <w:t>Integr@ 2.2.1_000</w:t>
+      </w:r>
+      <w:r>
+        <w:tab/>
+      </w:r>
+      <w:r>
+        <w:fldChar w:fldCharType="begin"/>
+      </w:r>
+      <w:r>
+        <w:instrText xml:space="preserve"> PAGEREF _Toc189498241 \h </w:instrText>
+      </w:r>
+      <w:r>
+        <w:fldChar w:fldCharType="separate"/>
+      </w:r>
+      <w:r>
+        <w:t>17</w:t>
+      </w:r>
+      <w:r>
+        <w:fldChar w:fldCharType="end"/>
+      </w:r>
+    </w:p>
+    <w:p>
+      <w:pPr>
+        <w:pStyle w:val="TDC3"/>
+        <w:rPr>
+          <w:spacing w:val="0"/>
+          <w:kern w:val="2"/>
+          <w:sz w:val="24"/>
+          <w:szCs w:val="24"/>
+        </w:rPr>
+      </w:pPr>
+      <w:r>
+        <w:t>7.9.1</w:t>
+      </w:r>
+      <w:r>
+        <w:rPr>
+          <w:spacing w:val="0"/>
+          <w:kern w:val="2"/>
+          <w:sz w:val="24"/>
+          <w:szCs w:val="24"/>
+        </w:rPr>
+        <w:tab/>
+      </w:r>
+      <w:r>
+        <w:t>Características</w:t>
+      </w:r>
+      <w:r>
+        <w:tab/>
+      </w:r>
+      <w:r>
+        <w:fldChar w:fldCharType="begin"/>
+      </w:r>
+      <w:r>
+        <w:instrText xml:space="preserve"> PAGEREF _Toc189498242 \h </w:instrText>
+      </w:r>
+      <w:r>
+        <w:fldChar w:fldCharType="separate"/>
+      </w:r>
+      <w:r>
+        <w:t>17</w:t>
+      </w:r>
+      <w:r>
+        <w:fldChar w:fldCharType="end"/>
+      </w:r>
+    </w:p>
+    <w:p>
+      <w:pPr>
+        <w:pStyle w:val="TDC3"/>
+        <w:rPr>
+          <w:spacing w:val="0"/>
+          <w:kern w:val="2"/>
+          <w:sz w:val="24"/>
+          <w:szCs w:val="24"/>
+        </w:rPr>
+      </w:pPr>
+      <w:r>
+        <w:t>7.9.2</w:t>
+      </w:r>
+      <w:r>
+        <w:rPr>
+          <w:spacing w:val="0"/>
+          <w:kern w:val="2"/>
+          <w:sz w:val="24"/>
+          <w:szCs w:val="24"/>
+        </w:rPr>
+        <w:tab/>
+      </w:r>
+      <w:r>
+        <w:t>Errores Resueltos</w:t>
+      </w:r>
+      <w:r>
+        <w:tab/>
+      </w:r>
+      <w:r>
+        <w:fldChar w:fldCharType="begin"/>
+      </w:r>
+      <w:r>
+        <w:instrText xml:space="preserve"> PAGEREF _Toc189498243 \h </w:instrText>
+      </w:r>
+      <w:r>
+        <w:fldChar w:fldCharType="separate"/>
+      </w:r>
+      <w:r>
+        <w:t>22</w:t>
       </w:r>
       <w:r>
         <w:fldChar w:fldCharType="end"/>
@@ -5451,7 +5434,7 @@
         <w:br w:type="page"/>
       </w:r>
       <w:bookmarkStart w:id="17" w:name="_Toc116024915"/>
-      <w:bookmarkStart w:id="18" w:name="_Toc157413374"/>
+      <w:bookmarkStart w:id="18" w:name="_Toc189498211"/>
       <w:r>
         <w:lastRenderedPageBreak/>
         <w:t>Objeto</w:t>
@@ -5475,7 +5458,7 @@
         <w:br w:type="page"/>
       </w:r>
       <w:bookmarkStart w:id="19" w:name="_Toc116024916"/>
-      <w:bookmarkStart w:id="20" w:name="_Toc157413375"/>
+      <w:bookmarkStart w:id="20" w:name="_Toc189498212"/>
       <w:r>
         <w:lastRenderedPageBreak/>
         <w:t>Alcance</w:t>
@@ -5572,7 +5555,7 @@
         <w:pStyle w:val="Ttulo1"/>
       </w:pPr>
       <w:bookmarkStart w:id="25" w:name="_Toc116024917"/>
-      <w:bookmarkStart w:id="26" w:name="_Toc157413376"/>
+      <w:bookmarkStart w:id="26" w:name="_Toc189498213"/>
       <w:r>
         <w:lastRenderedPageBreak/>
         <w:t>Siglas</w:t>
@@ -5605,12 +5588,6 @@
         <w:gridCol w:w="7863"/>
       </w:tblGrid>
       <w:tr>
-        <w:tblPrEx>
-          <w:tblCellMar>
-            <w:top w:w="0" w:type="dxa"/>
-            <w:bottom w:w="0" w:type="dxa"/>
-          </w:tblCellMar>
-        </w:tblPrEx>
         <w:tc>
           <w:tcPr>
             <w:tcW w:w="1913" w:type="dxa"/>
@@ -5668,12 +5645,6 @@
         </w:tc>
       </w:tr>
       <w:tr>
-        <w:tblPrEx>
-          <w:tblCellMar>
-            <w:top w:w="0" w:type="dxa"/>
-            <w:bottom w:w="0" w:type="dxa"/>
-          </w:tblCellMar>
-        </w:tblPrEx>
         <w:tc>
           <w:tcPr>
             <w:tcW w:w="1913" w:type="dxa"/>
@@ -5728,12 +5699,6 @@
         </w:tc>
       </w:tr>
       <w:tr>
-        <w:tblPrEx>
-          <w:tblCellMar>
-            <w:top w:w="0" w:type="dxa"/>
-            <w:bottom w:w="0" w:type="dxa"/>
-          </w:tblCellMar>
-        </w:tblPrEx>
         <w:tc>
           <w:tcPr>
             <w:tcW w:w="1913" w:type="dxa"/>
@@ -5788,12 +5753,6 @@
         </w:tc>
       </w:tr>
       <w:tr>
-        <w:tblPrEx>
-          <w:tblCellMar>
-            <w:top w:w="0" w:type="dxa"/>
-            <w:bottom w:w="0" w:type="dxa"/>
-          </w:tblCellMar>
-        </w:tblPrEx>
         <w:tc>
           <w:tcPr>
             <w:tcW w:w="1913" w:type="dxa"/>
@@ -5848,12 +5807,6 @@
         </w:tc>
       </w:tr>
       <w:tr>
-        <w:tblPrEx>
-          <w:tblCellMar>
-            <w:top w:w="0" w:type="dxa"/>
-            <w:bottom w:w="0" w:type="dxa"/>
-          </w:tblCellMar>
-        </w:tblPrEx>
         <w:tc>
           <w:tcPr>
             <w:tcW w:w="1913" w:type="dxa"/>
@@ -5908,12 +5861,6 @@
         </w:tc>
       </w:tr>
       <w:tr>
-        <w:tblPrEx>
-          <w:tblCellMar>
-            <w:top w:w="0" w:type="dxa"/>
-            <w:bottom w:w="0" w:type="dxa"/>
-          </w:tblCellMar>
-        </w:tblPrEx>
         <w:tc>
           <w:tcPr>
             <w:tcW w:w="1913" w:type="dxa"/>
@@ -5968,12 +5915,6 @@
         </w:tc>
       </w:tr>
       <w:tr>
-        <w:tblPrEx>
-          <w:tblCellMar>
-            <w:top w:w="0" w:type="dxa"/>
-            <w:bottom w:w="0" w:type="dxa"/>
-          </w:tblCellMar>
-        </w:tblPrEx>
         <w:tc>
           <w:tcPr>
             <w:tcW w:w="1913" w:type="dxa"/>
@@ -6028,12 +5969,6 @@
         </w:tc>
       </w:tr>
       <w:tr>
-        <w:tblPrEx>
-          <w:tblCellMar>
-            <w:top w:w="0" w:type="dxa"/>
-            <w:bottom w:w="0" w:type="dxa"/>
-          </w:tblCellMar>
-        </w:tblPrEx>
         <w:tc>
           <w:tcPr>
             <w:tcW w:w="1913" w:type="dxa"/>
@@ -6088,12 +6023,6 @@
         </w:tc>
       </w:tr>
       <w:tr>
-        <w:tblPrEx>
-          <w:tblCellMar>
-            <w:top w:w="0" w:type="dxa"/>
-            <w:bottom w:w="0" w:type="dxa"/>
-          </w:tblCellMar>
-        </w:tblPrEx>
         <w:tc>
           <w:tcPr>
             <w:tcW w:w="1913" w:type="dxa"/>
@@ -6148,12 +6077,6 @@
         </w:tc>
       </w:tr>
       <w:tr>
-        <w:tblPrEx>
-          <w:tblCellMar>
-            <w:top w:w="0" w:type="dxa"/>
-            <w:bottom w:w="0" w:type="dxa"/>
-          </w:tblCellMar>
-        </w:tblPrEx>
         <w:tc>
           <w:tcPr>
             <w:tcW w:w="1913" w:type="dxa"/>
@@ -6208,12 +6131,6 @@
         </w:tc>
       </w:tr>
       <w:tr>
-        <w:tblPrEx>
-          <w:tblCellMar>
-            <w:top w:w="0" w:type="dxa"/>
-            <w:bottom w:w="0" w:type="dxa"/>
-          </w:tblCellMar>
-        </w:tblPrEx>
         <w:tc>
           <w:tcPr>
             <w:tcW w:w="1913" w:type="dxa"/>
@@ -6268,12 +6185,6 @@
         </w:tc>
       </w:tr>
       <w:tr>
-        <w:tblPrEx>
-          <w:tblCellMar>
-            <w:top w:w="0" w:type="dxa"/>
-            <w:bottom w:w="0" w:type="dxa"/>
-          </w:tblCellMar>
-        </w:tblPrEx>
         <w:tc>
           <w:tcPr>
             <w:tcW w:w="1913" w:type="dxa"/>
@@ -6324,12 +6235,6 @@
         </w:tc>
       </w:tr>
       <w:tr>
-        <w:tblPrEx>
-          <w:tblCellMar>
-            <w:top w:w="0" w:type="dxa"/>
-            <w:bottom w:w="0" w:type="dxa"/>
-          </w:tblCellMar>
-        </w:tblPrEx>
         <w:tc>
           <w:tcPr>
             <w:tcW w:w="1913" w:type="dxa"/>
@@ -6376,12 +6281,6 @@
         </w:tc>
       </w:tr>
       <w:tr>
-        <w:tblPrEx>
-          <w:tblCellMar>
-            <w:top w:w="0" w:type="dxa"/>
-            <w:bottom w:w="0" w:type="dxa"/>
-          </w:tblCellMar>
-        </w:tblPrEx>
         <w:tc>
           <w:tcPr>
             <w:tcW w:w="1913" w:type="dxa"/>
@@ -6434,12 +6333,6 @@
         </w:tc>
       </w:tr>
       <w:tr>
-        <w:tblPrEx>
-          <w:tblCellMar>
-            <w:top w:w="0" w:type="dxa"/>
-            <w:bottom w:w="0" w:type="dxa"/>
-          </w:tblCellMar>
-        </w:tblPrEx>
         <w:tc>
           <w:tcPr>
             <w:tcW w:w="1913" w:type="dxa"/>
@@ -6494,12 +6387,6 @@
         </w:tc>
       </w:tr>
       <w:tr>
-        <w:tblPrEx>
-          <w:tblCellMar>
-            <w:top w:w="0" w:type="dxa"/>
-            <w:bottom w:w="0" w:type="dxa"/>
-          </w:tblCellMar>
-        </w:tblPrEx>
         <w:tc>
           <w:tcPr>
             <w:tcW w:w="1913" w:type="dxa"/>
@@ -6554,12 +6441,6 @@
         </w:tc>
       </w:tr>
       <w:tr>
-        <w:tblPrEx>
-          <w:tblCellMar>
-            <w:top w:w="0" w:type="dxa"/>
-            <w:bottom w:w="0" w:type="dxa"/>
-          </w:tblCellMar>
-        </w:tblPrEx>
         <w:tc>
           <w:tcPr>
             <w:tcW w:w="1913" w:type="dxa"/>
@@ -6614,12 +6495,6 @@
         </w:tc>
       </w:tr>
       <w:tr>
-        <w:tblPrEx>
-          <w:tblCellMar>
-            <w:top w:w="0" w:type="dxa"/>
-            <w:bottom w:w="0" w:type="dxa"/>
-          </w:tblCellMar>
-        </w:tblPrEx>
         <w:tc>
           <w:tcPr>
             <w:tcW w:w="1913" w:type="dxa"/>
@@ -6674,12 +6549,6 @@
         </w:tc>
       </w:tr>
       <w:tr>
-        <w:tblPrEx>
-          <w:tblCellMar>
-            <w:top w:w="0" w:type="dxa"/>
-            <w:bottom w:w="0" w:type="dxa"/>
-          </w:tblCellMar>
-        </w:tblPrEx>
         <w:tc>
           <w:tcPr>
             <w:tcW w:w="1913" w:type="dxa"/>
@@ -6734,12 +6603,6 @@
         </w:tc>
       </w:tr>
       <w:tr>
-        <w:tblPrEx>
-          <w:tblCellMar>
-            <w:top w:w="0" w:type="dxa"/>
-            <w:bottom w:w="0" w:type="dxa"/>
-          </w:tblCellMar>
-        </w:tblPrEx>
         <w:tc>
           <w:tcPr>
             <w:tcW w:w="1913" w:type="dxa"/>
@@ -6794,12 +6657,6 @@
         </w:tc>
       </w:tr>
       <w:tr>
-        <w:tblPrEx>
-          <w:tblCellMar>
-            <w:top w:w="0" w:type="dxa"/>
-            <w:bottom w:w="0" w:type="dxa"/>
-          </w:tblCellMar>
-        </w:tblPrEx>
         <w:tc>
           <w:tcPr>
             <w:tcW w:w="1913" w:type="dxa"/>
@@ -6854,12 +6711,6 @@
         </w:tc>
       </w:tr>
       <w:tr>
-        <w:tblPrEx>
-          <w:tblCellMar>
-            <w:top w:w="0" w:type="dxa"/>
-            <w:bottom w:w="0" w:type="dxa"/>
-          </w:tblCellMar>
-        </w:tblPrEx>
         <w:tc>
           <w:tcPr>
             <w:tcW w:w="1913" w:type="dxa"/>
@@ -6914,12 +6765,6 @@
         </w:tc>
       </w:tr>
       <w:tr>
-        <w:tblPrEx>
-          <w:tblCellMar>
-            <w:top w:w="0" w:type="dxa"/>
-            <w:bottom w:w="0" w:type="dxa"/>
-          </w:tblCellMar>
-        </w:tblPrEx>
         <w:tc>
           <w:tcPr>
             <w:tcW w:w="1913" w:type="dxa"/>
@@ -6974,12 +6819,6 @@
         </w:tc>
       </w:tr>
       <w:tr>
-        <w:tblPrEx>
-          <w:tblCellMar>
-            <w:top w:w="0" w:type="dxa"/>
-            <w:bottom w:w="0" w:type="dxa"/>
-          </w:tblCellMar>
-        </w:tblPrEx>
         <w:tc>
           <w:tcPr>
             <w:tcW w:w="1913" w:type="dxa"/>
@@ -7034,12 +6873,6 @@
         </w:tc>
       </w:tr>
       <w:tr>
-        <w:tblPrEx>
-          <w:tblCellMar>
-            <w:top w:w="0" w:type="dxa"/>
-            <w:bottom w:w="0" w:type="dxa"/>
-          </w:tblCellMar>
-        </w:tblPrEx>
         <w:tc>
           <w:tcPr>
             <w:tcW w:w="1913" w:type="dxa"/>
@@ -7086,12 +6919,6 @@
         </w:tc>
       </w:tr>
       <w:tr>
-        <w:tblPrEx>
-          <w:tblCellMar>
-            <w:top w:w="0" w:type="dxa"/>
-            <w:bottom w:w="0" w:type="dxa"/>
-          </w:tblCellMar>
-        </w:tblPrEx>
         <w:tc>
           <w:tcPr>
             <w:tcW w:w="1913" w:type="dxa"/>
@@ -7146,12 +6973,6 @@
         </w:tc>
       </w:tr>
       <w:tr>
-        <w:tblPrEx>
-          <w:tblCellMar>
-            <w:top w:w="0" w:type="dxa"/>
-            <w:bottom w:w="0" w:type="dxa"/>
-          </w:tblCellMar>
-        </w:tblPrEx>
         <w:tc>
           <w:tcPr>
             <w:tcW w:w="1913" w:type="dxa"/>
@@ -7206,12 +7027,6 @@
         </w:tc>
       </w:tr>
       <w:tr>
-        <w:tblPrEx>
-          <w:tblCellMar>
-            <w:top w:w="0" w:type="dxa"/>
-            <w:bottom w:w="0" w:type="dxa"/>
-          </w:tblCellMar>
-        </w:tblPrEx>
         <w:tc>
           <w:tcPr>
             <w:tcW w:w="1913" w:type="dxa"/>
@@ -7266,12 +7081,6 @@
         </w:tc>
       </w:tr>
       <w:tr>
-        <w:tblPrEx>
-          <w:tblCellMar>
-            <w:top w:w="0" w:type="dxa"/>
-            <w:bottom w:w="0" w:type="dxa"/>
-          </w:tblCellMar>
-        </w:tblPrEx>
         <w:tc>
           <w:tcPr>
             <w:tcW w:w="1913" w:type="dxa"/>
@@ -7326,12 +7135,6 @@
         </w:tc>
       </w:tr>
       <w:tr>
-        <w:tblPrEx>
-          <w:tblCellMar>
-            <w:top w:w="0" w:type="dxa"/>
-            <w:bottom w:w="0" w:type="dxa"/>
-          </w:tblCellMar>
-        </w:tblPrEx>
         <w:tc>
           <w:tcPr>
             <w:tcW w:w="1913" w:type="dxa"/>
@@ -7386,12 +7189,6 @@
         </w:tc>
       </w:tr>
       <w:tr>
-        <w:tblPrEx>
-          <w:tblCellMar>
-            <w:top w:w="0" w:type="dxa"/>
-            <w:bottom w:w="0" w:type="dxa"/>
-          </w:tblCellMar>
-        </w:tblPrEx>
         <w:tc>
           <w:tcPr>
             <w:tcW w:w="1913" w:type="dxa"/>
@@ -7446,12 +7243,6 @@
         </w:tc>
       </w:tr>
       <w:tr>
-        <w:tblPrEx>
-          <w:tblCellMar>
-            <w:top w:w="0" w:type="dxa"/>
-            <w:bottom w:w="0" w:type="dxa"/>
-          </w:tblCellMar>
-        </w:tblPrEx>
         <w:tc>
           <w:tcPr>
             <w:tcW w:w="1913" w:type="dxa"/>
@@ -7515,12 +7306,6 @@
         </w:tc>
       </w:tr>
       <w:tr>
-        <w:tblPrEx>
-          <w:tblCellMar>
-            <w:top w:w="0" w:type="dxa"/>
-            <w:bottom w:w="0" w:type="dxa"/>
-          </w:tblCellMar>
-        </w:tblPrEx>
         <w:tc>
           <w:tcPr>
             <w:tcW w:w="1913" w:type="dxa"/>
@@ -7576,7 +7361,7 @@
         <w:pStyle w:val="Ttulo1"/>
       </w:pPr>
       <w:bookmarkStart w:id="30" w:name="_Toc116024918"/>
-      <w:bookmarkStart w:id="31" w:name="_Toc157413377"/>
+      <w:bookmarkStart w:id="31" w:name="_Toc189498214"/>
       <w:r>
         <w:lastRenderedPageBreak/>
         <w:t>Glosario de T</w:t>
@@ -7614,12 +7399,6 @@
         <w:gridCol w:w="7863"/>
       </w:tblGrid>
       <w:tr>
-        <w:tblPrEx>
-          <w:tblCellMar>
-            <w:top w:w="0" w:type="dxa"/>
-            <w:bottom w:w="0" w:type="dxa"/>
-          </w:tblCellMar>
-        </w:tblPrEx>
         <w:tc>
           <w:tcPr>
             <w:tcW w:w="1913" w:type="dxa"/>
@@ -7666,12 +7445,6 @@
         </w:tc>
       </w:tr>
       <w:tr>
-        <w:tblPrEx>
-          <w:tblCellMar>
-            <w:top w:w="0" w:type="dxa"/>
-            <w:bottom w:w="0" w:type="dxa"/>
-          </w:tblCellMar>
-        </w:tblPrEx>
         <w:tc>
           <w:tcPr>
             <w:tcW w:w="1913" w:type="dxa"/>
@@ -7738,7 +7511,7 @@
       </w:pPr>
       <w:bookmarkStart w:id="35" w:name="_Referencias"/>
       <w:bookmarkStart w:id="36" w:name="_Toc116024919"/>
-      <w:bookmarkStart w:id="37" w:name="_Toc157413378"/>
+      <w:bookmarkStart w:id="37" w:name="_Toc189498215"/>
       <w:bookmarkEnd w:id="32"/>
       <w:bookmarkEnd w:id="33"/>
       <w:bookmarkEnd w:id="34"/>
@@ -7790,7 +7563,7 @@
         <w:pStyle w:val="Ttulo1"/>
       </w:pPr>
       <w:bookmarkStart w:id="41" w:name="_Toc116024920"/>
-      <w:bookmarkStart w:id="42" w:name="_Toc157413379"/>
+      <w:bookmarkStart w:id="42" w:name="_Toc189498216"/>
       <w:bookmarkEnd w:id="38"/>
       <w:bookmarkEnd w:id="39"/>
       <w:bookmarkEnd w:id="40"/>
@@ -7804,9 +7577,6 @@
     <w:p>
       <w:pPr>
         <w:jc w:val="left"/>
-        <w:rPr>
-          <w:lang w:val="es-ES_tradnl"/>
-        </w:rPr>
         <w:sectPr>
           <w:pgSz w:w="11906" w:h="16838" w:code="9"/>
           <w:pgMar w:top="1559" w:right="851" w:bottom="1418" w:left="1418" w:header="851" w:footer="851" w:gutter="0"/>
@@ -7815,75 +7585,39 @@
         </w:sectPr>
       </w:pPr>
       <w:r>
-        <w:rPr>
-          <w:lang w:val="es-ES_tradnl"/>
-        </w:rPr>
         <w:t>El presente documento recoge la lista de cambios y novedades que se han producido desde la versión</w:t>
       </w:r>
       <w:r>
-        <w:rPr>
-          <w:lang w:val="es-ES_tradnl"/>
-        </w:rPr>
         <w:t xml:space="preserve"> </w:t>
       </w:r>
       <w:r>
-        <w:rPr>
-          <w:lang w:val="es-ES_tradnl"/>
-        </w:rPr>
         <w:t>1.2.0_002 de In</w:t>
       </w:r>
       <w:r>
-        <w:rPr>
-          <w:lang w:val="es-ES_tradnl"/>
-        </w:rPr>
         <w:t xml:space="preserve">tegr@ hasta la versión </w:t>
       </w:r>
       <w:r>
-        <w:rPr>
-          <w:lang w:val="es-ES_tradnl"/>
-        </w:rPr>
         <w:t>2</w:t>
       </w:r>
       <w:r>
-        <w:rPr>
-          <w:lang w:val="es-ES_tradnl"/>
-        </w:rPr>
         <w:t>.</w:t>
       </w:r>
       <w:r>
-        <w:rPr>
-          <w:lang w:val="es-ES_tradnl"/>
-        </w:rPr>
         <w:t>2</w:t>
       </w:r>
       <w:r>
-        <w:rPr>
-          <w:lang w:val="es-ES_tradnl"/>
-        </w:rPr>
         <w:t>.</w:t>
       </w:r>
       <w:r>
-        <w:rPr>
-          <w:lang w:val="es-ES_tradnl"/>
-        </w:rPr>
         <w:t>4</w:t>
       </w:r>
       <w:r>
-        <w:rPr>
-          <w:lang w:val="es-ES_tradnl"/>
-        </w:rPr>
         <w:t>_00</w:t>
       </w:r>
       <w:r>
-        <w:rPr>
-          <w:lang w:val="es-ES_tradnl"/>
-        </w:rPr>
-        <w:t>0</w:t>
-      </w:r>
-      <w:r>
-        <w:rPr>
-          <w:lang w:val="es-ES_tradnl"/>
-        </w:rPr>
+        <w:t>1</w:t>
+      </w:r>
+      <w:r>
         <w:t>.</w:t>
       </w:r>
     </w:p>
@@ -7893,7 +7627,7 @@
       </w:pPr>
       <w:bookmarkStart w:id="43" w:name="_Requisitos_Software"/>
       <w:bookmarkStart w:id="44" w:name="_Toc116024921"/>
-      <w:bookmarkStart w:id="45" w:name="_Toc157413380"/>
+      <w:bookmarkStart w:id="45" w:name="_Toc189498217"/>
       <w:bookmarkEnd w:id="43"/>
       <w:r>
         <w:lastRenderedPageBreak/>
@@ -7910,10 +7644,11 @@
         </w:rPr>
       </w:pPr>
       <w:bookmarkStart w:id="46" w:name="_Toc116024922"/>
-      <w:bookmarkStart w:id="47" w:name="_Toc157413381"/>
+      <w:bookmarkStart w:id="47" w:name="_Toc189498218"/>
       <w:proofErr w:type="spellStart"/>
       <w:r>
         <w:rPr>
+          <w:highlight w:val="yellow"/>
           <w:lang w:val="es-ES"/>
         </w:rPr>
         <w:t>Integr</w:t>
@@ -7921,35 +7656,46 @@
       <w:proofErr w:type="spellEnd"/>
       <w:r>
         <w:rPr>
+          <w:highlight w:val="yellow"/>
           <w:lang w:val="es-ES"/>
         </w:rPr>
-        <w:t>@ 2.2.</w:t>
-      </w:r>
-      <w:r>
-        <w:rPr>
+        <w:t>@ 2.</w:t>
+      </w:r>
+      <w:r>
+        <w:rPr>
+          <w:highlight w:val="yellow"/>
           <w:lang w:val="es-ES"/>
         </w:rPr>
-        <w:t>4</w:t>
-      </w:r>
-      <w:r>
-        <w:rPr>
+        <w:t>3</w:t>
+      </w:r>
+      <w:r>
+        <w:rPr>
+          <w:highlight w:val="yellow"/>
           <w:lang w:val="es-ES"/>
         </w:rPr>
-        <w:t>_00</w:t>
-      </w:r>
-      <w:r>
-        <w:rPr>
+        <w:t>.</w:t>
+      </w:r>
+      <w:r>
+        <w:rPr>
+          <w:highlight w:val="yellow"/>
           <w:lang w:val="es-ES"/>
         </w:rPr>
         <w:t>0</w:t>
       </w:r>
+      <w:r>
+        <w:rPr>
+          <w:highlight w:val="yellow"/>
+          <w:lang w:val="es-ES"/>
+        </w:rPr>
+        <w:t>_000</w:t>
+      </w:r>
       <w:bookmarkEnd w:id="47"/>
     </w:p>
     <w:p>
       <w:pPr>
         <w:pStyle w:val="Ttulo3"/>
       </w:pPr>
-      <w:bookmarkStart w:id="48" w:name="_Toc157413382"/>
+      <w:bookmarkStart w:id="48" w:name="_Toc189498219"/>
       <w:r>
         <w:t>Características</w:t>
       </w:r>
@@ -7963,7 +7709,7 @@
         </w:numPr>
       </w:pPr>
       <w:r>
-        <w:t>Actualización de dependencias.</w:t>
+        <w:t>Se agrega la compatibilidad con certificado de curva elíptica.</w:t>
       </w:r>
     </w:p>
     <w:p>
@@ -7972,20 +7718,17 @@
           <w:ilvl w:val="0"/>
           <w:numId w:val="42"/>
         </w:numPr>
-      </w:pPr>
-      <w:r>
-        <w:t>Nuevas comprobaciones de seguridad.</w:t>
-      </w:r>
-    </w:p>
-    <w:p>
-      <w:pPr>
-        <w:pStyle w:val="Ttulo3"/>
-      </w:pPr>
-      <w:bookmarkStart w:id="49" w:name="_Toc157413383"/>
-      <w:r>
-        <w:t>Errores Resueltos</w:t>
-      </w:r>
-      <w:bookmarkEnd w:id="49"/>
+        <w:spacing w:line="259" w:lineRule="auto"/>
+        <w:rPr>
+          <w:szCs w:val="24"/>
+        </w:rPr>
+      </w:pPr>
+      <w:r>
+        <w:rPr>
+          <w:szCs w:val="24"/>
+        </w:rPr>
+        <w:t>Actualización de dependencias.</w:t>
+      </w:r>
     </w:p>
     <w:p>
       <w:pPr>
@@ -7993,27 +7736,83 @@
           <w:ilvl w:val="0"/>
           <w:numId w:val="42"/>
         </w:numPr>
-      </w:pPr>
-      <w:r>
-        <w:t xml:space="preserve">Se corrige </w:t>
-      </w:r>
-      <w:r>
-        <w:t xml:space="preserve">el error del </w:t>
+        <w:spacing w:line="259" w:lineRule="auto"/>
+        <w:rPr>
+          <w:szCs w:val="24"/>
+        </w:rPr>
+      </w:pPr>
+      <w:r>
+        <w:rPr>
+          <w:szCs w:val="24"/>
+        </w:rPr>
+        <w:t xml:space="preserve">Compilación con </w:t>
       </w:r>
       <w:proofErr w:type="spellStart"/>
       <w:r>
-        <w:t>WebService</w:t>
+        <w:rPr>
+          <w:szCs w:val="24"/>
+        </w:rPr>
+        <w:t>jdk</w:t>
       </w:r>
       <w:proofErr w:type="spellEnd"/>
       <w:r>
-        <w:t xml:space="preserve"> por el que </w:t>
-      </w:r>
-      <w:r>
-        <w:t>se extendía sin límite el tamaño de la caché con los resultados de validación</w:t>
-      </w:r>
-      <w:r>
-        <w:t>.</w:t>
-      </w:r>
+        <w:rPr>
+          <w:szCs w:val="24"/>
+        </w:rPr>
+        <w:t xml:space="preserve"> 11</w:t>
+      </w:r>
+    </w:p>
+    <w:p>
+      <w:pPr>
+        <w:pStyle w:val="Ttulo2"/>
+        <w:rPr>
+          <w:lang w:val="es-ES"/>
+        </w:rPr>
+      </w:pPr>
+      <w:bookmarkStart w:id="49" w:name="_Toc189498220"/>
+      <w:proofErr w:type="spellStart"/>
+      <w:r>
+        <w:rPr>
+          <w:lang w:val="es-ES"/>
+        </w:rPr>
+        <w:t>Integr</w:t>
+      </w:r>
+      <w:proofErr w:type="spellEnd"/>
+      <w:r>
+        <w:rPr>
+          <w:lang w:val="es-ES"/>
+        </w:rPr>
+        <w:t>@ 2.2.</w:t>
+      </w:r>
+      <w:r>
+        <w:rPr>
+          <w:lang w:val="es-ES"/>
+        </w:rPr>
+        <w:t>4</w:t>
+      </w:r>
+      <w:r>
+        <w:rPr>
+          <w:lang w:val="es-ES"/>
+        </w:rPr>
+        <w:t>_00</w:t>
+      </w:r>
+      <w:r>
+        <w:rPr>
+          <w:lang w:val="es-ES"/>
+        </w:rPr>
+        <w:t>1</w:t>
+      </w:r>
+      <w:bookmarkEnd w:id="49"/>
+    </w:p>
+    <w:p>
+      <w:pPr>
+        <w:pStyle w:val="Ttulo3"/>
+      </w:pPr>
+      <w:bookmarkStart w:id="50" w:name="_Toc189498221"/>
+      <w:r>
+        <w:t>Características</w:t>
+      </w:r>
+      <w:bookmarkEnd w:id="50"/>
     </w:p>
     <w:p>
       <w:pPr>
@@ -8023,51 +7822,14 @@
         </w:numPr>
       </w:pPr>
       <w:r>
-        <w:t>Ya se liberan las conexiones con Axis2.</w:t>
-      </w:r>
-    </w:p>
-    <w:p>
-      <w:pPr>
-        <w:pStyle w:val="Ttulo2"/>
-        <w:rPr>
-          <w:lang w:val="es-ES"/>
-        </w:rPr>
-      </w:pPr>
-      <w:bookmarkStart w:id="50" w:name="_Toc157413384"/>
-      <w:proofErr w:type="spellStart"/>
-      <w:r>
-        <w:rPr>
-          <w:lang w:val="es-ES"/>
-        </w:rPr>
-        <w:t>Integr</w:t>
-      </w:r>
-      <w:proofErr w:type="spellEnd"/>
-      <w:r>
-        <w:rPr>
-          <w:lang w:val="es-ES"/>
-        </w:rPr>
-        <w:t>@ 2.2.3_00</w:t>
-      </w:r>
-      <w:r>
-        <w:rPr>
-          <w:lang w:val="es-ES"/>
-        </w:rPr>
-        <w:t>1</w:t>
-      </w:r>
-      <w:bookmarkEnd w:id="46"/>
-      <w:bookmarkEnd w:id="50"/>
-    </w:p>
-    <w:p>
-      <w:pPr>
-        <w:pStyle w:val="Ttulo3"/>
-      </w:pPr>
-      <w:bookmarkStart w:id="51" w:name="_Toc116024923"/>
-      <w:bookmarkStart w:id="52" w:name="_Toc157413385"/>
-      <w:r>
-        <w:t>Características</w:t>
-      </w:r>
-      <w:bookmarkEnd w:id="51"/>
-      <w:bookmarkEnd w:id="52"/>
+        <w:t xml:space="preserve">Se actualiza la versión de iText para soportar documentos PDF cifrados con AES-256 y </w:t>
+      </w:r>
+      <w:r>
+        <w:t>corregir vulnerabilidades</w:t>
+      </w:r>
+      <w:r>
+        <w:t>.</w:t>
+      </w:r>
     </w:p>
     <w:p>
       <w:pPr>
@@ -8075,22 +7837,27 @@
           <w:ilvl w:val="0"/>
           <w:numId w:val="42"/>
         </w:numPr>
-      </w:pPr>
-      <w:r>
-        <w:t>Actualización y homogeneización de dependencias.</w:t>
+        <w:spacing w:line="259" w:lineRule="auto"/>
+        <w:rPr>
+          <w:szCs w:val="24"/>
+        </w:rPr>
+      </w:pPr>
+      <w:r>
+        <w:rPr>
+          <w:szCs w:val="24"/>
+        </w:rPr>
+        <w:t>Actualización de dependencias a versiones no vulnerables.</w:t>
       </w:r>
     </w:p>
     <w:p>
       <w:pPr>
         <w:pStyle w:val="Ttulo3"/>
       </w:pPr>
-      <w:bookmarkStart w:id="53" w:name="_Toc116024924"/>
-      <w:bookmarkStart w:id="54" w:name="_Toc157413386"/>
+      <w:bookmarkStart w:id="51" w:name="_Toc189498222"/>
       <w:r>
         <w:t>Errores Resueltos</w:t>
       </w:r>
-      <w:bookmarkEnd w:id="53"/>
-      <w:bookmarkEnd w:id="54"/>
+      <w:bookmarkEnd w:id="51"/>
     </w:p>
     <w:p>
       <w:pPr>
@@ -8098,10 +7865,61 @@
           <w:ilvl w:val="0"/>
           <w:numId w:val="42"/>
         </w:numPr>
-      </w:pPr>
-      <w:r>
-        <w:t>Se corrige el paquete de despliegue y la documentación incluyendo las dependencias reales de cada una de las librerías de integra.</w:t>
-      </w:r>
+        <w:spacing w:line="259" w:lineRule="auto"/>
+        <w:rPr>
+          <w:szCs w:val="24"/>
+        </w:rPr>
+      </w:pPr>
+      <w:r>
+        <w:rPr>
+          <w:szCs w:val="24"/>
+        </w:rPr>
+        <w:t>Se corrige un error que impedía la generación y validación de firmas con sello de tiempo.</w:t>
+      </w:r>
+    </w:p>
+    <w:p>
+      <w:pPr>
+        <w:pStyle w:val="Ttulo2"/>
+        <w:rPr>
+          <w:lang w:val="es-ES"/>
+        </w:rPr>
+      </w:pPr>
+      <w:bookmarkStart w:id="52" w:name="_Toc189498223"/>
+      <w:r>
+        <w:rPr>
+          <w:lang w:val="es-ES"/>
+        </w:rPr>
+        <w:t>Integr@ 2.2.</w:t>
+      </w:r>
+      <w:r>
+        <w:rPr>
+          <w:lang w:val="es-ES"/>
+        </w:rPr>
+        <w:t>4</w:t>
+      </w:r>
+      <w:r>
+        <w:rPr>
+          <w:lang w:val="es-ES"/>
+        </w:rPr>
+        <w:t>_00</w:t>
+      </w:r>
+      <w:r>
+        <w:rPr>
+          <w:lang w:val="es-ES"/>
+        </w:rPr>
+        <w:t>0</w:t>
+      </w:r>
+      <w:bookmarkEnd w:id="52"/>
+    </w:p>
+    <w:p>
+      <w:pPr>
+        <w:pStyle w:val="Ttulo3"/>
+      </w:pPr>
+      <w:bookmarkStart w:id="53" w:name="_Toc189498224"/>
+      <w:r>
+        <w:t>Características</w:t>
+      </w:r>
+      <w:bookmarkEnd w:id="53"/>
     </w:p>
     <w:p>
       <w:pPr>
@@ -8111,64 +7929,8 @@
         </w:numPr>
       </w:pPr>
       <w:r>
-        <w:t>Se incluye una serie de propiedades en el fichero “</w:t>
-      </w:r>
-      <w:proofErr w:type="spellStart"/>
-      <w:r>
-        <w:t>tsaApp.properties</w:t>
-      </w:r>
-      <w:proofErr w:type="spellEnd"/>
-      <w:r>
-        <w:t>” que eran requeridas para la integración WS con TS@.</w:t>
-      </w:r>
-    </w:p>
-    <w:p>
-      <w:pPr>
-        <w:pStyle w:val="Ttulo2"/>
-        <w:rPr>
-          <w:lang w:val="es-ES"/>
-        </w:rPr>
-      </w:pPr>
-      <w:bookmarkStart w:id="55" w:name="_Toc116024925"/>
-      <w:bookmarkStart w:id="56" w:name="_Toc157413387"/>
-      <w:r>
-        <w:rPr>
-          <w:lang w:val="es-ES"/>
-        </w:rPr>
-        <w:t>Integr@ 2.2.</w:t>
-      </w:r>
-      <w:r>
-        <w:rPr>
-          <w:lang w:val="es-ES"/>
-        </w:rPr>
-        <w:t>3</w:t>
-      </w:r>
-      <w:r>
-        <w:rPr>
-          <w:lang w:val="es-ES"/>
-        </w:rPr>
-        <w:t>_00</w:t>
-      </w:r>
-      <w:r>
-        <w:rPr>
-          <w:lang w:val="es-ES"/>
-        </w:rPr>
-        <w:t>0</w:t>
-      </w:r>
-      <w:bookmarkEnd w:id="55"/>
-      <w:bookmarkEnd w:id="56"/>
-    </w:p>
-    <w:p>
-      <w:pPr>
-        <w:pStyle w:val="Ttulo3"/>
-      </w:pPr>
-      <w:bookmarkStart w:id="57" w:name="_Toc116024926"/>
-      <w:bookmarkStart w:id="58" w:name="_Toc157413388"/>
-      <w:r>
-        <w:t>Características</w:t>
-      </w:r>
-      <w:bookmarkEnd w:id="57"/>
-      <w:bookmarkEnd w:id="58"/>
+        <w:t>Actualización de dependencias.</w:t>
+      </w:r>
     </w:p>
     <w:p>
       <w:pPr>
@@ -8178,8 +7940,18 @@
         </w:numPr>
       </w:pPr>
       <w:r>
-        <w:t>Cuando se indica el método de canonización de la firma XAdES, se utiliza este mismo método para la transformación de los datos XML. Si no se indica nada, se mantiene el comportamiento anterior.</w:t>
-      </w:r>
+        <w:t>Nuevas comprobaciones de seguridad.</w:t>
+      </w:r>
+    </w:p>
+    <w:p>
+      <w:pPr>
+        <w:pStyle w:val="Ttulo3"/>
+      </w:pPr>
+      <w:bookmarkStart w:id="54" w:name="_Toc189498225"/>
+      <w:r>
+        <w:t>Errores Resueltos</w:t>
+      </w:r>
+      <w:bookmarkEnd w:id="54"/>
     </w:p>
     <w:p>
       <w:pPr>
@@ -8189,10 +7961,13 @@
         </w:numPr>
       </w:pPr>
       <w:r>
-        <w:t xml:space="preserve">Se adapta el desarrollo para la compatibilidad con las RFC </w:t>
-      </w:r>
-      <w:r>
-        <w:t>5035 y 5816.</w:t>
+        <w:t xml:space="preserve">Se corrige </w:t>
+      </w:r>
+      <w:r>
+        <w:t>el error del WebService por el que se extendía sin límite el tamaño de la caché con los resultados de validación</w:t>
+      </w:r>
+      <w:r>
+        <w:t>.</w:t>
       </w:r>
     </w:p>
     <w:p>
@@ -8203,21 +7978,43 @@
         </w:numPr>
       </w:pPr>
       <w:r>
-        <w:t>Se sustituye la utilización de la dependencia JCE de IAIK por la JCE de BouncyCastle.</w:t>
-      </w:r>
+        <w:t>Ya se liberan las conexiones con Axis2.</w:t>
+      </w:r>
+    </w:p>
+    <w:p>
+      <w:pPr>
+        <w:pStyle w:val="Ttulo2"/>
+        <w:rPr>
+          <w:lang w:val="es-ES"/>
+        </w:rPr>
+      </w:pPr>
+      <w:bookmarkStart w:id="55" w:name="_Toc189498226"/>
+      <w:r>
+        <w:rPr>
+          <w:lang w:val="es-ES"/>
+        </w:rPr>
+        <w:t>Integr@ 2.2.3_00</w:t>
+      </w:r>
+      <w:r>
+        <w:rPr>
+          <w:lang w:val="es-ES"/>
+        </w:rPr>
+        <w:t>1</w:t>
+      </w:r>
+      <w:bookmarkEnd w:id="46"/>
+      <w:bookmarkEnd w:id="55"/>
     </w:p>
     <w:p>
       <w:pPr>
         <w:pStyle w:val="Ttulo3"/>
       </w:pPr>
-      <w:bookmarkStart w:id="59" w:name="_Toc116024927"/>
-      <w:bookmarkStart w:id="60" w:name="_Toc157413389"/>
-      <w:r>
-        <w:lastRenderedPageBreak/>
-        <w:t>Errores Resueltos</w:t>
-      </w:r>
-      <w:bookmarkEnd w:id="59"/>
-      <w:bookmarkEnd w:id="60"/>
+      <w:bookmarkStart w:id="56" w:name="_Toc116024923"/>
+      <w:bookmarkStart w:id="57" w:name="_Toc189498227"/>
+      <w:r>
+        <w:t>Características</w:t>
+      </w:r>
+      <w:bookmarkEnd w:id="56"/>
+      <w:bookmarkEnd w:id="57"/>
     </w:p>
     <w:p>
       <w:pPr>
@@ -8227,38 +8024,21 @@
         </w:numPr>
       </w:pPr>
       <w:r>
-        <w:t>Se corrige que en las firmas baseline se utilizase una transformación XML en lugar de la Base 64 cuando los datos son binarios.</w:t>
-      </w:r>
-    </w:p>
-    <w:p>
-      <w:pPr>
-        <w:pStyle w:val="Ttulo2"/>
-        <w:rPr>
-          <w:lang w:val="es-ES"/>
-        </w:rPr>
-      </w:pPr>
-      <w:bookmarkStart w:id="61" w:name="_Toc116024928"/>
-      <w:bookmarkStart w:id="62" w:name="_Toc157413390"/>
-      <w:r>
-        <w:rPr>
-          <w:lang w:val="es-ES"/>
-        </w:rPr>
-        <w:t>Integr@ 2.2.2_002</w:t>
-      </w:r>
-      <w:bookmarkEnd w:id="61"/>
-      <w:bookmarkEnd w:id="62"/>
+        <w:t>Actualización y homogeneización de dependencias.</w:t>
+      </w:r>
     </w:p>
     <w:p>
       <w:pPr>
         <w:pStyle w:val="Ttulo3"/>
       </w:pPr>
-      <w:bookmarkStart w:id="63" w:name="_Toc116024929"/>
-      <w:bookmarkStart w:id="64" w:name="_Toc157413391"/>
-      <w:r>
-        <w:t>Características</w:t>
-      </w:r>
-      <w:bookmarkEnd w:id="63"/>
-      <w:bookmarkEnd w:id="64"/>
+      <w:bookmarkStart w:id="58" w:name="_Toc116024924"/>
+      <w:bookmarkStart w:id="59" w:name="_Toc189498228"/>
+      <w:r>
+        <w:lastRenderedPageBreak/>
+        <w:t>Errores Resueltos</w:t>
+      </w:r>
+      <w:bookmarkEnd w:id="58"/>
+      <w:bookmarkEnd w:id="59"/>
     </w:p>
     <w:p>
       <w:pPr>
@@ -8268,7 +8048,7 @@
         </w:numPr>
       </w:pPr>
       <w:r>
-        <w:t>Evolución de la versión de la librería de gestión de logs a Log4j2.</w:t>
+        <w:t>Se corrige el paquete de despliegue y la documentación incluyendo las dependencias reales de cada una de las librerías de integra.</w:t>
       </w:r>
     </w:p>
     <w:p>
@@ -8279,8 +8059,56 @@
         </w:numPr>
       </w:pPr>
       <w:r>
-        <w:t>Adaptación de la configuración para el uso de Log4j2.</w:t>
-      </w:r>
+        <w:t>Se incluye una serie de propiedades en el fichero “tsaApp.properties” que eran requeridas para la integración WS con TS@.</w:t>
+      </w:r>
+    </w:p>
+    <w:p>
+      <w:pPr>
+        <w:pStyle w:val="Ttulo2"/>
+        <w:rPr>
+          <w:lang w:val="es-ES"/>
+        </w:rPr>
+      </w:pPr>
+      <w:bookmarkStart w:id="60" w:name="_Toc116024925"/>
+      <w:bookmarkStart w:id="61" w:name="_Toc189498229"/>
+      <w:r>
+        <w:rPr>
+          <w:lang w:val="es-ES"/>
+        </w:rPr>
+        <w:t>Integr@ 2.2.</w:t>
+      </w:r>
+      <w:r>
+        <w:rPr>
+          <w:lang w:val="es-ES"/>
+        </w:rPr>
+        <w:t>3</w:t>
+      </w:r>
+      <w:r>
+        <w:rPr>
+          <w:lang w:val="es-ES"/>
+        </w:rPr>
+        <w:t>_00</w:t>
+      </w:r>
+      <w:r>
+        <w:rPr>
+          <w:lang w:val="es-ES"/>
+        </w:rPr>
+        <w:t>0</w:t>
+      </w:r>
+      <w:bookmarkEnd w:id="60"/>
+      <w:bookmarkEnd w:id="61"/>
+    </w:p>
+    <w:p>
+      <w:pPr>
+        <w:pStyle w:val="Ttulo3"/>
+      </w:pPr>
+      <w:bookmarkStart w:id="62" w:name="_Toc116024926"/>
+      <w:bookmarkStart w:id="63" w:name="_Toc189498230"/>
+      <w:r>
+        <w:t>Características</w:t>
+      </w:r>
+      <w:bookmarkEnd w:id="62"/>
+      <w:bookmarkEnd w:id="63"/>
     </w:p>
     <w:p>
       <w:pPr>
@@ -8290,20 +8118,8 @@
         </w:numPr>
       </w:pPr>
       <w:r>
-        <w:t>Eliminar referencias a la librería slf4j.</w:t>
-      </w:r>
-    </w:p>
-    <w:p>
-      <w:pPr>
-        <w:pStyle w:val="Ttulo3"/>
-      </w:pPr>
-      <w:bookmarkStart w:id="65" w:name="_Toc116024930"/>
-      <w:bookmarkStart w:id="66" w:name="_Toc157413392"/>
-      <w:r>
-        <w:t>Errores Resueltos</w:t>
-      </w:r>
-      <w:bookmarkEnd w:id="65"/>
-      <w:bookmarkEnd w:id="66"/>
+        <w:t>Cuando se indica el método de canonización de la firma XAdES, se utiliza este mismo método para la transformación de los datos XML. Si no se indica nada, se mantiene el comportamiento anterior.</w:t>
+      </w:r>
     </w:p>
     <w:p>
       <w:pPr>
@@ -8313,52 +8129,11 @@
         </w:numPr>
       </w:pPr>
       <w:r>
-        <w:t>Se corrige discrepancia en el nombre de la variable de configuración que indica la c</w:t>
-      </w:r>
-      <w:r>
-        <w:t>ontraseña del almacén de confianza (JKS) para conexiones seguras.</w:t>
-      </w:r>
-      <w:r>
-        <w:t xml:space="preserve"> Esta variable, presentaba una variación en una letra mayúscula entre el nombre indicado en el fichero “</w:t>
-      </w:r>
-      <w:proofErr w:type="gramStart"/>
-      <w:r>
-        <w:t>integra.properties</w:t>
-      </w:r>
-      <w:proofErr w:type="gramEnd"/>
-      <w:r>
-        <w:t>” y el valor esperado dentro del código.</w:t>
-      </w:r>
-    </w:p>
-    <w:p>
-      <w:pPr>
-        <w:pStyle w:val="Ttulo2"/>
-        <w:rPr>
-          <w:lang w:val="es-ES"/>
-        </w:rPr>
-      </w:pPr>
-      <w:bookmarkStart w:id="67" w:name="_Toc116024931"/>
-      <w:bookmarkStart w:id="68" w:name="_Toc157413393"/>
-      <w:r>
-        <w:rPr>
-          <w:lang w:val="es-ES"/>
-        </w:rPr>
-        <w:t>Integr@ 2.2.2_001</w:t>
-      </w:r>
-      <w:bookmarkEnd w:id="67"/>
-      <w:bookmarkEnd w:id="68"/>
-    </w:p>
-    <w:p>
-      <w:pPr>
-        <w:pStyle w:val="Ttulo3"/>
-      </w:pPr>
-      <w:bookmarkStart w:id="69" w:name="_Toc116024932"/>
-      <w:bookmarkStart w:id="70" w:name="_Toc157413394"/>
-      <w:r>
-        <w:t>Características</w:t>
-      </w:r>
-      <w:bookmarkEnd w:id="69"/>
-      <w:bookmarkEnd w:id="70"/>
+        <w:t xml:space="preserve">Se adapta el desarrollo para la compatibilidad con las RFC </w:t>
+      </w:r>
+      <w:r>
+        <w:t>5035 y 5816.</w:t>
+      </w:r>
     </w:p>
     <w:p>
       <w:pPr>
@@ -8368,8 +8143,20 @@
         </w:numPr>
       </w:pPr>
       <w:r>
-        <w:t xml:space="preserve">Adaptación de la librería integra-tsl.jar para su integración con @firma. </w:t>
-      </w:r>
+        <w:t>Se sustituye la utilización de la dependencia JCE de IAIK por la JCE de BouncyCastle.</w:t>
+      </w:r>
+    </w:p>
+    <w:p>
+      <w:pPr>
+        <w:pStyle w:val="Ttulo3"/>
+      </w:pPr>
+      <w:bookmarkStart w:id="64" w:name="_Toc116024927"/>
+      <w:bookmarkStart w:id="65" w:name="_Toc189498231"/>
+      <w:r>
+        <w:t>Errores Resueltos</w:t>
+      </w:r>
+      <w:bookmarkEnd w:id="64"/>
+      <w:bookmarkEnd w:id="65"/>
     </w:p>
     <w:p>
       <w:pPr>
@@ -8379,8 +8166,38 @@
         </w:numPr>
       </w:pPr>
       <w:r>
-        <w:t>Se modifica la lógica para que en los casos en los que no tenga definida la extensión AdditionalServiceInformation, se compruebe la cualificación del certificado en base al contenido del certificado.</w:t>
-      </w:r>
+        <w:t>Se corrige que en las firmas baseline se utilizase una transformación XML en lugar de la Base 64 cuando los datos son binarios.</w:t>
+      </w:r>
+    </w:p>
+    <w:p>
+      <w:pPr>
+        <w:pStyle w:val="Ttulo2"/>
+        <w:rPr>
+          <w:lang w:val="es-ES"/>
+        </w:rPr>
+      </w:pPr>
+      <w:bookmarkStart w:id="66" w:name="_Toc116024928"/>
+      <w:bookmarkStart w:id="67" w:name="_Toc189498232"/>
+      <w:r>
+        <w:rPr>
+          <w:lang w:val="es-ES"/>
+        </w:rPr>
+        <w:t>Integr@ 2.2.2_002</w:t>
+      </w:r>
+      <w:bookmarkEnd w:id="66"/>
+      <w:bookmarkEnd w:id="67"/>
+    </w:p>
+    <w:p>
+      <w:pPr>
+        <w:pStyle w:val="Ttulo3"/>
+      </w:pPr>
+      <w:bookmarkStart w:id="68" w:name="_Toc116024929"/>
+      <w:bookmarkStart w:id="69" w:name="_Toc189498233"/>
+      <w:r>
+        <w:t>Características</w:t>
+      </w:r>
+      <w:bookmarkEnd w:id="68"/>
+      <w:bookmarkEnd w:id="69"/>
     </w:p>
     <w:p>
       <w:pPr>
@@ -8390,6 +8207,123 @@
         </w:numPr>
       </w:pPr>
       <w:r>
+        <w:t>Evolución de la versión de la librería de gestión de logs a Log4j2.</w:t>
+      </w:r>
+    </w:p>
+    <w:p>
+      <w:pPr>
+        <w:numPr>
+          <w:ilvl w:val="0"/>
+          <w:numId w:val="42"/>
+        </w:numPr>
+      </w:pPr>
+      <w:r>
+        <w:t>Adaptación de la configuración para el uso de Log4j2.</w:t>
+      </w:r>
+    </w:p>
+    <w:p>
+      <w:pPr>
+        <w:numPr>
+          <w:ilvl w:val="0"/>
+          <w:numId w:val="42"/>
+        </w:numPr>
+      </w:pPr>
+      <w:r>
+        <w:t>Eliminar referencias a la librería slf4j.</w:t>
+      </w:r>
+    </w:p>
+    <w:p>
+      <w:pPr>
+        <w:pStyle w:val="Ttulo3"/>
+      </w:pPr>
+      <w:bookmarkStart w:id="70" w:name="_Toc116024930"/>
+      <w:bookmarkStart w:id="71" w:name="_Toc189498234"/>
+      <w:r>
+        <w:t>Errores Resueltos</w:t>
+      </w:r>
+      <w:bookmarkEnd w:id="70"/>
+      <w:bookmarkEnd w:id="71"/>
+    </w:p>
+    <w:p>
+      <w:pPr>
+        <w:numPr>
+          <w:ilvl w:val="0"/>
+          <w:numId w:val="42"/>
+        </w:numPr>
+      </w:pPr>
+      <w:r>
+        <w:t>Se corrige discrepancia en el nombre de la variable de configuración que indica la contraseña del almacén de confianza (JKS) para conexiones seguras. Esta variable, presentaba una variación en una letra mayúscula entre el nombre indicado en el fichero “</w:t>
+      </w:r>
+      <w:proofErr w:type="gramStart"/>
+      <w:r>
+        <w:t>integra.properties</w:t>
+      </w:r>
+      <w:proofErr w:type="gramEnd"/>
+      <w:r>
+        <w:t>” y el valor esperado dentro del código.</w:t>
+      </w:r>
+    </w:p>
+    <w:p>
+      <w:pPr>
+        <w:pStyle w:val="Ttulo2"/>
+        <w:rPr>
+          <w:lang w:val="es-ES"/>
+        </w:rPr>
+      </w:pPr>
+      <w:bookmarkStart w:id="72" w:name="_Toc116024931"/>
+      <w:bookmarkStart w:id="73" w:name="_Toc189498235"/>
+      <w:r>
+        <w:rPr>
+          <w:lang w:val="es-ES"/>
+        </w:rPr>
+        <w:t>Integr@ 2.2.2_001</w:t>
+      </w:r>
+      <w:bookmarkEnd w:id="72"/>
+      <w:bookmarkEnd w:id="73"/>
+    </w:p>
+    <w:p>
+      <w:pPr>
+        <w:pStyle w:val="Ttulo3"/>
+      </w:pPr>
+      <w:bookmarkStart w:id="74" w:name="_Toc116024932"/>
+      <w:bookmarkStart w:id="75" w:name="_Toc189498236"/>
+      <w:r>
+        <w:t>Características</w:t>
+      </w:r>
+      <w:bookmarkEnd w:id="74"/>
+      <w:bookmarkEnd w:id="75"/>
+    </w:p>
+    <w:p>
+      <w:pPr>
+        <w:numPr>
+          <w:ilvl w:val="0"/>
+          <w:numId w:val="42"/>
+        </w:numPr>
+      </w:pPr>
+      <w:r>
+        <w:t xml:space="preserve">Adaptación de la librería integra-tsl.jar para su integración con @firma. </w:t>
+      </w:r>
+    </w:p>
+    <w:p>
+      <w:pPr>
+        <w:numPr>
+          <w:ilvl w:val="0"/>
+          <w:numId w:val="42"/>
+        </w:numPr>
+      </w:pPr>
+      <w:r>
+        <w:lastRenderedPageBreak/>
+        <w:t>Se modifica la lógica para que en los casos en los que no tenga definida la extensión AdditionalServiceInformation, se compruebe la cualificación del certificado en base al contenido del certificado.</w:t>
+      </w:r>
+    </w:p>
+    <w:p>
+      <w:pPr>
+        <w:numPr>
+          <w:ilvl w:val="0"/>
+          <w:numId w:val="42"/>
+        </w:numPr>
+      </w:pPr>
+      <w:r>
         <w:t>Se añaden nuevas trazas de logs en el procesado de validación de un certificado frente una TSL.</w:t>
       </w:r>
     </w:p>
@@ -8397,13 +8331,13 @@
       <w:pPr>
         <w:pStyle w:val="Ttulo3"/>
       </w:pPr>
-      <w:bookmarkStart w:id="71" w:name="_Toc116024933"/>
-      <w:bookmarkStart w:id="72" w:name="_Toc157413395"/>
+      <w:bookmarkStart w:id="76" w:name="_Toc116024933"/>
+      <w:bookmarkStart w:id="77" w:name="_Toc189498237"/>
       <w:r>
         <w:t>Errores Resueltos</w:t>
       </w:r>
-      <w:bookmarkEnd w:id="71"/>
-      <w:bookmarkEnd w:id="72"/>
+      <w:bookmarkEnd w:id="76"/>
+      <w:bookmarkEnd w:id="77"/>
     </w:p>
     <w:p>
       <w:pPr>
@@ -8426,28 +8360,28 @@
           <w:lang w:val="es-ES"/>
         </w:rPr>
       </w:pPr>
-      <w:bookmarkStart w:id="73" w:name="_Toc116024934"/>
-      <w:bookmarkStart w:id="74" w:name="_Toc157413396"/>
+      <w:bookmarkStart w:id="78" w:name="_Toc116024934"/>
+      <w:bookmarkStart w:id="79" w:name="_Toc189498238"/>
       <w:r>
         <w:rPr>
           <w:lang w:val="es-ES"/>
         </w:rPr>
         <w:t>Integr@ 2.2.2_000</w:t>
       </w:r>
-      <w:bookmarkEnd w:id="73"/>
-      <w:bookmarkEnd w:id="74"/>
+      <w:bookmarkEnd w:id="78"/>
+      <w:bookmarkEnd w:id="79"/>
     </w:p>
     <w:p>
       <w:pPr>
         <w:pStyle w:val="Ttulo3"/>
       </w:pPr>
-      <w:bookmarkStart w:id="75" w:name="_Toc116024935"/>
-      <w:bookmarkStart w:id="76" w:name="_Toc157413397"/>
+      <w:bookmarkStart w:id="80" w:name="_Toc116024935"/>
+      <w:bookmarkStart w:id="81" w:name="_Toc189498239"/>
       <w:r>
         <w:t>Características</w:t>
       </w:r>
-      <w:bookmarkEnd w:id="75"/>
-      <w:bookmarkEnd w:id="76"/>
+      <w:bookmarkEnd w:id="80"/>
+      <w:bookmarkEnd w:id="81"/>
     </w:p>
     <w:p>
       <w:pPr>
@@ -8485,7 +8419,6 @@
         </w:numPr>
       </w:pPr>
       <w:r>
-        <w:lastRenderedPageBreak/>
         <w:t>Se añade una nueva funcionalidad que permite el cálculo de la fecha de expiración de las firmas en las operaciones de validación en Integr@</w:t>
       </w:r>
       <w:r>
@@ -8539,19 +8472,7 @@
         <w:t xml:space="preserve">validación de certificados </w:t>
       </w:r>
       <w:r>
-        <w:t>frente a las l</w:t>
-      </w:r>
-      <w:r>
-        <w:t>ista</w:t>
-      </w:r>
-      <w:r>
-        <w:t>s</w:t>
-      </w:r>
-      <w:r>
-        <w:t xml:space="preserve"> de confianza de prestadores de servicios electrónicos de confianza (TSL)</w:t>
-      </w:r>
-      <w:r>
-        <w:t>.</w:t>
+        <w:t>frente a las listas de confianza de prestadores de servicios electrónicos de confianza (TSL).</w:t>
       </w:r>
     </w:p>
     <w:p>
@@ -8563,13 +8484,13 @@
       <w:pPr>
         <w:pStyle w:val="Ttulo3"/>
       </w:pPr>
-      <w:bookmarkStart w:id="77" w:name="_Toc116024936"/>
-      <w:bookmarkStart w:id="78" w:name="_Toc157413398"/>
+      <w:bookmarkStart w:id="82" w:name="_Toc116024936"/>
+      <w:bookmarkStart w:id="83" w:name="_Toc189498240"/>
       <w:r>
         <w:t>Errores Resueltos</w:t>
       </w:r>
-      <w:bookmarkEnd w:id="77"/>
-      <w:bookmarkEnd w:id="78"/>
+      <w:bookmarkEnd w:id="82"/>
+      <w:bookmarkEnd w:id="83"/>
     </w:p>
     <w:p>
       <w:pPr>
@@ -8623,6 +8544,7 @@
         </w:numPr>
       </w:pPr>
       <w:r>
+        <w:lastRenderedPageBreak/>
         <w:t>Se soluciona bug que provocaba un error durante la generación de los objetos de respuesta en actualizaciones de firmas XAdES.  El problema estaba en que no se buscaba correctamente el elemento '</w:t>
       </w:r>
       <w:proofErr w:type="gramStart"/>
@@ -8668,28 +8590,28 @@
           <w:lang w:val="es-ES"/>
         </w:rPr>
       </w:pPr>
-      <w:bookmarkStart w:id="79" w:name="_Toc116024937"/>
-      <w:bookmarkStart w:id="80" w:name="_Toc157413399"/>
+      <w:bookmarkStart w:id="84" w:name="_Toc116024937"/>
+      <w:bookmarkStart w:id="85" w:name="_Toc189498241"/>
       <w:r>
         <w:rPr>
           <w:lang w:val="es-ES"/>
         </w:rPr>
         <w:t>Integr@ 2.2.1_000</w:t>
       </w:r>
-      <w:bookmarkEnd w:id="79"/>
-      <w:bookmarkEnd w:id="80"/>
+      <w:bookmarkEnd w:id="84"/>
+      <w:bookmarkEnd w:id="85"/>
     </w:p>
     <w:p>
       <w:pPr>
         <w:pStyle w:val="Ttulo3"/>
       </w:pPr>
-      <w:bookmarkStart w:id="81" w:name="_Toc116024938"/>
-      <w:bookmarkStart w:id="82" w:name="_Toc157413400"/>
+      <w:bookmarkStart w:id="86" w:name="_Toc116024938"/>
+      <w:bookmarkStart w:id="87" w:name="_Toc189498242"/>
       <w:r>
         <w:t>Características</w:t>
       </w:r>
-      <w:bookmarkEnd w:id="81"/>
-      <w:bookmarkEnd w:id="82"/>
+      <w:bookmarkEnd w:id="86"/>
+      <w:bookmarkEnd w:id="87"/>
     </w:p>
     <w:p>
       <w:pPr>
@@ -8710,7 +8632,6 @@
         </w:numPr>
       </w:pPr>
       <w:r>
-        <w:lastRenderedPageBreak/>
         <w:t>Se añade una utilidad que permite detectar el formato de firmas XML, ASN.1 y PDF.</w:t>
       </w:r>
     </w:p>
@@ -8810,6 +8731,7 @@
         </w:numPr>
       </w:pPr>
       <w:r>
+        <w:lastRenderedPageBreak/>
         <w:t>Se incorpora integración con HSM que permite obtener certificados y claves privadas de los mismos.</w:t>
       </w:r>
     </w:p>
@@ -8876,7 +8798,6 @@
         </w:numPr>
       </w:pPr>
       <w:r>
-        <w:lastRenderedPageBreak/>
         <w:t xml:space="preserve">Se ha añadido una propiedad al fichero </w:t>
       </w:r>
       <w:proofErr w:type="gramStart"/>
@@ -9020,6 +8941,7 @@
         <w:rPr>
           <w:szCs w:val="24"/>
         </w:rPr>
+        <w:lastRenderedPageBreak/>
         <w:t>Se ha modificado el mensaje de log que indicaba el modo de la firma a co-firmar por un mensaje donde se expresa que el modo de firma de la co-firma XAdES será el mismo que el de la firma a co-firmar.</w:t>
       </w:r>
     </w:p>
@@ -9185,7 +9107,6 @@
         </w:numPr>
       </w:pPr>
       <w:r>
-        <w:lastRenderedPageBreak/>
         <w:t>Se divide</w:t>
       </w:r>
       <w:r>
@@ -9300,6 +9221,7 @@
         </w:numPr>
       </w:pPr>
       <w:r>
+        <w:lastRenderedPageBreak/>
         <w:t xml:space="preserve">Se añade la actualización de firmantes de una firma XAdES Baseline añadiéndoles un sello de tiempo a cada uno de ellos, siempre que no lo tuviera anteriormente, mediante la interfaz </w:t>
       </w:r>
       <w:r>
@@ -9475,7 +9397,6 @@
         </w:numPr>
       </w:pPr>
       <w:r>
-        <w:lastRenderedPageBreak/>
         <w:t>Se añade al detector de formatos una funcionalidad para determinar si una firma es ASiC-S.</w:t>
       </w:r>
     </w:p>
@@ -9578,6 +9499,7 @@
         </w:numPr>
       </w:pPr>
       <w:r>
+        <w:lastRenderedPageBreak/>
         <w:t xml:space="preserve">Se añade en la interfaz </w:t>
       </w:r>
       <w:r>
@@ -9740,7 +9662,6 @@
         </w:numPr>
       </w:pPr>
       <w:r>
-        <w:lastRenderedPageBreak/>
         <w:t>Se actualizan los procesos de validación de firmas para que ofrezcan una información más detallada de las validaciones llevadas a cabo, así como de los firmantes y sellos de tiempo que componen cada firma.</w:t>
       </w:r>
     </w:p>
@@ -9867,13 +9788,13 @@
       <w:pPr>
         <w:pStyle w:val="Ttulo3"/>
       </w:pPr>
-      <w:bookmarkStart w:id="83" w:name="_Toc116024939"/>
-      <w:bookmarkStart w:id="84" w:name="_Toc157413401"/>
+      <w:bookmarkStart w:id="88" w:name="_Toc116024939"/>
+      <w:bookmarkStart w:id="89" w:name="_Toc189498243"/>
       <w:r>
         <w:t>Errores Resueltos</w:t>
       </w:r>
-      <w:bookmarkEnd w:id="83"/>
-      <w:bookmarkEnd w:id="84"/>
+      <w:bookmarkEnd w:id="88"/>
+      <w:bookmarkEnd w:id="89"/>
     </w:p>
     <w:p>
       <w:pPr>
@@ -9941,7 +9862,6 @@
         </w:numPr>
       </w:pPr>
       <w:r>
-        <w:lastRenderedPageBreak/>
         <w:t xml:space="preserve">Se soluciona </w:t>
       </w:r>
       <w:r>
@@ -10046,7 +9966,11 @@
         </w:numPr>
       </w:pPr>
       <w:r>
-        <w:t xml:space="preserve">Se resuelve la incidencia #131729, la cual indicaba que se producía un error si el proveedor de seguridad de BouncyCastle no había sido inicializado antes de utilizar el cliente OCSP para validación de certificados. Se ha añadido una inicialización estática del proveedor de manera que en la clase </w:t>
+        <w:t xml:space="preserve">Se resuelve la incidencia #131729, la cual indicaba que se producía un error si el proveedor de seguridad de BouncyCastle no había sido inicializado antes de utilizar el cliente OCSP para validación de certificados. Se ha añadido una inicialización estática del proveedor </w:t>
+      </w:r>
+      <w:r>
+        <w:lastRenderedPageBreak/>
+        <w:t xml:space="preserve">de manera que en la clase </w:t>
       </w:r>
       <w:proofErr w:type="gramStart"/>
       <w:r>
@@ -10189,7 +10113,6 @@
         </w:numPr>
       </w:pPr>
       <w:r>
-        <w:lastRenderedPageBreak/>
         <w:t xml:space="preserve">Se soluciona la incidencia #150530 según la cual, el método </w:t>
       </w:r>
       <w:proofErr w:type="gramStart"/>
@@ -10346,6 +10269,7 @@
         </w:numPr>
       </w:pPr>
       <w:r>
+        <w:lastRenderedPageBreak/>
         <w:t>Se corrige un error por el que no se incluía correctamente el resumen del documento legible de la política de firma en la generación de firmas ASN.1 con política de firma.</w:t>
       </w:r>
     </w:p>
@@ -10514,7 +10438,6 @@
         </w:numPr>
       </w:pPr>
       <w:r>
-        <w:lastRenderedPageBreak/>
         <w:t xml:space="preserve">Se modifica la manera de capturar excepciones en la clase </w:t>
       </w:r>
       <w:r>
@@ -10647,6 +10570,7 @@
         </w:numPr>
       </w:pPr>
       <w:r>
+        <w:lastRenderedPageBreak/>
         <w:t xml:space="preserve">Solucionado un bug asociado a la validación de los atributos </w:t>
       </w:r>
       <w:r>
@@ -10774,7 +10698,6 @@
         </w:numPr>
       </w:pPr>
       <w:r>
-        <w:lastRenderedPageBreak/>
         <w:t xml:space="preserve">Se soluciona un problema asociado a la validación de firma en la clase </w:t>
       </w:r>
       <w:proofErr w:type="gramStart"/>
@@ -11217,17 +11140,27 @@
     <w:r>
       <w:tab/>
     </w:r>
-    <w:fldSimple w:instr=" REF  TITULO_DOCUMENTO ">
-      <w:r>
-        <w:t>@Firma</w:t>
-      </w:r>
-      <w:r>
-        <w:t>-</w:t>
-      </w:r>
-      <w:r>
-        <w:t>Integr@-CambiosYNovedades-MAN</w:t>
-      </w:r>
-    </w:fldSimple>
+    <w:r>
+      <w:fldChar w:fldCharType="begin"/>
+    </w:r>
+    <w:r>
+      <w:instrText xml:space="preserve"> REF  TITULO_DOCUMENTO </w:instrText>
+    </w:r>
+    <w:r>
+      <w:fldChar w:fldCharType="separate"/>
+    </w:r>
+    <w:r>
+      <w:t>@Firma</w:t>
+    </w:r>
+    <w:r>
+      <w:t>-</w:t>
+    </w:r>
+    <w:r>
+      <w:t>Integr@-CambiosYNovedades-MAN</w:t>
+    </w:r>
+    <w:r>
+      <w:fldChar w:fldCharType="end"/>
+    </w:r>
     <w:r>
       <w:rPr>
         <w:sz w:val="16"/>
@@ -11235,11 +11168,21 @@
       </w:rPr>
       <w:t>-</w:t>
     </w:r>
-    <w:fldSimple w:instr=" REF  VERSION ">
-      <w:r>
-        <w:t>021</w:t>
-      </w:r>
-    </w:fldSimple>
+    <w:r>
+      <w:fldChar w:fldCharType="begin"/>
+    </w:r>
+    <w:r>
+      <w:instrText xml:space="preserve"> REF  VERSION </w:instrText>
+    </w:r>
+    <w:r>
+      <w:fldChar w:fldCharType="separate"/>
+    </w:r>
+    <w:r>
+      <w:t>023</w:t>
+    </w:r>
+    <w:r>
+      <w:fldChar w:fldCharType="end"/>
+    </w:r>
     <w:r>
       <w:rPr>
         <w:sz w:val="16"/>
@@ -14923,7 +14866,6 @@
     <w:lvl w:ilvl="1">
       <w:start w:val="1"/>
       <w:numFmt w:val="decimal"/>
-      <w:pStyle w:val="Encabezado"/>
       <w:lvlText w:val="%1.%2"/>
       <w:lvlJc w:val="left"/>
       <w:pPr>
@@ -14936,7 +14878,6 @@
     <w:lvl w:ilvl="2">
       <w:start w:val="1"/>
       <w:numFmt w:val="decimal"/>
-      <w:pStyle w:val="Piedepgina"/>
       <w:lvlText w:val="%1.%2.%3"/>
       <w:lvlJc w:val="left"/>
       <w:pPr>
@@ -15805,11 +15746,15 @@
   </w:style>
   <w:style w:type="character" w:default="1" w:styleId="Fuentedeprrafopredeter">
     <w:name w:val="Default Paragraph Font"/>
+    <w:uiPriority w:val="1"/>
     <w:semiHidden/>
+    <w:unhideWhenUsed/>
   </w:style>
   <w:style w:type="table" w:default="1" w:styleId="Tablanormal">
     <w:name w:val="Normal Table"/>
+    <w:uiPriority w:val="99"/>
     <w:semiHidden/>
+    <w:unhideWhenUsed/>
     <w:tblPr>
       <w:tblInd w:w="0" w:type="dxa"/>
       <w:tblCellMar>
@@ -15822,7 +15767,9 @@
   </w:style>
   <w:style w:type="numbering" w:default="1" w:styleId="Sinlista">
     <w:name w:val="No List"/>
+    <w:uiPriority w:val="99"/>
     <w:semiHidden/>
+    <w:unhideWhenUsed/>
   </w:style>
   <w:style w:type="paragraph" w:customStyle="1" w:styleId="Texto">
     <w:name w:val="Texto"/>
@@ -17551,7 +17498,7 @@
     </w:tblStylePr>
   </w:style>
   <w:style w:type="paragraph" w:customStyle="1" w:styleId="CarCarCar">
-    <w:name w:val=" Car Car Car"/>
+    <w:name w:val="Car Car Car"/>
     <w:basedOn w:val="Normal"/>
     <w:semiHidden/>
     <w:rsid w:val="00693EA7"/>
@@ -18217,10 +18164,23 @@
 </file>
 
 <file path=customXml/item1.xml><?xml version="1.0" encoding="utf-8"?>
+<p:properties xmlns:p="http://schemas.microsoft.com/office/2006/metadata/properties" xmlns:xsi="http://www.w3.org/2001/XMLSchema-instance" xmlns:pc="http://schemas.microsoft.com/office/infopath/2007/PartnerControls">
+  <documentManagement>
+    <Location xmlns="e3c6f3b3-f88f-4e57-8294-d53de8f54b2b" xsi:nil="true"/>
+    <TaxCatchAll xmlns="30c688ba-d7e6-407b-8c35-f2a020af6bce" xsi:nil="true"/>
+    <Comentarios xmlns="e3c6f3b3-f88f-4e57-8294-d53de8f54b2b" xsi:nil="true"/>
+    <lcf76f155ced4ddcb4097134ff3c332f xmlns="e3c6f3b3-f88f-4e57-8294-d53de8f54b2b">
+      <Terms xmlns="http://schemas.microsoft.com/office/infopath/2007/PartnerControls"/>
+    </lcf76f155ced4ddcb4097134ff3c332f>
+  </documentManagement>
+</p:properties>
+</file>
+
+<file path=customXml/item2.xml><?xml version="1.0" encoding="utf-8"?>
 <b:Sources xmlns:b="http://schemas.openxmlformats.org/officeDocument/2006/bibliography" xmlns="http://schemas.openxmlformats.org/officeDocument/2006/bibliography" SelectedStyle="\APA.XSL" StyleName="APA"/>
 </file>
 
-<file path=customXml/item2.xml><?xml version="1.0" encoding="utf-8"?>
+<file path=customXml/item3.xml><?xml version="1.0" encoding="utf-8"?>
 <?mso-contentType ?>
 <FormTemplates xmlns="http://schemas.microsoft.com/sharepoint/v3/contenttype/forms">
   <Display>DocumentLibraryForm</Display>
@@ -18229,7 +18189,7 @@
 </FormTemplates>
 </file>
 
-<file path=customXml/item3.xml><?xml version="1.0" encoding="utf-8"?>
+<file path=customXml/item4.xml><?xml version="1.0" encoding="utf-8"?>
 <ct:contentTypeSchema xmlns:ct="http://schemas.microsoft.com/office/2006/metadata/contentType" xmlns:ma="http://schemas.microsoft.com/office/2006/metadata/properties/metaAttributes" ct:_="" ma:_="" ma:contentTypeName="Document" ma:contentTypeID="0x010100F37872BBB1B48948A69B496DD8700896" ma:contentTypeVersion="30" ma:contentTypeDescription="Create a new document." ma:contentTypeScope="" ma:versionID="db6ec5eae62717a2112663bfc8d11fc5">
   <xsd:schema xmlns:xsd="http://www.w3.org/2001/XMLSchema" xmlns:xs="http://www.w3.org/2001/XMLSchema" xmlns:p="http://schemas.microsoft.com/office/2006/metadata/properties" xmlns:ns2="e3c6f3b3-f88f-4e57-8294-d53de8f54b2b" xmlns:ns3="0e9fbc54-175b-41a1-a915-0ab6c7e45301" xmlns:ns4="30c688ba-d7e6-407b-8c35-f2a020af6bce" targetNamespace="http://schemas.microsoft.com/office/2006/metadata/properties" ma:root="true" ma:fieldsID="b607cbe47cf360e8877db2581acfff36" ns2:_="" ns3:_="" ns4:_="">
     <xsd:import namespace="e3c6f3b3-f88f-4e57-8294-d53de8f54b2b"/>
@@ -18539,20 +18499,18 @@
 </ct:contentTypeSchema>
 </file>
 
-<file path=customXml/item4.xml><?xml version="1.0" encoding="utf-8"?>
-<p:properties xmlns:p="http://schemas.microsoft.com/office/2006/metadata/properties" xmlns:xsi="http://www.w3.org/2001/XMLSchema-instance" xmlns:pc="http://schemas.microsoft.com/office/infopath/2007/PartnerControls">
-  <documentManagement>
-    <Location xmlns="e3c6f3b3-f88f-4e57-8294-d53de8f54b2b" xsi:nil="true"/>
-    <TaxCatchAll xmlns="30c688ba-d7e6-407b-8c35-f2a020af6bce" xsi:nil="true"/>
-    <Comentarios xmlns="e3c6f3b3-f88f-4e57-8294-d53de8f54b2b" xsi:nil="true"/>
-    <lcf76f155ced4ddcb4097134ff3c332f xmlns="e3c6f3b3-f88f-4e57-8294-d53de8f54b2b">
-      <Terms xmlns="http://schemas.microsoft.com/office/infopath/2007/PartnerControls"/>
-    </lcf76f155ced4ddcb4097134ff3c332f>
-  </documentManagement>
-</p:properties>
+<file path=customXml/itemProps1.xml><?xml version="1.0" encoding="utf-8"?>
+<ds:datastoreItem xmlns:ds="http://schemas.openxmlformats.org/officeDocument/2006/customXml" ds:itemID="{A1A52B7D-C25A-4266-A71F-3882DC9463C4}">
+  <ds:schemaRefs>
+    <ds:schemaRef ds:uri="http://schemas.microsoft.com/office/2006/metadata/properties"/>
+    <ds:schemaRef ds:uri="http://schemas.microsoft.com/office/infopath/2007/PartnerControls"/>
+    <ds:schemaRef ds:uri="e3c6f3b3-f88f-4e57-8294-d53de8f54b2b"/>
+    <ds:schemaRef ds:uri="30c688ba-d7e6-407b-8c35-f2a020af6bce"/>
+  </ds:schemaRefs>
+</ds:datastoreItem>
 </file>
 
-<file path=customXml/itemProps1.xml><?xml version="1.0" encoding="utf-8"?>
+<file path=customXml/itemProps2.xml><?xml version="1.0" encoding="utf-8"?>
 <ds:datastoreItem xmlns:ds="http://schemas.openxmlformats.org/officeDocument/2006/customXml" ds:itemID="{4110D91B-91E1-4550-9E50-01A84BFD4971}">
   <ds:schemaRefs>
     <ds:schemaRef ds:uri="http://schemas.openxmlformats.org/officeDocument/2006/bibliography"/>
@@ -18560,7 +18518,7 @@
 </ds:datastoreItem>
 </file>
 
-<file path=customXml/itemProps2.xml><?xml version="1.0" encoding="utf-8"?>
+<file path=customXml/itemProps3.xml><?xml version="1.0" encoding="utf-8"?>
 <ds:datastoreItem xmlns:ds="http://schemas.openxmlformats.org/officeDocument/2006/customXml" ds:itemID="{0451645F-3C5A-474B-A40F-CFD3520369E6}">
   <ds:schemaRefs>
     <ds:schemaRef ds:uri="http://schemas.microsoft.com/sharepoint/v3/contenttype/forms"/>
@@ -18568,7 +18526,7 @@
 </ds:datastoreItem>
 </file>
 
-<file path=customXml/itemProps3.xml><?xml version="1.0" encoding="utf-8"?>
+<file path=customXml/itemProps4.xml><?xml version="1.0" encoding="utf-8"?>
 <ds:datastoreItem xmlns:ds="http://schemas.openxmlformats.org/officeDocument/2006/customXml" ds:itemID="{282AF7F2-DF68-46D6-8930-79C19E84952F}">
   <ds:schemaRefs>
     <ds:schemaRef ds:uri="http://schemas.microsoft.com/office/2006/metadata/contentType"/>
@@ -18586,15 +18544,4 @@
     <ds:schemaRef ds:uri="http://schemas.microsoft.com/internal/obd"/>
   </ds:schemaRefs>
 </ds:datastoreItem>
-</file>
-
-<file path=customXml/itemProps4.xml><?xml version="1.0" encoding="utf-8"?>
-<ds:datastoreItem xmlns:ds="http://schemas.openxmlformats.org/officeDocument/2006/customXml" ds:itemID="{A1A52B7D-C25A-4266-A71F-3882DC9463C4}">
-  <ds:schemaRefs>
-    <ds:schemaRef ds:uri="http://schemas.microsoft.com/office/2006/metadata/properties"/>
-    <ds:schemaRef ds:uri="http://schemas.microsoft.com/office/infopath/2007/PartnerControls"/>
-    <ds:schemaRef ds:uri="e3c6f3b3-f88f-4e57-8294-d53de8f54b2b"/>
-    <ds:schemaRef ds:uri="30c688ba-d7e6-407b-8c35-f2a020af6bce"/>
-  </ds:schemaRefs>
-</ds:datastoreItem>
 </file>
</xml_diff>

<commit_message>
Se actualizan los manuales para la versión 2.4.0_000
</commit_message>
<xml_diff>
--- a/Integra-parent/documentacion/@Firma-Integr@-CambiosYNovedades-MAN.docx
+++ b/Integra-parent/documentacion/@Firma-Integr@-CambiosYNovedades-MAN.docx
@@ -226,10 +226,7 @@
             </w:pPr>
             <w:bookmarkStart w:id="2" w:name="FECHA_MODIFICACION"/>
             <w:r>
-              <w:t>0</w:t>
-            </w:r>
-            <w:r>
-              <w:t>4</w:t>
+              <w:t>12</w:t>
             </w:r>
             <w:r>
               <w:t>-</w:t>
@@ -470,7 +467,7 @@
               <w:fldChar w:fldCharType="separate"/>
             </w:r>
             <w:r>
-              <w:t>04-02-2025</w:t>
+              <w:t>12-02-2025</w:t>
             </w:r>
             <w:r>
               <w:fldChar w:fldCharType="end"/>
@@ -3251,10 +3248,7 @@
               <w:jc w:val="both"/>
             </w:pPr>
             <w:r>
-              <w:t>0</w:t>
-            </w:r>
-            <w:r>
-              <w:t>4</w:t>
+              <w:t>12</w:t>
             </w:r>
             <w:r>
               <w:t>-02-2025</w:t>
@@ -3493,7 +3487,7 @@
               <w:fldChar w:fldCharType="separate"/>
             </w:r>
             <w:r>
-              <w:t>04-02-2025</w:t>
+              <w:t>12-02-2025</w:t>
             </w:r>
             <w:r>
               <w:fldChar w:fldCharType="end"/>
@@ -4000,7 +3994,7 @@
         <w:fldChar w:fldCharType="begin"/>
       </w:r>
       <w:r>
-        <w:instrText xml:space="preserve"> PAGEREF _Toc189561488 \h </w:instrText>
+        <w:instrText xml:space="preserve"> PAGEREF _Toc190365345 \h </w:instrText>
       </w:r>
       <w:r>
         <w:fldChar w:fldCharType="separate"/>
@@ -4049,7 +4043,7 @@
         <w:fldChar w:fldCharType="begin"/>
       </w:r>
       <w:r>
-        <w:instrText xml:space="preserve"> PAGEREF _Toc189561489 \h </w:instrText>
+        <w:instrText xml:space="preserve"> PAGEREF _Toc190365346 \h </w:instrText>
       </w:r>
       <w:r>
         <w:fldChar w:fldCharType="separate"/>
@@ -4098,7 +4092,7 @@
         <w:fldChar w:fldCharType="begin"/>
       </w:r>
       <w:r>
-        <w:instrText xml:space="preserve"> PAGEREF _Toc189561490 \h </w:instrText>
+        <w:instrText xml:space="preserve"> PAGEREF _Toc190365347 \h </w:instrText>
       </w:r>
       <w:r>
         <w:fldChar w:fldCharType="separate"/>
@@ -4147,7 +4141,7 @@
         <w:fldChar w:fldCharType="begin"/>
       </w:r>
       <w:r>
-        <w:instrText xml:space="preserve"> PAGEREF _Toc189561491 \h </w:instrText>
+        <w:instrText xml:space="preserve"> PAGEREF _Toc190365348 \h </w:instrText>
       </w:r>
       <w:r>
         <w:fldChar w:fldCharType="separate"/>
@@ -4196,7 +4190,7 @@
         <w:fldChar w:fldCharType="begin"/>
       </w:r>
       <w:r>
-        <w:instrText xml:space="preserve"> PAGEREF _Toc189561492 \h </w:instrText>
+        <w:instrText xml:space="preserve"> PAGEREF _Toc190365349 \h </w:instrText>
       </w:r>
       <w:r>
         <w:fldChar w:fldCharType="separate"/>
@@ -4245,7 +4239,7 @@
         <w:fldChar w:fldCharType="begin"/>
       </w:r>
       <w:r>
-        <w:instrText xml:space="preserve"> PAGEREF _Toc189561493 \h </w:instrText>
+        <w:instrText xml:space="preserve"> PAGEREF _Toc190365350 \h </w:instrText>
       </w:r>
       <w:r>
         <w:fldChar w:fldCharType="separate"/>
@@ -4294,7 +4288,7 @@
         <w:fldChar w:fldCharType="begin"/>
       </w:r>
       <w:r>
-        <w:instrText xml:space="preserve"> PAGEREF _Toc189561494 \h </w:instrText>
+        <w:instrText xml:space="preserve"> PAGEREF _Toc190365351 \h </w:instrText>
       </w:r>
       <w:r>
         <w:fldChar w:fldCharType="separate"/>
@@ -4344,7 +4338,7 @@
         <w:fldChar w:fldCharType="begin"/>
       </w:r>
       <w:r>
-        <w:instrText xml:space="preserve"> PAGEREF _Toc189561495 \h </w:instrText>
+        <w:instrText xml:space="preserve"> PAGEREF _Toc190365352 \h </w:instrText>
       </w:r>
       <w:r>
         <w:fldChar w:fldCharType="separate"/>
@@ -4388,7 +4382,7 @@
         <w:fldChar w:fldCharType="begin"/>
       </w:r>
       <w:r>
-        <w:instrText xml:space="preserve"> PAGEREF _Toc189561496 \h </w:instrText>
+        <w:instrText xml:space="preserve"> PAGEREF _Toc190365353 \h </w:instrText>
       </w:r>
       <w:r>
         <w:fldChar w:fldCharType="separate"/>
@@ -4438,7 +4432,7 @@
         <w:fldChar w:fldCharType="begin"/>
       </w:r>
       <w:r>
-        <w:instrText xml:space="preserve"> PAGEREF _Toc189561497 \h </w:instrText>
+        <w:instrText xml:space="preserve"> PAGEREF _Toc190365354 \h </w:instrText>
       </w:r>
       <w:r>
         <w:fldChar w:fldCharType="separate"/>
@@ -4482,7 +4476,7 @@
         <w:fldChar w:fldCharType="begin"/>
       </w:r>
       <w:r>
-        <w:instrText xml:space="preserve"> PAGEREF _Toc189561498 \h </w:instrText>
+        <w:instrText xml:space="preserve"> PAGEREF _Toc190365355 \h </w:instrText>
       </w:r>
       <w:r>
         <w:fldChar w:fldCharType="separate"/>
@@ -4529,7 +4523,7 @@
         <w:fldChar w:fldCharType="begin"/>
       </w:r>
       <w:r>
-        <w:instrText xml:space="preserve"> PAGEREF _Toc189561499 \h </w:instrText>
+        <w:instrText xml:space="preserve"> PAGEREF _Toc190365356 \h </w:instrText>
       </w:r>
       <w:r>
         <w:fldChar w:fldCharType="separate"/>
@@ -4573,7 +4567,7 @@
         <w:fldChar w:fldCharType="begin"/>
       </w:r>
       <w:r>
-        <w:instrText xml:space="preserve"> PAGEREF _Toc189561500 \h </w:instrText>
+        <w:instrText xml:space="preserve"> PAGEREF _Toc190365357 \h </w:instrText>
       </w:r>
       <w:r>
         <w:fldChar w:fldCharType="separate"/>
@@ -4617,7 +4611,7 @@
         <w:fldChar w:fldCharType="begin"/>
       </w:r>
       <w:r>
-        <w:instrText xml:space="preserve"> PAGEREF _Toc189561501 \h </w:instrText>
+        <w:instrText xml:space="preserve"> PAGEREF _Toc190365358 \h </w:instrText>
       </w:r>
       <w:r>
         <w:fldChar w:fldCharType="separate"/>
@@ -4664,7 +4658,7 @@
         <w:fldChar w:fldCharType="begin"/>
       </w:r>
       <w:r>
-        <w:instrText xml:space="preserve"> PAGEREF _Toc189561502 \h </w:instrText>
+        <w:instrText xml:space="preserve"> PAGEREF _Toc190365359 \h </w:instrText>
       </w:r>
       <w:r>
         <w:fldChar w:fldCharType="separate"/>
@@ -4708,7 +4702,7 @@
         <w:fldChar w:fldCharType="begin"/>
       </w:r>
       <w:r>
-        <w:instrText xml:space="preserve"> PAGEREF _Toc189561503 \h </w:instrText>
+        <w:instrText xml:space="preserve"> PAGEREF _Toc190365360 \h </w:instrText>
       </w:r>
       <w:r>
         <w:fldChar w:fldCharType="separate"/>
@@ -4752,7 +4746,7 @@
         <w:fldChar w:fldCharType="begin"/>
       </w:r>
       <w:r>
-        <w:instrText xml:space="preserve"> PAGEREF _Toc189561504 \h </w:instrText>
+        <w:instrText xml:space="preserve"> PAGEREF _Toc190365361 \h </w:instrText>
       </w:r>
       <w:r>
         <w:fldChar w:fldCharType="separate"/>
@@ -4799,7 +4793,7 @@
         <w:fldChar w:fldCharType="begin"/>
       </w:r>
       <w:r>
-        <w:instrText xml:space="preserve"> PAGEREF _Toc189561505 \h </w:instrText>
+        <w:instrText xml:space="preserve"> PAGEREF _Toc190365362 \h </w:instrText>
       </w:r>
       <w:r>
         <w:fldChar w:fldCharType="separate"/>
@@ -4843,7 +4837,7 @@
         <w:fldChar w:fldCharType="begin"/>
       </w:r>
       <w:r>
-        <w:instrText xml:space="preserve"> PAGEREF _Toc189561506 \h </w:instrText>
+        <w:instrText xml:space="preserve"> PAGEREF _Toc190365363 \h </w:instrText>
       </w:r>
       <w:r>
         <w:fldChar w:fldCharType="separate"/>
@@ -4887,7 +4881,7 @@
         <w:fldChar w:fldCharType="begin"/>
       </w:r>
       <w:r>
-        <w:instrText xml:space="preserve"> PAGEREF _Toc189561507 \h </w:instrText>
+        <w:instrText xml:space="preserve"> PAGEREF _Toc190365364 \h </w:instrText>
       </w:r>
       <w:r>
         <w:fldChar w:fldCharType="separate"/>
@@ -4934,7 +4928,7 @@
         <w:fldChar w:fldCharType="begin"/>
       </w:r>
       <w:r>
-        <w:instrText xml:space="preserve"> PAGEREF _Toc189561508 \h </w:instrText>
+        <w:instrText xml:space="preserve"> PAGEREF _Toc190365365 \h </w:instrText>
       </w:r>
       <w:r>
         <w:fldChar w:fldCharType="separate"/>
@@ -4978,7 +4972,7 @@
         <w:fldChar w:fldCharType="begin"/>
       </w:r>
       <w:r>
-        <w:instrText xml:space="preserve"> PAGEREF _Toc189561509 \h </w:instrText>
+        <w:instrText xml:space="preserve"> PAGEREF _Toc190365366 \h </w:instrText>
       </w:r>
       <w:r>
         <w:fldChar w:fldCharType="separate"/>
@@ -5022,7 +5016,7 @@
         <w:fldChar w:fldCharType="begin"/>
       </w:r>
       <w:r>
-        <w:instrText xml:space="preserve"> PAGEREF _Toc189561510 \h </w:instrText>
+        <w:instrText xml:space="preserve"> PAGEREF _Toc190365367 \h </w:instrText>
       </w:r>
       <w:r>
         <w:fldChar w:fldCharType="separate"/>
@@ -5069,7 +5063,7 @@
         <w:fldChar w:fldCharType="begin"/>
       </w:r>
       <w:r>
-        <w:instrText xml:space="preserve"> PAGEREF _Toc189561511 \h </w:instrText>
+        <w:instrText xml:space="preserve"> PAGEREF _Toc190365368 \h </w:instrText>
       </w:r>
       <w:r>
         <w:fldChar w:fldCharType="separate"/>
@@ -5113,7 +5107,7 @@
         <w:fldChar w:fldCharType="begin"/>
       </w:r>
       <w:r>
-        <w:instrText xml:space="preserve"> PAGEREF _Toc189561512 \h </w:instrText>
+        <w:instrText xml:space="preserve"> PAGEREF _Toc190365369 \h </w:instrText>
       </w:r>
       <w:r>
         <w:fldChar w:fldCharType="separate"/>
@@ -5157,7 +5151,7 @@
         <w:fldChar w:fldCharType="begin"/>
       </w:r>
       <w:r>
-        <w:instrText xml:space="preserve"> PAGEREF _Toc189561513 \h </w:instrText>
+        <w:instrText xml:space="preserve"> PAGEREF _Toc190365370 \h </w:instrText>
       </w:r>
       <w:r>
         <w:fldChar w:fldCharType="separate"/>
@@ -5204,7 +5198,7 @@
         <w:fldChar w:fldCharType="begin"/>
       </w:r>
       <w:r>
-        <w:instrText xml:space="preserve"> PAGEREF _Toc189561514 \h </w:instrText>
+        <w:instrText xml:space="preserve"> PAGEREF _Toc190365371 \h </w:instrText>
       </w:r>
       <w:r>
         <w:fldChar w:fldCharType="separate"/>
@@ -5248,7 +5242,7 @@
         <w:fldChar w:fldCharType="begin"/>
       </w:r>
       <w:r>
-        <w:instrText xml:space="preserve"> PAGEREF _Toc189561515 \h </w:instrText>
+        <w:instrText xml:space="preserve"> PAGEREF _Toc190365372 \h </w:instrText>
       </w:r>
       <w:r>
         <w:fldChar w:fldCharType="separate"/>
@@ -5292,7 +5286,7 @@
         <w:fldChar w:fldCharType="begin"/>
       </w:r>
       <w:r>
-        <w:instrText xml:space="preserve"> PAGEREF _Toc189561516 \h </w:instrText>
+        <w:instrText xml:space="preserve"> PAGEREF _Toc190365373 \h </w:instrText>
       </w:r>
       <w:r>
         <w:fldChar w:fldCharType="separate"/>
@@ -5339,7 +5333,7 @@
         <w:fldChar w:fldCharType="begin"/>
       </w:r>
       <w:r>
-        <w:instrText xml:space="preserve"> PAGEREF _Toc189561517 \h </w:instrText>
+        <w:instrText xml:space="preserve"> PAGEREF _Toc190365374 \h </w:instrText>
       </w:r>
       <w:r>
         <w:fldChar w:fldCharType="separate"/>
@@ -5383,7 +5377,7 @@
         <w:fldChar w:fldCharType="begin"/>
       </w:r>
       <w:r>
-        <w:instrText xml:space="preserve"> PAGEREF _Toc189561518 \h </w:instrText>
+        <w:instrText xml:space="preserve"> PAGEREF _Toc190365375 \h </w:instrText>
       </w:r>
       <w:r>
         <w:fldChar w:fldCharType="separate"/>
@@ -5427,7 +5421,7 @@
         <w:fldChar w:fldCharType="begin"/>
       </w:r>
       <w:r>
-        <w:instrText xml:space="preserve"> PAGEREF _Toc189561519 \h </w:instrText>
+        <w:instrText xml:space="preserve"> PAGEREF _Toc190365376 \h </w:instrText>
       </w:r>
       <w:r>
         <w:fldChar w:fldCharType="separate"/>
@@ -5474,7 +5468,7 @@
         <w:fldChar w:fldCharType="begin"/>
       </w:r>
       <w:r>
-        <w:instrText xml:space="preserve"> PAGEREF _Toc189561520 \h </w:instrText>
+        <w:instrText xml:space="preserve"> PAGEREF _Toc190365377 \h </w:instrText>
       </w:r>
       <w:r>
         <w:fldChar w:fldCharType="separate"/>
@@ -5518,7 +5512,7 @@
         <w:fldChar w:fldCharType="begin"/>
       </w:r>
       <w:r>
-        <w:instrText xml:space="preserve"> PAGEREF _Toc189561521 \h </w:instrText>
+        <w:instrText xml:space="preserve"> PAGEREF _Toc190365378 \h </w:instrText>
       </w:r>
       <w:r>
         <w:fldChar w:fldCharType="separate"/>
@@ -5562,7 +5556,7 @@
         <w:fldChar w:fldCharType="begin"/>
       </w:r>
       <w:r>
-        <w:instrText xml:space="preserve"> PAGEREF _Toc189561522 \h </w:instrText>
+        <w:instrText xml:space="preserve"> PAGEREF _Toc190365379 \h </w:instrText>
       </w:r>
       <w:r>
         <w:fldChar w:fldCharType="separate"/>
@@ -5620,7 +5614,7 @@
         <w:br w:type="page"/>
       </w:r>
       <w:bookmarkStart w:id="17" w:name="_Toc116024915"/>
-      <w:bookmarkStart w:id="18" w:name="_Toc189561488"/>
+      <w:bookmarkStart w:id="18" w:name="_Toc190365345"/>
       <w:r>
         <w:lastRenderedPageBreak/>
         <w:t>Objeto</w:t>
@@ -5644,7 +5638,7 @@
         <w:br w:type="page"/>
       </w:r>
       <w:bookmarkStart w:id="19" w:name="_Toc116024916"/>
-      <w:bookmarkStart w:id="20" w:name="_Toc189561489"/>
+      <w:bookmarkStart w:id="20" w:name="_Toc190365346"/>
       <w:r>
         <w:lastRenderedPageBreak/>
         <w:t>Alcance</w:t>
@@ -5741,7 +5735,7 @@
         <w:pStyle w:val="Ttulo1"/>
       </w:pPr>
       <w:bookmarkStart w:id="25" w:name="_Toc116024917"/>
-      <w:bookmarkStart w:id="26" w:name="_Toc189561490"/>
+      <w:bookmarkStart w:id="26" w:name="_Toc190365347"/>
       <w:r>
         <w:lastRenderedPageBreak/>
         <w:t>Siglas</w:t>
@@ -7547,7 +7541,7 @@
         <w:pStyle w:val="Ttulo1"/>
       </w:pPr>
       <w:bookmarkStart w:id="30" w:name="_Toc116024918"/>
-      <w:bookmarkStart w:id="31" w:name="_Toc189561491"/>
+      <w:bookmarkStart w:id="31" w:name="_Toc190365348"/>
       <w:r>
         <w:lastRenderedPageBreak/>
         <w:t>Glosario de T</w:t>
@@ -7697,7 +7691,7 @@
       </w:pPr>
       <w:bookmarkStart w:id="35" w:name="_Referencias"/>
       <w:bookmarkStart w:id="36" w:name="_Toc116024919"/>
-      <w:bookmarkStart w:id="37" w:name="_Toc189561492"/>
+      <w:bookmarkStart w:id="37" w:name="_Toc190365349"/>
       <w:bookmarkEnd w:id="32"/>
       <w:bookmarkEnd w:id="33"/>
       <w:bookmarkEnd w:id="34"/>
@@ -7749,7 +7743,7 @@
         <w:pStyle w:val="Ttulo1"/>
       </w:pPr>
       <w:bookmarkStart w:id="41" w:name="_Toc116024920"/>
-      <w:bookmarkStart w:id="42" w:name="_Toc189561493"/>
+      <w:bookmarkStart w:id="42" w:name="_Toc190365350"/>
       <w:bookmarkEnd w:id="38"/>
       <w:bookmarkEnd w:id="39"/>
       <w:bookmarkEnd w:id="40"/>
@@ -7789,19 +7783,19 @@
         <w:t>.</w:t>
       </w:r>
       <w:r>
-        <w:t>2</w:t>
+        <w:t>4</w:t>
       </w:r>
       <w:r>
         <w:t>.</w:t>
       </w:r>
       <w:r>
-        <w:t>4</w:t>
+        <w:t>0</w:t>
       </w:r>
       <w:r>
         <w:t>_00</w:t>
       </w:r>
       <w:r>
-        <w:t>1</w:t>
+        <w:t>0</w:t>
       </w:r>
       <w:r>
         <w:t>.</w:t>
@@ -7813,7 +7807,7 @@
       </w:pPr>
       <w:bookmarkStart w:id="43" w:name="_Requisitos_Software"/>
       <w:bookmarkStart w:id="44" w:name="_Toc116024921"/>
-      <w:bookmarkStart w:id="45" w:name="_Toc189561494"/>
+      <w:bookmarkStart w:id="45" w:name="_Toc190365351"/>
       <w:bookmarkEnd w:id="43"/>
       <w:r>
         <w:lastRenderedPageBreak/>
@@ -7829,7 +7823,7 @@
           <w:lang w:val="es-ES"/>
         </w:rPr>
       </w:pPr>
-      <w:bookmarkStart w:id="46" w:name="_Toc189561495"/>
+      <w:bookmarkStart w:id="46" w:name="_Toc190365352"/>
       <w:proofErr w:type="spellStart"/>
       <w:r>
         <w:rPr>
@@ -7880,7 +7874,7 @@
       <w:pPr>
         <w:pStyle w:val="Ttulo3"/>
       </w:pPr>
-      <w:bookmarkStart w:id="47" w:name="_Toc189561496"/>
+      <w:bookmarkStart w:id="47" w:name="_Toc190365353"/>
       <w:r>
         <w:t>Características</w:t>
       </w:r>
@@ -7932,7 +7926,7 @@
         </w:rPr>
       </w:pPr>
       <w:bookmarkStart w:id="48" w:name="_Toc116024922"/>
-      <w:bookmarkStart w:id="49" w:name="_Toc189561497"/>
+      <w:bookmarkStart w:id="49" w:name="_Toc190365354"/>
       <w:proofErr w:type="spellStart"/>
       <w:r>
         <w:rPr>
@@ -7983,7 +7977,7 @@
       <w:pPr>
         <w:pStyle w:val="Ttulo3"/>
       </w:pPr>
-      <w:bookmarkStart w:id="50" w:name="_Toc189561498"/>
+      <w:bookmarkStart w:id="50" w:name="_Toc190365355"/>
       <w:r>
         <w:t>Características</w:t>
       </w:r>
@@ -8057,7 +8051,7 @@
           <w:lang w:val="es-ES"/>
         </w:rPr>
       </w:pPr>
-      <w:bookmarkStart w:id="51" w:name="_Toc189561499"/>
+      <w:bookmarkStart w:id="51" w:name="_Toc190365356"/>
       <w:proofErr w:type="spellStart"/>
       <w:r>
         <w:rPr>
@@ -8096,7 +8090,7 @@
       <w:pPr>
         <w:pStyle w:val="Ttulo3"/>
       </w:pPr>
-      <w:bookmarkStart w:id="52" w:name="_Toc189561500"/>
+      <w:bookmarkStart w:id="52" w:name="_Toc190365357"/>
       <w:r>
         <w:t>Características</w:t>
       </w:r>
@@ -8141,7 +8135,7 @@
       <w:pPr>
         <w:pStyle w:val="Ttulo3"/>
       </w:pPr>
-      <w:bookmarkStart w:id="53" w:name="_Toc189561501"/>
+      <w:bookmarkStart w:id="53" w:name="_Toc190365358"/>
       <w:r>
         <w:t>Errores Resueltos</w:t>
       </w:r>
@@ -8172,7 +8166,7 @@
           <w:lang w:val="es-ES"/>
         </w:rPr>
       </w:pPr>
-      <w:bookmarkStart w:id="54" w:name="_Toc189561502"/>
+      <w:bookmarkStart w:id="54" w:name="_Toc190365359"/>
       <w:r>
         <w:rPr>
           <w:lang w:val="es-ES"/>
@@ -8203,7 +8197,7 @@
       <w:pPr>
         <w:pStyle w:val="Ttulo3"/>
       </w:pPr>
-      <w:bookmarkStart w:id="55" w:name="_Toc189561503"/>
+      <w:bookmarkStart w:id="55" w:name="_Toc190365360"/>
       <w:r>
         <w:t>Características</w:t>
       </w:r>
@@ -8235,7 +8229,7 @@
       <w:pPr>
         <w:pStyle w:val="Ttulo3"/>
       </w:pPr>
-      <w:bookmarkStart w:id="56" w:name="_Toc189561504"/>
+      <w:bookmarkStart w:id="56" w:name="_Toc190365361"/>
       <w:r>
         <w:t>Errores Resueltos</w:t>
       </w:r>
@@ -8276,7 +8270,7 @@
           <w:lang w:val="es-ES"/>
         </w:rPr>
       </w:pPr>
-      <w:bookmarkStart w:id="57" w:name="_Toc189561505"/>
+      <w:bookmarkStart w:id="57" w:name="_Toc190365362"/>
       <w:r>
         <w:rPr>
           <w:lang w:val="es-ES"/>
@@ -8298,7 +8292,7 @@
         <w:pStyle w:val="Ttulo3"/>
       </w:pPr>
       <w:bookmarkStart w:id="58" w:name="_Toc116024923"/>
-      <w:bookmarkStart w:id="59" w:name="_Toc189561506"/>
+      <w:bookmarkStart w:id="59" w:name="_Toc190365363"/>
       <w:r>
         <w:t>Características</w:t>
       </w:r>
@@ -8321,7 +8315,7 @@
         <w:pStyle w:val="Ttulo3"/>
       </w:pPr>
       <w:bookmarkStart w:id="60" w:name="_Toc116024924"/>
-      <w:bookmarkStart w:id="61" w:name="_Toc189561507"/>
+      <w:bookmarkStart w:id="61" w:name="_Toc190365364"/>
       <w:r>
         <w:t>Errores Resueltos</w:t>
       </w:r>
@@ -8358,7 +8352,7 @@
         </w:rPr>
       </w:pPr>
       <w:bookmarkStart w:id="62" w:name="_Toc116024925"/>
-      <w:bookmarkStart w:id="63" w:name="_Toc189561508"/>
+      <w:bookmarkStart w:id="63" w:name="_Toc190365365"/>
       <w:r>
         <w:rPr>
           <w:lang w:val="es-ES"/>
@@ -8391,7 +8385,7 @@
         <w:pStyle w:val="Ttulo3"/>
       </w:pPr>
       <w:bookmarkStart w:id="64" w:name="_Toc116024926"/>
-      <w:bookmarkStart w:id="65" w:name="_Toc189561509"/>
+      <w:bookmarkStart w:id="65" w:name="_Toc190365366"/>
       <w:r>
         <w:t>Características</w:t>
       </w:r>
@@ -8439,7 +8433,7 @@
         <w:pStyle w:val="Ttulo3"/>
       </w:pPr>
       <w:bookmarkStart w:id="66" w:name="_Toc116024927"/>
-      <w:bookmarkStart w:id="67" w:name="_Toc189561510"/>
+      <w:bookmarkStart w:id="67" w:name="_Toc190365367"/>
       <w:r>
         <w:t>Errores Resueltos</w:t>
       </w:r>
@@ -8465,7 +8459,7 @@
         </w:rPr>
       </w:pPr>
       <w:bookmarkStart w:id="68" w:name="_Toc116024928"/>
-      <w:bookmarkStart w:id="69" w:name="_Toc189561511"/>
+      <w:bookmarkStart w:id="69" w:name="_Toc190365368"/>
       <w:r>
         <w:rPr>
           <w:lang w:val="es-ES"/>
@@ -8480,7 +8474,7 @@
         <w:pStyle w:val="Ttulo3"/>
       </w:pPr>
       <w:bookmarkStart w:id="70" w:name="_Toc116024929"/>
-      <w:bookmarkStart w:id="71" w:name="_Toc189561512"/>
+      <w:bookmarkStart w:id="71" w:name="_Toc190365369"/>
       <w:r>
         <w:t>Características</w:t>
       </w:r>
@@ -8525,7 +8519,7 @@
         <w:pStyle w:val="Ttulo3"/>
       </w:pPr>
       <w:bookmarkStart w:id="72" w:name="_Toc116024930"/>
-      <w:bookmarkStart w:id="73" w:name="_Toc189561513"/>
+      <w:bookmarkStart w:id="73" w:name="_Toc190365370"/>
       <w:r>
         <w:t>Errores Resueltos</w:t>
       </w:r>
@@ -8559,7 +8553,7 @@
         </w:rPr>
       </w:pPr>
       <w:bookmarkStart w:id="74" w:name="_Toc116024931"/>
-      <w:bookmarkStart w:id="75" w:name="_Toc189561514"/>
+      <w:bookmarkStart w:id="75" w:name="_Toc190365371"/>
       <w:r>
         <w:rPr>
           <w:lang w:val="es-ES"/>
@@ -8575,7 +8569,7 @@
         <w:pStyle w:val="Ttulo3"/>
       </w:pPr>
       <w:bookmarkStart w:id="76" w:name="_Toc116024932"/>
-      <w:bookmarkStart w:id="77" w:name="_Toc189561515"/>
+      <w:bookmarkStart w:id="77" w:name="_Toc190365372"/>
       <w:r>
         <w:t>Características</w:t>
       </w:r>
@@ -8620,7 +8614,7 @@
         <w:pStyle w:val="Ttulo3"/>
       </w:pPr>
       <w:bookmarkStart w:id="78" w:name="_Toc116024933"/>
-      <w:bookmarkStart w:id="79" w:name="_Toc189561516"/>
+      <w:bookmarkStart w:id="79" w:name="_Toc190365373"/>
       <w:r>
         <w:t>Errores Resueltos</w:t>
       </w:r>
@@ -8649,7 +8643,7 @@
         </w:rPr>
       </w:pPr>
       <w:bookmarkStart w:id="80" w:name="_Toc116024934"/>
-      <w:bookmarkStart w:id="81" w:name="_Toc189561517"/>
+      <w:bookmarkStart w:id="81" w:name="_Toc190365374"/>
       <w:r>
         <w:rPr>
           <w:lang w:val="es-ES"/>
@@ -8664,7 +8658,7 @@
         <w:pStyle w:val="Ttulo3"/>
       </w:pPr>
       <w:bookmarkStart w:id="82" w:name="_Toc116024935"/>
-      <w:bookmarkStart w:id="83" w:name="_Toc189561518"/>
+      <w:bookmarkStart w:id="83" w:name="_Toc190365375"/>
       <w:r>
         <w:t>Características</w:t>
       </w:r>
@@ -8773,7 +8767,7 @@
         <w:pStyle w:val="Ttulo3"/>
       </w:pPr>
       <w:bookmarkStart w:id="84" w:name="_Toc116024936"/>
-      <w:bookmarkStart w:id="85" w:name="_Toc189561519"/>
+      <w:bookmarkStart w:id="85" w:name="_Toc190365376"/>
       <w:r>
         <w:t>Errores Resueltos</w:t>
       </w:r>
@@ -8879,7 +8873,7 @@
         </w:rPr>
       </w:pPr>
       <w:bookmarkStart w:id="86" w:name="_Toc116024937"/>
-      <w:bookmarkStart w:id="87" w:name="_Toc189561520"/>
+      <w:bookmarkStart w:id="87" w:name="_Toc190365377"/>
       <w:r>
         <w:rPr>
           <w:lang w:val="es-ES"/>
@@ -8894,7 +8888,7 @@
         <w:pStyle w:val="Ttulo3"/>
       </w:pPr>
       <w:bookmarkStart w:id="88" w:name="_Toc116024938"/>
-      <w:bookmarkStart w:id="89" w:name="_Toc189561521"/>
+      <w:bookmarkStart w:id="89" w:name="_Toc190365378"/>
       <w:r>
         <w:t>Características</w:t>
       </w:r>
@@ -10081,7 +10075,7 @@
         <w:pStyle w:val="Ttulo3"/>
       </w:pPr>
       <w:bookmarkStart w:id="90" w:name="_Toc116024939"/>
-      <w:bookmarkStart w:id="91" w:name="_Toc189561522"/>
+      <w:bookmarkStart w:id="91" w:name="_Toc190365379"/>
       <w:r>
         <w:t>Errores Resueltos</w:t>
       </w:r>
@@ -18460,6 +18454,32 @@
 </file>
 
 <file path=customXml/item1.xml><?xml version="1.0" encoding="utf-8"?>
+<?mso-contentType ?>
+<FormTemplates xmlns="http://schemas.microsoft.com/sharepoint/v3/contenttype/forms">
+  <Display>DocumentLibraryForm</Display>
+  <Edit>DocumentLibraryForm</Edit>
+  <New>DocumentLibraryForm</New>
+</FormTemplates>
+</file>
+
+<file path=customXml/item2.xml><?xml version="1.0" encoding="utf-8"?>
+<b:Sources xmlns:b="http://schemas.openxmlformats.org/officeDocument/2006/bibliography" xmlns="http://schemas.openxmlformats.org/officeDocument/2006/bibliography" SelectedStyle="\APA.XSL" StyleName="APA"/>
+</file>
+
+<file path=customXml/item3.xml><?xml version="1.0" encoding="utf-8"?>
+<p:properties xmlns:p="http://schemas.microsoft.com/office/2006/metadata/properties" xmlns:xsi="http://www.w3.org/2001/XMLSchema-instance" xmlns:pc="http://schemas.microsoft.com/office/infopath/2007/PartnerControls">
+  <documentManagement>
+    <Location xmlns="e3c6f3b3-f88f-4e57-8294-d53de8f54b2b" xsi:nil="true"/>
+    <TaxCatchAll xmlns="30c688ba-d7e6-407b-8c35-f2a020af6bce" xsi:nil="true"/>
+    <Comentarios xmlns="e3c6f3b3-f88f-4e57-8294-d53de8f54b2b" xsi:nil="true"/>
+    <lcf76f155ced4ddcb4097134ff3c332f xmlns="e3c6f3b3-f88f-4e57-8294-d53de8f54b2b">
+      <Terms xmlns="http://schemas.microsoft.com/office/infopath/2007/PartnerControls"/>
+    </lcf76f155ced4ddcb4097134ff3c332f>
+  </documentManagement>
+</p:properties>
+</file>
+
+<file path=customXml/item4.xml><?xml version="1.0" encoding="utf-8"?>
 <ct:contentTypeSchema xmlns:ct="http://schemas.microsoft.com/office/2006/metadata/contentType" xmlns:ma="http://schemas.microsoft.com/office/2006/metadata/properties/metaAttributes" ct:_="" ma:_="" ma:contentTypeName="Document" ma:contentTypeID="0x010100F37872BBB1B48948A69B496DD8700896" ma:contentTypeVersion="30" ma:contentTypeDescription="Create a new document." ma:contentTypeScope="" ma:versionID="db6ec5eae62717a2112663bfc8d11fc5">
   <xsd:schema xmlns:xsd="http://www.w3.org/2001/XMLSchema" xmlns:xs="http://www.w3.org/2001/XMLSchema" xmlns:p="http://schemas.microsoft.com/office/2006/metadata/properties" xmlns:ns2="e3c6f3b3-f88f-4e57-8294-d53de8f54b2b" xmlns:ns3="0e9fbc54-175b-41a1-a915-0ab6c7e45301" xmlns:ns4="30c688ba-d7e6-407b-8c35-f2a020af6bce" targetNamespace="http://schemas.microsoft.com/office/2006/metadata/properties" ma:root="true" ma:fieldsID="b607cbe47cf360e8877db2581acfff36" ns2:_="" ns3:_="" ns4:_="">
     <xsd:import namespace="e3c6f3b3-f88f-4e57-8294-d53de8f54b2b"/>
@@ -18769,33 +18789,34 @@
 </ct:contentTypeSchema>
 </file>
 
-<file path=customXml/item2.xml><?xml version="1.0" encoding="utf-8"?>
-<?mso-contentType ?>
-<FormTemplates xmlns="http://schemas.microsoft.com/sharepoint/v3/contenttype/forms">
-  <Display>DocumentLibraryForm</Display>
-  <Edit>DocumentLibraryForm</Edit>
-  <New>DocumentLibraryForm</New>
-</FormTemplates>
+<file path=customXml/itemProps1.xml><?xml version="1.0" encoding="utf-8"?>
+<ds:datastoreItem xmlns:ds="http://schemas.openxmlformats.org/officeDocument/2006/customXml" ds:itemID="{0451645F-3C5A-474B-A40F-CFD3520369E6}">
+  <ds:schemaRefs>
+    <ds:schemaRef ds:uri="http://schemas.microsoft.com/sharepoint/v3/contenttype/forms"/>
+  </ds:schemaRefs>
+</ds:datastoreItem>
 </file>
 
-<file path=customXml/item3.xml><?xml version="1.0" encoding="utf-8"?>
-<b:Sources xmlns:b="http://schemas.openxmlformats.org/officeDocument/2006/bibliography" xmlns="http://schemas.openxmlformats.org/officeDocument/2006/bibliography" SelectedStyle="\APA.XSL" StyleName="APA"/>
+<file path=customXml/itemProps2.xml><?xml version="1.0" encoding="utf-8"?>
+<ds:datastoreItem xmlns:ds="http://schemas.openxmlformats.org/officeDocument/2006/customXml" ds:itemID="{4110D91B-91E1-4550-9E50-01A84BFD4971}">
+  <ds:schemaRefs>
+    <ds:schemaRef ds:uri="http://schemas.openxmlformats.org/officeDocument/2006/bibliography"/>
+  </ds:schemaRefs>
+</ds:datastoreItem>
 </file>
 
-<file path=customXml/item4.xml><?xml version="1.0" encoding="utf-8"?>
-<p:properties xmlns:p="http://schemas.microsoft.com/office/2006/metadata/properties" xmlns:xsi="http://www.w3.org/2001/XMLSchema-instance" xmlns:pc="http://schemas.microsoft.com/office/infopath/2007/PartnerControls">
-  <documentManagement>
-    <Location xmlns="e3c6f3b3-f88f-4e57-8294-d53de8f54b2b" xsi:nil="true"/>
-    <TaxCatchAll xmlns="30c688ba-d7e6-407b-8c35-f2a020af6bce" xsi:nil="true"/>
-    <Comentarios xmlns="e3c6f3b3-f88f-4e57-8294-d53de8f54b2b" xsi:nil="true"/>
-    <lcf76f155ced4ddcb4097134ff3c332f xmlns="e3c6f3b3-f88f-4e57-8294-d53de8f54b2b">
-      <Terms xmlns="http://schemas.microsoft.com/office/infopath/2007/PartnerControls"/>
-    </lcf76f155ced4ddcb4097134ff3c332f>
-  </documentManagement>
-</p:properties>
+<file path=customXml/itemProps3.xml><?xml version="1.0" encoding="utf-8"?>
+<ds:datastoreItem xmlns:ds="http://schemas.openxmlformats.org/officeDocument/2006/customXml" ds:itemID="{A1A52B7D-C25A-4266-A71F-3882DC9463C4}">
+  <ds:schemaRefs>
+    <ds:schemaRef ds:uri="http://schemas.microsoft.com/office/2006/metadata/properties"/>
+    <ds:schemaRef ds:uri="http://schemas.microsoft.com/office/infopath/2007/PartnerControls"/>
+    <ds:schemaRef ds:uri="e3c6f3b3-f88f-4e57-8294-d53de8f54b2b"/>
+    <ds:schemaRef ds:uri="30c688ba-d7e6-407b-8c35-f2a020af6bce"/>
+  </ds:schemaRefs>
+</ds:datastoreItem>
 </file>
 
-<file path=customXml/itemProps1.xml><?xml version="1.0" encoding="utf-8"?>
+<file path=customXml/itemProps4.xml><?xml version="1.0" encoding="utf-8"?>
 <ds:datastoreItem xmlns:ds="http://schemas.openxmlformats.org/officeDocument/2006/customXml" ds:itemID="{282AF7F2-DF68-46D6-8930-79C19E84952F}">
   <ds:schemaRefs>
     <ds:schemaRef ds:uri="http://schemas.microsoft.com/office/2006/metadata/contentType"/>
@@ -18813,31 +18834,4 @@
     <ds:schemaRef ds:uri="http://schemas.microsoft.com/internal/obd"/>
   </ds:schemaRefs>
 </ds:datastoreItem>
-</file>
-
-<file path=customXml/itemProps2.xml><?xml version="1.0" encoding="utf-8"?>
-<ds:datastoreItem xmlns:ds="http://schemas.openxmlformats.org/officeDocument/2006/customXml" ds:itemID="{0451645F-3C5A-474B-A40F-CFD3520369E6}">
-  <ds:schemaRefs>
-    <ds:schemaRef ds:uri="http://schemas.microsoft.com/sharepoint/v3/contenttype/forms"/>
-  </ds:schemaRefs>
-</ds:datastoreItem>
-</file>
-
-<file path=customXml/itemProps3.xml><?xml version="1.0" encoding="utf-8"?>
-<ds:datastoreItem xmlns:ds="http://schemas.openxmlformats.org/officeDocument/2006/customXml" ds:itemID="{4110D91B-91E1-4550-9E50-01A84BFD4971}">
-  <ds:schemaRefs>
-    <ds:schemaRef ds:uri="http://schemas.openxmlformats.org/officeDocument/2006/bibliography"/>
-  </ds:schemaRefs>
-</ds:datastoreItem>
-</file>
-
-<file path=customXml/itemProps4.xml><?xml version="1.0" encoding="utf-8"?>
-<ds:datastoreItem xmlns:ds="http://schemas.openxmlformats.org/officeDocument/2006/customXml" ds:itemID="{A1A52B7D-C25A-4266-A71F-3882DC9463C4}">
-  <ds:schemaRefs>
-    <ds:schemaRef ds:uri="http://schemas.microsoft.com/office/2006/metadata/properties"/>
-    <ds:schemaRef ds:uri="http://schemas.microsoft.com/office/infopath/2007/PartnerControls"/>
-    <ds:schemaRef ds:uri="e3c6f3b3-f88f-4e57-8294-d53de8f54b2b"/>
-    <ds:schemaRef ds:uri="30c688ba-d7e6-407b-8c35-f2a020af6bce"/>
-  </ds:schemaRefs>
-</ds:datastoreItem>
 </file>
</xml_diff>